<commit_message>
Integrate Ashar PID: 17/17 PASS after 5 source-verified corrections; inventory 57 rows; regen workbook/DOCX/patch/package
</commit_message>
<xml_diff>
--- a/24i3102_24i3052_24i3072_C_Report.docx
+++ b/24i3102_24i3052_24i3072_C_Report.docx
@@ -820,7 +820,7 @@
         <w:t>BatteryStructural</w:t>
       </w:r>
       <w:r>
-        <w:t xml:space="preserve"> functional tests (warning ladder, spike fault, RLS gate, SoC fusion, dt clamp, scale fallback, publish paths, remaining-time gates); PID P-D1..P-D3 via 11 </w:t>
+        <w:t xml:space="preserve"> functional tests (warning ladder, spike fault, RLS gate, SoC fusion, dt clamp, scale fallback, publish paths, remaining-time gates); PID P-D1..P-D3 (+ saturation edges) via 17 </w:t>
       </w:r>
       <w:r>
         <w:rPr>
@@ -830,7 +830,7 @@
         <w:t>PIDStructural</w:t>
       </w:r>
       <w:r>
-        <w:t xml:space="preserve"> tests (non-finite-integral guard, derivative-guard MC/DC quad, FLT_EPSILON boundary, negative-dt, windup clamp, limit edges). Full per-test mapping: workbook Sheet 1 (51 rows: HST-01..11, BST-01..29, PST-01..11).</w:t>
+        <w:t xml:space="preserve"> tests (update-integral flag, saturation/clamp pairs, NaN/−Inf guards, derivative-guard MC/DC quad, FLT_EPSILON boundary, negative-dt, windup clamp, limit edges, zero-gain degenerate). Full per-test mapping: workbook Sheet 1 (57 rows: HST-01..11, BST-01..29, PST-01..17).</w:t>
       </w:r>
     </w:p>
     <w:p>
@@ -894,7 +894,7 @@
         <w:t>unit-PIDStructural</w:t>
       </w:r>
       <w:r>
-        <w:t xml:space="preserve"> 11/11, </w:t>
+        <w:t xml:space="preserve"> 17/17, </w:t>
       </w:r>
       <w:r>
         <w:rPr>
@@ -914,7 +914,7 @@
         <w:t>evidence/logs/</w:t>
       </w:r>
       <w:r>
-        <w:t>). No manufactured failures; 3 initial student-test failures investigated → test-side expectation errors (L130 gate timing, NaN output value), corrected without touching production code.</w:t>
+        <w:t>). No manufactured failures; 8 student-test failures investigated in total → all test-side expectation errors (L130 gate timing, NaN output value, D-term sign, saturation freeze assumption), corrected without touching production code.</w:t>
       </w:r>
     </w:p>
     <w:p>
@@ -922,7 +922,7 @@
         <w:pStyle w:val="ListBullet"/>
       </w:pPr>
       <w:r>
-        <w:t xml:space="preserve">PID authorship note: the PID package was briefed to a teammate (TEAM_BRIEF_ASHAR.md); the submitted </w:t>
+        <w:t xml:space="preserve">PID authorship: </w:t>
       </w:r>
       <w:r>
         <w:rPr>
@@ -932,7 +932,27 @@
         <w:t>PIDStructuralTest.cpp</w:t>
       </w:r>
       <w:r>
-        <w:t xml:space="preserve"> is lead-authored fallback kept so the submission is complete. If the teammate delivers his own file it replaces this one with re-measurement; derivation tables already isolate PID rows (PST-*) for clean substitution.</w:t>
+        <w:t xml:space="preserve"> authored by Ashar Ahmed (24i3072) from his own derivation (branch </w:t>
+      </w:r>
+      <w:r>
+        <w:rPr>
+          <w:rFonts w:ascii="Consolas" w:hAnsi="Consolas"/>
+          <w:sz w:val="20"/>
+        </w:rPr>
+        <w:t>ashar-pid-work</w:t>
+      </w:r>
+      <w:r>
+        <w:t xml:space="preserve">, </w:t>
+      </w:r>
+      <w:r>
+        <w:rPr>
+          <w:rFonts w:ascii="Consolas" w:hAnsi="Consolas"/>
+          <w:sz w:val="20"/>
+        </w:rPr>
+        <w:t>ASHAR_HANDOFF.md</w:t>
+      </w:r>
+      <w:r>
+        <w:t>); lead-verified on Linux — 5 expectations corrected against v1.17.0 source during verification (D-term PLUS sign, PID.cpp L47: 2 tests; no conditional-integration freeze gate, L57-64: 3 tests + header/comments), final 17/17 PASS. The corrections are documented in-test and in Ashar's handoff; the earlier lead fallback is fully superseded.</w:t>
       </w:r>
     </w:p>
     <w:p>
@@ -1432,7 +1452,7 @@
         <w:t>evidence/logs/student_{HysteresisStructural,PIDStructural,BatteryStructural}_run.log</w:t>
       </w:r>
       <w:r>
-        <w:t xml:space="preserve"> (11/11, 11/11, 29/29). Binaries: </w:t>
+        <w:t xml:space="preserve"> (11/11, 17/17, 29/29). Binaries: </w:t>
       </w:r>
       <w:r>
         <w:rPr>
@@ -1554,7 +1574,7 @@
         <w:pStyle w:val="ListBullet"/>
       </w:pPr>
       <w:r>
-        <w:t xml:space="preserve">PID.cpp: baseline 22/22 → final 22/22 (100%), arcs 10/10 (100%) — the non-finite-integral guard and all four derivative-guard operand outcomes are exercised by the submitted </w:t>
+        <w:t xml:space="preserve">PID.cpp: baseline 22/22 → final 22/22 (100%), arcs 10/10 (100%) — the non-finite-integral guard and all four derivative-guard operand outcomes are exercised by Ashar's submitted </w:t>
       </w:r>
       <w:r>
         <w:rPr>
@@ -1564,7 +1584,7 @@
         <w:t>PIDStructural</w:t>
       </w:r>
       <w:r>
-        <w:t xml:space="preserve"> tests (PST-01..11).</w:t>
+        <w:t xml:space="preserve"> tests (PST-01..17).</w:t>
       </w:r>
     </w:p>
     <w:p>
@@ -1620,7 +1640,7 @@
         <w:t>PIDStructural</w:t>
       </w:r>
       <w:r>
-        <w:t xml:space="preserve"> tests (non-finite-integral guard, derivative-guard quad, </w:t>
+        <w:t xml:space="preserve"> tests (Ashar-authored; update flag, saturation/clamp pairs, NaN/−Inf guards, derivative-guard quad, </w:t>
       </w:r>
       <w:r>
         <w:rPr>
@@ -1630,7 +1650,7 @@
         <w:t>FLT_EPSILON</w:t>
       </w:r>
       <w:r>
-        <w:t xml:space="preserve">/negative-dt edges, windup/limit boundaries — closing the 2 sub-arcs upstream left open), and 29 </w:t>
+        <w:t xml:space="preserve">/negative-dt edges, windup/limit boundaries, zero-gain degenerate — closing the 2 sub-arcs upstream left open), and 29 </w:t>
       </w:r>
       <w:r>
         <w:rPr>
@@ -1682,7 +1702,7 @@
         <w:pStyle w:val="ListBullet"/>
       </w:pPr>
       <w:r>
-        <w:t xml:space="preserve">FAIL/BLOCKED investigations: 3 student-test failures occurred during development, all investigated before any defect claim and all resolved as test-side expectation errors with production code untouched. (1) </w:t>
+        <w:t xml:space="preserve">FAIL/BLOCKED investigations: 8 student-test failures occurred during development, all investigated before any defect claim and all resolved as test-side expectation errors with production code untouched. (1) </w:t>
       </w:r>
       <w:r>
         <w:rPr>
@@ -1752,7 +1772,37 @@
         <w:t>isnan</w:t>
       </w:r>
       <w:r>
-        <w:t xml:space="preserve"> plus the guard assertion. In each case the setup, expected value, and dependency behavior (uORB advertisement lifetime, </w:t>
+        <w:t xml:space="preserve"> plus the guard assertion. (3–7) Ashar PID integration: 2 D-term sign expectations (</w:t>
+      </w:r>
+      <w:r>
+        <w:rPr>
+          <w:rFonts w:ascii="Consolas" w:hAnsi="Consolas"/>
+          <w:sz w:val="20"/>
+        </w:rPr>
+        <w:t>−4/−100</w:t>
+      </w:r>
+      <w:r>
+        <w:t xml:space="preserve"> vs actual </w:t>
+      </w:r>
+      <w:r>
+        <w:rPr>
+          <w:rFonts w:ascii="Consolas" w:hAnsi="Consolas"/>
+          <w:sz w:val="20"/>
+        </w:rPr>
+        <w:t>+4/+100</w:t>
+      </w:r>
+      <w:r>
+        <w:t xml:space="preserve"> — v1.17.0 uses PLUS, PID.cpp L47) and 3 saturation tests assuming a conditional-integration freeze gate that does not exist in v1.17.0 (</w:t>
+      </w:r>
+      <w:r>
+        <w:rPr>
+          <w:rFonts w:ascii="Consolas" w:hAnsi="Consolas"/>
+          <w:sz w:val="20"/>
+        </w:rPr>
+        <w:t>updateIntegral</w:t>
+      </w:r>
+      <w:r>
+        <w:t xml:space="preserve"> L57-64 always integrates); all corrected to source-verified expectations, final 17/17 PASS. In each case the setup, expected value, and dependency behavior (uORB advertisement lifetime, </w:t>
       </w:r>
       <w:r>
         <w:rPr>
@@ -1762,7 +1812,17 @@
         <w:t>AlphaFilter</w:t>
       </w:r>
       <w:r>
-        <w:t xml:space="preserve"> reset-vs-update semantics) were checked first.</w:t>
+        <w:t xml:space="preserve"> reset-vs-update semantics, </w:t>
+      </w:r>
+      <w:r>
+        <w:rPr>
+          <w:rFonts w:ascii="Consolas" w:hAnsi="Consolas"/>
+          <w:sz w:val="20"/>
+        </w:rPr>
+        <w:t>constrain</w:t>
+      </w:r>
+      <w:r>
+        <w:t xml:space="preserve"> NaN passthrough) were checked first.</w:t>
       </w:r>
     </w:p>
     <w:p>
@@ -1914,7 +1974,17 @@
         <w:pStyle w:val="ListBullet"/>
       </w:pPr>
       <w:r>
-        <w:t xml:space="preserve">AI tools assisted repository navigation, build troubleshooting, test scaffolding, and coverage analysis throughout; every AI-suggested test, expectation value, and coverage claim was independently verified by compiling, running, and measuring (3 wrong AI-assisted expectations were caught and corrected during development: 2 Battery RLS-gate timings, 1 PID NaN output). Scope, MC/DC pairs, and gap justifications were derived from direct source reading, not from model assertions. Full per-iteration log: </w:t>
+        <w:t xml:space="preserve">AI tools assisted repository navigation, build troubleshooting, test scaffolding, and coverage analysis throughout; every AI-suggested test, expectation value, and coverage claim was independently verified by compiling, running, and measuring (8 wrong AI-assisted expectations were caught and corrected during development: 2 Battery RLS-gate timings, 1 PID NaN output, 2 Ashar PID sign expectations refuted by PID.cpp L47, 3 Ashar saturation expectations refuted by the absence of a freeze gate in L57-64). Scope, MC/DC pairs, and gap justifications were derived from direct source reading, not from model assertions. Ashar's record (per </w:t>
+      </w:r>
+      <w:r>
+        <w:rPr>
+          <w:rFonts w:ascii="Consolas" w:hAnsi="Consolas"/>
+          <w:sz w:val="20"/>
+        </w:rPr>
+        <w:t>ASHAR_HANDOFF.md</w:t>
+      </w:r>
+      <w:r>
+        <w:t xml:space="preserve"> §10): OpenCode/Muse Spark for navigation, float32 verification scripting, scaffolding, handoff drafting; assumptions it introduced (brief's line/decision framing; fallback sign expectations) were corrected by direct source reading, hand recomputation, and an independent float32 model (5 riskiest values bit-exact). Full per-iteration log: </w:t>
       </w:r>
       <w:r>
         <w:rPr>

</xml_diff>

<commit_message>
Merge Taimoor audit: 4 new probe tests (61 total), B-D10 c2 demonstrated, proposed workbook + col F, report/VIVA sync
</commit_message>
<xml_diff>
--- a/24i3102_24i3052_24i3072_C_Report.docx
+++ b/24i3102_24i3052_24i3072_C_Report.docx
@@ -162,7 +162,37 @@
         <w:pStyle w:val="ListBullet"/>
       </w:pPr>
       <w:r>
-        <w:t>White-box structural testing of selected PX4 business/control logic; scope chosen from implementation (not from a coverage target).</w:t>
+        <w:t xml:space="preserve">White-box structural testing of selected PX4 business/control logic; scope chosen from implementation (not from a coverage target): </w:t>
+      </w:r>
+      <w:r>
+        <w:rPr>
+          <w:rFonts w:ascii="Consolas" w:hAnsi="Consolas"/>
+          <w:sz w:val="20"/>
+        </w:rPr>
+        <w:t>src/lib/hysteresis/hysteresis.cpp</w:t>
+      </w:r>
+      <w:r>
+        <w:t xml:space="preserve"> (GTest unit), </w:t>
+      </w:r>
+      <w:r>
+        <w:rPr>
+          <w:rFonts w:ascii="Consolas" w:hAnsi="Consolas"/>
+          <w:sz w:val="20"/>
+        </w:rPr>
+        <w:t>src/lib/pid/PID.cpp</w:t>
+      </w:r>
+      <w:r>
+        <w:t xml:space="preserve"> (GTest unit), </w:t>
+      </w:r>
+      <w:r>
+        <w:rPr>
+          <w:rFonts w:ascii="Consolas" w:hAnsi="Consolas"/>
+          <w:sz w:val="20"/>
+        </w:rPr>
+        <w:t>src/lib/battery/battery.cpp</w:t>
+      </w:r>
+      <w:r>
+        <w:t xml:space="preserve"> (GTest functional, also the MC/DC component — see §3).</w:t>
       </w:r>
     </w:p>
     <w:p>
@@ -810,7 +840,7 @@
         <w:t>&gt;=</w:t>
       </w:r>
       <w:r>
-        <w:t xml:space="preserve">-expiry boundaries upstream never probes); Battery B-D1..B-D12 via 29 </w:t>
+        <w:t xml:space="preserve">-expiry boundaries upstream never probes); Battery B-D1..B-D12 via 33 </w:t>
       </w:r>
       <w:r>
         <w:rPr>
@@ -820,7 +850,7 @@
         <w:t>BatteryStructural</w:t>
       </w:r>
       <w:r>
-        <w:t xml:space="preserve"> functional tests (warning ladder, spike fault, RLS gate, SoC fusion, dt clamp, scale fallback, publish paths, remaining-time gates); PID P-D1..P-D3 (+ saturation edges) via 17 </w:t>
+        <w:t xml:space="preserve"> functional tests (warning ladder, spike fault, RLS gate, SoC fusion, dt clamp, scale fallback, publish paths, remaining-time gates, index&lt;1 clamp, armed+NaN hold, FW second-copy hold, unadvertised-topic robustness); PID P-D1..P-D3 (+ saturation edges) via 17 </w:t>
       </w:r>
       <w:r>
         <w:rPr>
@@ -830,7 +860,7 @@
         <w:t>PIDStructural</w:t>
       </w:r>
       <w:r>
-        <w:t xml:space="preserve"> tests (update-integral flag, saturation/clamp pairs, NaN/−Inf guards, derivative-guard MC/DC quad, FLT_EPSILON boundary, negative-dt, windup clamp, limit edges, zero-gain degenerate). Full per-test mapping: workbook Sheet 1 (57 rows: HST-01..11, BST-01..29, PST-01..17).</w:t>
+        <w:t xml:space="preserve"> tests (update-integral flag, saturation/clamp pairs, NaN/−Inf guards, derivative-guard MC/DC quad, FLT_EPSILON boundary, negative-dt, windup clamp, limit edges, zero-gain degenerate). Full per-test mapping: workbook Sheet 1 (61 rows: HST-01..11, BST-01..33, PST-01..17).</w:t>
       </w:r>
     </w:p>
     <w:p>
@@ -904,7 +934,7 @@
         <w:t>functional-BatteryStructural</w:t>
       </w:r>
       <w:r>
-        <w:t xml:space="preserve"> 29/29 (logs in </w:t>
+        <w:t xml:space="preserve"> 33/33 (logs in </w:t>
       </w:r>
       <w:r>
         <w:rPr>
@@ -1396,7 +1426,7 @@
         <w:t>src/lib/battery/CMakeLists.txt</w:t>
       </w:r>
       <w:r>
-        <w:t xml:space="preserve"> (+2 lines). Zero production-code changes — the diff touches only test registrations plus 3 new test files (928 insertions, 0 deletions in production logic).</w:t>
+        <w:t xml:space="preserve"> (+2 lines). Zero production-code changes — the diff touches only test registrations plus 3 new test files (1140 insertions, 0 deletions in production logic).</w:t>
       </w:r>
     </w:p>
     <w:p>
@@ -1424,7 +1454,7 @@
         <w:t>git diff HEAD</w:t>
       </w:r>
       <w:r>
-        <w:t>, 928 insertions across 6 files) reconstructs the submission against v1.17.0; upstream tests were read/run for conventions and baseline only.</w:t>
+        <w:t>, 1140 insertions across 6 files) reconstructs the submission against v1.17.0; upstream tests were read/run for conventions and baseline only.</w:t>
       </w:r>
     </w:p>
     <w:p>
@@ -1452,7 +1482,7 @@
         <w:t>evidence/logs/student_{HysteresisStructural,PIDStructural,BatteryStructural}_run.log</w:t>
       </w:r>
       <w:r>
-        <w:t xml:space="preserve"> (11/11, 17/17, 29/29). Binaries: </w:t>
+        <w:t xml:space="preserve"> (11/11, 17/17, 33/33). Binaries: </w:t>
       </w:r>
       <w:r>
         <w:rPr>
@@ -1592,7 +1622,7 @@
         <w:pStyle w:val="ListBullet"/>
       </w:pPr>
       <w:r>
-        <w:t>battery.cpp: baseline ABSENT from coverage (0% — no upstream test links the library) → final 230/231 lines (99.6%), 19/19 functions, arcs 170/248. Sole line gap: L72 (</w:t>
+        <w:t>battery.cpp: baseline ABSENT from coverage (0% — no upstream test links the library) → final 230/231 lines (99.6%), 19/19 functions, arcs 174/248. Sole line gap: L72 (</w:t>
       </w:r>
       <w:r>
         <w:rPr>
@@ -1630,7 +1660,7 @@
         <w:t>&gt;=</w:t>
       </w:r>
       <w:r>
-        <w:t xml:space="preserve"> boundaries upstream never probes), 11 </w:t>
+        <w:t xml:space="preserve"> boundaries upstream never probes), 17 </w:t>
       </w:r>
       <w:r>
         <w:rPr>
@@ -1640,7 +1670,7 @@
         <w:t>PIDStructural</w:t>
       </w:r>
       <w:r>
-        <w:t xml:space="preserve"> tests (Ashar-authored; update flag, saturation/clamp pairs, NaN/−Inf guards, derivative-guard quad, </w:t>
+        <w:t xml:space="preserve"> tests (Ashar-authored, lead-verified; update flag, saturation/clamp pairs, NaN/−Inf guards, derivative-guard quad, </w:t>
       </w:r>
       <w:r>
         <w:rPr>
@@ -1650,7 +1680,7 @@
         <w:t>FLT_EPSILON</w:t>
       </w:r>
       <w:r>
-        <w:t xml:space="preserve">/negative-dt edges, windup/limit boundaries, zero-gain degenerate — closing the 2 sub-arcs upstream left open), and 29 </w:t>
+        <w:t xml:space="preserve">/negative-dt edges, windup/limit boundaries, zero-gain degenerate — closing the 2 sub-arcs upstream left open), and 33 </w:t>
       </w:r>
       <w:r>
         <w:rPr>
@@ -1660,7 +1690,7 @@
         <w:t>BatteryStructural</w:t>
       </w:r>
       <w:r>
-        <w:t xml:space="preserve"> functional tests (warning ladder, spike fault, RLS-gate MC/DC, SoC fusion, dt clamp, scale fallback, publish paths, uORB/armed/FW phase gates incl. a Publication-lifetime fix discovered during development).</w:t>
+        <w:t xml:space="preserve"> functional tests (warning ladder, spike fault, RLS-gate MC/DC, SoC fusion, dt clamp, scale fallback, publish paths, uORB/armed/FW phase gates incl. a Publication-lifetime fix discovered during development, plus Taimoor-audit probes: index&lt;1 clamp, armed+NaN hold, FW second-copy hold, unadvertised-topic robustness).</w:t>
       </w:r>
     </w:p>
     <w:p>
@@ -1668,7 +1698,17 @@
         <w:pStyle w:val="ListBullet"/>
       </w:pPr>
       <w:r>
-        <w:t xml:space="preserve">Remaining gaps: L72 (above); hysteresis 3 unreachable arcs (above); B-D9 c1 </w:t>
+        <w:t xml:space="preserve">Remaining gaps: L71/L72 </w:t>
+      </w:r>
+      <w:r>
+        <w:rPr>
+          <w:rFonts w:ascii="Consolas" w:hAnsi="Consolas"/>
+          <w:sz w:val="20"/>
+        </w:rPr>
+        <w:t>PARAM_INVALID</w:t>
+      </w:r>
+      <w:r>
+        <w:t xml:space="preserve"> defensive path (same corrupted-store requirement); hysteresis 3 unreachable arcs (above); B-D9 c1 </w:t>
       </w:r>
       <w:r>
         <w:rPr>
@@ -1678,7 +1718,17 @@
         <w:t>!finite(avg)</w:t>
       </w:r>
       <w:r>
-        <w:t xml:space="preserve"> unreachable via public API (the only average writer is itself guarded by B-D10's finite check — defense-in-depth subsumed downstream). No gap is hand-waved: each names the exact line/arc, why it cannot fire locally, and what would be needed.</w:t>
+        <w:t xml:space="preserve"> unreachable via public API (the only average writer is itself guarded by B-D10's finite check — defense-in-depth subsumed downstream); L356 copy-false path not deterministically reachable (requires updated()=T with copy()=F, i.e. topic withdrawal mid-call — the unadvertised-topic test documents safe behavior instead). Branch totals include ~70 compiler-generated </w:t>
+      </w:r>
+      <w:r>
+        <w:rPr>
+          <w:rFonts w:ascii="Consolas" w:hAnsi="Consolas"/>
+          <w:sz w:val="20"/>
+        </w:rPr>
+        <w:t>e0</w:t>
+      </w:r>
+      <w:r>
+        <w:t xml:space="preserve"> exception/unwind arcs (matrix/filter/param templates) with no corresponding source decision — reported separately, never excluded. No gap is hand-waved: each names the exact line/arc, why it cannot fire locally, and what would be needed.</w:t>
       </w:r>
     </w:p>
     <w:p>
@@ -1686,7 +1736,7 @@
         <w:pStyle w:val="ListBullet"/>
       </w:pPr>
       <w:r>
-        <w:t>MC/DC completeness for applicable decisions: H-D5/H-D7, B-D4 (4 conditions), B-D8, B-D9 c2/c3, B-D10, B-D11 (all conditions), P-D3 (dt×history quad) demonstrated with independence pairs in workbook Sheet 2; B-D9 c1 justified unreachable (above).</w:t>
+        <w:t>MC/DC completeness for applicable decisions: H-D5/H-D7, B-D4 (4 conditions), B-D8, B-D9 c2/c3, B-D10 (both conditions, c2 via BST-19 vs BST-31 armed+NaN pair), B-D11 (all conditions), P-D3 (dt×history quad) demonstrated with independence pairs in workbook Sheet 2; B-D9 c1 justified unreachable (above).</w:t>
       </w:r>
     </w:p>
     <w:p>
@@ -1891,6 +1941,44 @@
     </w:p>
     <w:p>
       <w:pPr>
+        <w:pStyle w:val="ListBullet"/>
+      </w:pPr>
+      <w:r>
+        <w:t xml:space="preserve">Audit trail: an independent consistency audit (Taimoor Khalid 24i3052: </w:t>
+      </w:r>
+      <w:r>
+        <w:rPr>
+          <w:rFonts w:ascii="Consolas" w:hAnsi="Consolas"/>
+          <w:sz w:val="20"/>
+        </w:rPr>
+        <w:t>taimoor/AUDIT_REPORT.md</w:t>
+      </w:r>
+      <w:r>
+        <w:t xml:space="preserve">, </w:t>
+      </w:r>
+      <w:r>
+        <w:rPr>
+          <w:rFonts w:ascii="Consolas" w:hAnsi="Consolas"/>
+          <w:sz w:val="20"/>
+        </w:rPr>
+        <w:t>taimoor/COVERAGE_GAP_ANALYSIS.md</w:t>
+      </w:r>
+      <w:r>
+        <w:t xml:space="preserve">) verified hashes, counts, patch applicability, and every BRDA gap classification against the </w:t>
+      </w:r>
+      <w:r>
+        <w:rPr>
+          <w:rFonts w:ascii="Consolas" w:hAnsi="Consolas"/>
+          <w:sz w:val="20"/>
+        </w:rPr>
+        <w:t>.info</w:t>
+      </w:r>
+      <w:r>
+        <w:t xml:space="preserve"> evidence; its must-fix findings (workbook source-ref column, B-D10 c2 probe, failure-count lock) are all closed in this revision.</w:t>
+      </w:r>
+    </w:p>
+    <w:p>
+      <w:pPr>
         <w:pStyle w:val="Heading2"/>
       </w:pPr>
       <w:r>
@@ -1899,7 +1987,7 @@
     </w:p>
     <w:p>
       <w:r>
-        <w:t>The structural evidence supports a narrow but strong claim: the three analyzed components behave as specified on every executable path reachable locally. Hysteresis reaches 22/22 lines with all reachable branches taken, including exact timer-expiry boundaries the upstream suite never probes. PID reaches 22/22 lines and 10/10 branch arcs, closing the non-finite-integral and derivative-history gaps upstream leaves open. Battery — which had no upstream test and therefore 0% baseline coverage — reaches 230/231 lines with all 19 functions covered, and independence pairs prove every atomic condition of the failsafe-critical warning, fault, and remaining-time gates can flip its decision, except cases proven unreachable by construction rather than by weak tests. Three student-test failures during development were each traced to wrong expectations, never to production defects, and no reproducible production defect is claimed; the suite is green because the covered logic met its specification on the exercised paths, and no failure was manufactured. Confidence is therefore high but strictly scoped: statement coverage is complete over the analyzed scope and every reachable decision shows both outcomes, so residual risk concentrates in the individually justified gaps — the L72 corrupted-param log, three hysteresis arcs contradicting the entry guard, and the subsumed B-D9 non-finite arm. Everything outside the scope remains unsupported: the failsafe consumers of these signals, the estimators feeding them, real-sensor noise, real-time scheduling, and the rest of the PX4 codebase, none of which this evidence addresses. In particular, RLS convergence was shown only on synthetic steps and fixed-wing remaining-time behavior only on synthetic phase stamps. The honest reading is that the selected business logic is structurally sound and deterministically verified at unit and functional levels, while any claim about PX4 as a whole would require system, simulation, and flight evidence far beyond this assignment.</w:t>
+        <w:t>The structural evidence supports a narrow but strong claim: the three analyzed components behave as specified on every executable path reachable locally. Hysteresis reaches 22/22 lines with all reachable branches taken, including exact timer-expiry boundaries the upstream suite never probes. PID reaches 22/22 lines and 10/10 branch arcs, closing the non-finite-integral and derivative-history gaps upstream leaves open. Battery — which had no upstream test and therefore 0% baseline coverage — reaches 230/231 lines with all 19 functions covered, and independence pairs prove every atomic condition of the failsafe-critical warning, fault, and remaining-time gates can flip its decision, except cases proven unreachable by construction rather than by weak tests. Eight student-test failures during development were each traced to wrong expectations, never to production defects, and no reproducible production defect is claimed; the suite is green because the covered logic met its specification on the exercised paths, and no failure was manufactured. Confidence is therefore high but strictly scoped: statement coverage is complete over the analyzed scope and every reachable decision shows both outcomes, so residual risk concentrates in the individually justified gaps — the L72 corrupted-param log, three hysteresis arcs contradicting the entry guard, and the subsumed B-D9 non-finite arm. Everything outside the scope remains unsupported: the failsafe consumers of these signals, the estimators feeding them, real-sensor noise, real-time scheduling, and the rest of the PX4 codebase, none of which this evidence addresses. In particular, RLS convergence was shown only on synthetic steps and fixed-wing remaining-time behavior only on synthetic phase stamps. The honest reading is that the selected business logic is structurally sound and deterministically verified at unit and functional levels, while any claim about PX4 as a whole would require system, simulation, and flight evidence far beyond this assignment.</w:t>
       </w:r>
     </w:p>
     <w:p>
@@ -1984,7 +2072,17 @@
         <w:t>ASHAR_HANDOFF.md</w:t>
       </w:r>
       <w:r>
-        <w:t xml:space="preserve"> §10): OpenCode/Muse Spark for navigation, float32 verification scripting, scaffolding, handoff drafting; assumptions it introduced (brief's line/decision framing; fallback sign expectations) were corrected by direct source reading, hand recomputation, and an independent float32 model (5 riskiest values bit-exact). Full per-iteration log: </w:t>
+        <w:t xml:space="preserve"> §10): OpenCode/Muse Spark for navigation, float32 verification scripting, scaffolding, handoff drafting; assumptions it introduced (brief's line/decision framing; fallback sign expectations) were corrected by direct source reading, hand recomputation, and an independent float32 model (5 riskiest values bit-exact). Taimoor's record: AI (OpenCode) used for cross-file consistency audit, coverage-gap classification from </w:t>
+      </w:r>
+      <w:r>
+        <w:rPr>
+          <w:rFonts w:ascii="Consolas" w:hAnsi="Consolas"/>
+          <w:sz w:val="20"/>
+        </w:rPr>
+        <w:t>.info</w:t>
+      </w:r>
+      <w:r>
+        <w:t xml:space="preserve">/BRDA data, report prose drafting, viva-bank derivation, and packaging checklist; wrote no PX4 or test code. Assumption risk (line↔arc mapping from lcov numbering) mitigated by citing raw BRDA strings; all numbers rechecked against evidence files, and every one of his audit findings was independently re-verified (BRDA strings, counts, patch applicability) before merging — including the B-D10 c2 gap, which was closed with a new probe test rather than taken on word. Full per-iteration log: </w:t>
       </w:r>
       <w:r>
         <w:rPr>

</xml_diff>

<commit_message>
Rewrite report in full prose + professional DOCX (title page, page numbers); sync packages
</commit_message>
<xml_diff>
--- a/24i3102_24i3052_24i3072_C_Report.docx
+++ b/24i3102_24i3052_24i3072_C_Report.docx
@@ -4,10 +4,59 @@
   <w:body>
     <w:p>
       <w:pPr>
-        <w:pStyle w:val="Heading1"/>
+        <w:jc w:val="center"/>
       </w:pPr>
       <w:r>
-        <w:t>REPORT_DRAFT — Assignment 02 (living draft, auto-updated by Sisyphus)</w:t>
+        <w:rPr>
+          <w:color w:val="444444"/>
+          <w:sz w:val="26"/>
+        </w:rPr>
+        <w:t>Software Quality Engineering (SE3002)</w:t>
+        <w:br/>
+        <w:t>Assignment 02 — 100 marks</w:t>
+      </w:r>
+    </w:p>
+    <w:p>
+      <w:pPr>
+        <w:jc w:val="center"/>
+      </w:pPr>
+      <w:r>
+        <w:rPr>
+          <w:b/>
+          <w:color w:val="1F4E79"/>
+          <w:sz w:val="44"/>
+        </w:rPr>
+        <w:t>Structural Testing and Coverage Analysis of PX4 Autopilot v1.17.0 — SE3002 Assignment 02</w:t>
+      </w:r>
+    </w:p>
+    <w:p>
+      <w:pPr>
+        <w:jc w:val="center"/>
+      </w:pPr>
+      <w:r>
+        <w:rPr>
+          <w:color w:val="444444"/>
+          <w:sz w:val="22"/>
+        </w:rPr>
+        <w:t>PX4-Autopilot v1.17.0  ·  d6f12ad1c4f70ad3230afd7d86e971421e02fef4</w:t>
+      </w:r>
+    </w:p>
+    <w:p>
+      <w:pPr>
+        <w:jc w:val="center"/>
+      </w:pPr>
+      <w:r>
+        <w:rPr>
+          <w:sz w:val="24"/>
+        </w:rPr>
+        <w:t>Ali Haider Bajwa (24i3102)  ·  Taimoor Khalid (24i3052)  ·  Ashar Ahmed (24i3072)</w:t>
+        <w:br/>
+        <w:t>Section C (SE)</w:t>
+      </w:r>
+    </w:p>
+    <w:p>
+      <w:r>
+        <w:br w:type="page"/>
       </w:r>
     </w:p>
     <w:p>
@@ -15,154 +64,15 @@
         <w:pStyle w:val="Heading2"/>
       </w:pPr>
       <w:r>
-        <w:t>Structural Testing and Coverage Analysis of PX4 Autopilot v1.17.0 — SE3002</w:t>
+        <w:rPr>
+          <w:color w:val="1F4E79"/>
+        </w:rPr>
+        <w:t>1. Introduction and testing approach</w:t>
       </w:r>
     </w:p>
     <w:p>
       <w:r>
-        <w:rPr>
-          <w:i/>
-          <w:color w:val="444444"/>
-        </w:rPr>
-        <w:t>**Status: FINAL DRAFT v3 (2026-10-01).** Complete — group identities and Section C filled; filenames use `24i3102_24i3052_24i3072_C`.</w:t>
-      </w:r>
-    </w:p>
-    <w:p>
-      <w:r>
-        <w:rPr>
-          <w:i/>
-          <w:color w:val="444444"/>
-        </w:rPr>
-        <w:t>This file is the single source for the final report; export to DOCX at packaging time.</w:t>
-      </w:r>
-    </w:p>
-    <w:p>
-      <w:r>
-        <w:rPr>
-          <w:i/>
-          <w:color w:val="444444"/>
-        </w:rPr>
-        <w:t>Rule: every work iteration updates the affected section below — never batch updates at the end.</w:t>
-      </w:r>
-    </w:p>
-    <w:p>
-      <w:r>
-        <w:rPr>
-          <w:i/>
-          <w:color w:val="444444"/>
-        </w:rPr>
-        <w:t>Evidence rule: report stays concise; details live in test code, framework output, coverage HTML, workbook. No duplicated procedures, no redundant % tables, no extra workbook sheets.</w:t>
-      </w:r>
-    </w:p>
-    <w:p>
-      <w:r>
-        <w:t>——————————————————————————————</w:t>
-      </w:r>
-    </w:p>
-    <w:p>
-      <w:pPr>
-        <w:pStyle w:val="Heading2"/>
-      </w:pPr>
-      <w:r>
-        <w:t>Cover — Group details [TODO: fill]</w:t>
-      </w:r>
-    </w:p>
-    <w:p>
-      <w:pPr>
-        <w:pStyle w:val="ListBullet"/>
-      </w:pPr>
-      <w:r>
-        <w:t>Members: Ali Haider Bajwa (24i3102), Taimoor Khalid (24i3052), Ashar Ahmed (24i3072) — Section C (SE)</w:t>
-      </w:r>
-    </w:p>
-    <w:p>
-      <w:pPr>
-        <w:pStyle w:val="ListBullet"/>
-      </w:pPr>
-      <w:r>
-        <w:t>Cadence: ASAP (no fixed due date shared; executing at maximum pace)</w:t>
-      </w:r>
-    </w:p>
-    <w:p>
-      <w:pPr>
-        <w:pStyle w:val="ListBullet"/>
-      </w:pPr>
-      <w:r>
-        <w:t>Final report export: DOCX only (from this draft)</w:t>
-      </w:r>
-    </w:p>
-    <w:p>
-      <w:pPr>
-        <w:pStyle w:val="ListBullet"/>
-      </w:pPr>
-      <w:r>
-        <w:t>Course: SE3002 Software Quality Engineering, Assignment 02 (100 marks)</w:t>
-      </w:r>
-    </w:p>
-    <w:p>
-      <w:pPr>
-        <w:pStyle w:val="ListBullet"/>
-      </w:pPr>
-      <w:r>
-        <w:t xml:space="preserve">SUT: PX4-Autopilot </w:t>
-      </w:r>
-      <w:r>
-        <w:rPr>
-          <w:b/>
-        </w:rPr>
-        <w:t>v1.17.0</w:t>
-      </w:r>
-      <w:r>
-        <w:t xml:space="preserve"> (NOT main branch) — commit hash: </w:t>
-      </w:r>
-      <w:r>
-        <w:rPr>
-          <w:rFonts w:ascii="Consolas" w:hAnsi="Consolas"/>
-          <w:sz w:val="20"/>
-        </w:rPr>
-        <w:t>d6f12ad1c4f70ad3230afd7d86e971421e02fef4</w:t>
-      </w:r>
-    </w:p>
-    <w:p>
-      <w:pPr>
-        <w:pStyle w:val="ListBullet"/>
-      </w:pPr>
-      <w:r>
-        <w:t xml:space="preserve">Submission: report + workbook (.xlsx) + test code + patch + coverage evidence + logs (naming </w:t>
-      </w:r>
-      <w:r>
-        <w:rPr>
-          <w:rFonts w:ascii="Consolas" w:hAnsi="Consolas"/>
-          <w:sz w:val="20"/>
-        </w:rPr>
-        <w:t>&lt;Roll1_Roll2_Roll3_Section&gt;.&lt;ext&gt;</w:t>
-      </w:r>
-      <w:r>
-        <w:t>)</w:t>
-      </w:r>
-    </w:p>
-    <w:p>
-      <w:pPr>
-        <w:pStyle w:val="ListBullet"/>
-      </w:pPr>
-      <w:r>
-        <w:t>Environment summary: [OS + arch + compiler + build commands — §2]</w:t>
-      </w:r>
-    </w:p>
-    <w:p>
-      <w:pPr>
-        <w:pStyle w:val="Heading2"/>
-      </w:pPr>
-      <w:r>
-        <w:t>1. Introduction and testing approach (concise)</w:t>
-      </w:r>
-    </w:p>
-    <w:p>
-      <w:pPr>
-        <w:pStyle w:val="ListBullet"/>
-      </w:pPr>
-      <w:r>
-        <w:t xml:space="preserve">White-box structural testing of selected PX4 business/control logic; scope chosen from implementation (not from a coverage target): </w:t>
+        <w:t xml:space="preserve">We performed white-box structural testing of three selected PX4 v1.17.0 production areas, chosen from direct source reading rather than from any coverage target: </w:t>
       </w:r>
       <w:r>
         <w:rPr>
@@ -172,7 +82,7 @@
         <w:t>src/lib/hysteresis/hysteresis.cpp</w:t>
       </w:r>
       <w:r>
-        <w:t xml:space="preserve"> (GTest unit), </w:t>
+        <w:t xml:space="preserve"> (a boolean state machine with asymmetric time delays, tested at GTest unit level), </w:t>
       </w:r>
       <w:r>
         <w:rPr>
@@ -182,7 +92,7 @@
         <w:t>src/lib/pid/PID.cpp</w:t>
       </w:r>
       <w:r>
-        <w:t xml:space="preserve"> (GTest unit), </w:t>
+        <w:t xml:space="preserve"> (a control-loop PID with saturation, anti-windup, and degenerate-input guards, GTest unit), and </w:t>
       </w:r>
       <w:r>
         <w:rPr>
@@ -192,49 +102,7 @@
         <w:t>src/lib/battery/battery.cpp</w:t>
       </w:r>
       <w:r>
-        <w:t xml:space="preserve"> (GTest functional, also the MC/DC component — see §3).</w:t>
-      </w:r>
-    </w:p>
-    <w:p>
-      <w:pPr>
-        <w:pStyle w:val="ListBullet"/>
-      </w:pPr>
-      <w:r>
-        <w:t>Obligations: 100% statement + 100% decision/branch over analyzed scope (max practically achievable; all gaps justified); MC/DC on applicable compound decisions of ONE justified critical component (atomic conditions + independence pairs; each condition T+F, decision T+F in workbook matrix).</w:t>
-      </w:r>
-    </w:p>
-    <w:p>
-      <w:pPr>
-        <w:pStyle w:val="ListBullet"/>
-      </w:pPr>
-      <w:r>
-        <w:t xml:space="preserve">Test levels used: </w:t>
-      </w:r>
-      <w:r>
-        <w:rPr>
-          <w:b/>
-        </w:rPr>
-        <w:t>GTest unit</w:t>
-      </w:r>
-      <w:r>
-        <w:t xml:space="preserve"> for hysteresis + PID (internal-only deps, fully deterministic); </w:t>
-      </w:r>
-      <w:r>
-        <w:rPr>
-          <w:b/>
-        </w:rPr>
-        <w:t>GTest functional</w:t>
-      </w:r>
-      <w:r>
-        <w:t xml:space="preserve"> for Battery (params/uORB support required). SITL not needed — no selected logic requires full flight-controller context.</w:t>
-      </w:r>
-    </w:p>
-    <w:p>
-      <w:pPr>
-        <w:pStyle w:val="ListBullet"/>
-      </w:pPr>
-      <w:r>
-        <w:t>Upstream tests: read/run for conventions + baseline only; all claimed tests student-authored (diff proves it). No prod-behavior changes [or list separately justified testability change + behavior-neutral proof — currently none].</w:t>
+        <w:t xml:space="preserve"> (state-of-charge fusion, internal-resistance estimation, warning and fault classification, and remaining-time estimation, GTest functional). The Battery class doubles as our MC/DC component, because its warning and fault outputs drive failsafe behavior. Our obligations were 100% statement coverage and 100% decision and branch coverage over this scope wherever practically achievable, with every residual gap individually investigated and justified, plus MC/DC independence pairs for the applicable compound decisions of the critical component, recorded with each atomic condition and each overall decision showing both outcomes in the workbook matrix. Upstream tests were read and run to learn project conventions and to establish a baseline, but every claimed test is student-authored, as the reconstructing patch proves. No production behavior was changed to gain coverage; the entire diff consists of test registrations and three new test files.</w:t>
       </w:r>
     </w:p>
     <w:p>
@@ -242,311 +110,131 @@
         <w:pStyle w:val="Heading2"/>
       </w:pPr>
       <w:r>
-        <w:t>2. Local setup and fixed baseline [Part 1 — env evidence]</w:t>
-      </w:r>
-    </w:p>
-    <w:tbl>
-      <w:tblPr>
-        <w:tblStyle w:val="LightGrid-Accent1"/>
-        <w:tblW w:type="auto" w:w="0"/>
-        <w:tblLook w:firstColumn="1" w:firstRow="1" w:lastColumn="0" w:lastRow="0" w:noHBand="0" w:noVBand="1" w:val="04A0"/>
-      </w:tblPr>
-      <w:tblGrid>
-        <w:gridCol w:w="4320"/>
-        <w:gridCol w:w="4320"/>
-      </w:tblGrid>
-      <w:tr>
-        <w:tc>
-          <w:tcPr>
-            <w:tcW w:type="dxa" w:w="4320"/>
-          </w:tcPr>
-          <w:p>
-            <w:r/>
-            <w:r>
-              <w:rPr>
-                <w:b/>
-                <w:sz w:val="18"/>
-              </w:rPr>
-              <w:t>Item</w:t>
-            </w:r>
-          </w:p>
-        </w:tc>
-        <w:tc>
-          <w:tcPr>
-            <w:tcW w:type="dxa" w:w="4320"/>
-          </w:tcPr>
-          <w:p>
-            <w:r/>
-            <w:r>
-              <w:rPr>
-                <w:b/>
-                <w:sz w:val="18"/>
-              </w:rPr>
-              <w:t>Value (fill during Phase 1)</w:t>
-            </w:r>
-          </w:p>
-        </w:tc>
-      </w:tr>
-      <w:tr>
-        <w:tc>
-          <w:tcPr>
-            <w:tcW w:type="dxa" w:w="4320"/>
-          </w:tcPr>
-          <w:p>
-            <w:r/>
-            <w:r>
-              <w:rPr>
-                <w:sz w:val="18"/>
-              </w:rPr>
-              <w:t>Tag</w:t>
-            </w:r>
-          </w:p>
-        </w:tc>
-        <w:tc>
-          <w:tcPr>
-            <w:tcW w:type="dxa" w:w="4320"/>
-          </w:tcPr>
-          <w:p>
-            <w:r/>
-            <w:r>
-              <w:rPr>
-                <w:sz w:val="18"/>
-              </w:rPr>
-              <w:t>`v1.17.0` (verified `git describe --tags`)</w:t>
-            </w:r>
-          </w:p>
-        </w:tc>
-      </w:tr>
-      <w:tr>
-        <w:tc>
-          <w:tcPr>
-            <w:tcW w:type="dxa" w:w="4320"/>
-          </w:tcPr>
-          <w:p>
-            <w:r/>
-            <w:r>
-              <w:rPr>
-                <w:sz w:val="18"/>
-              </w:rPr>
-              <w:t>Commit hash</w:t>
-            </w:r>
-          </w:p>
-        </w:tc>
-        <w:tc>
-          <w:tcPr>
-            <w:tcW w:type="dxa" w:w="4320"/>
-          </w:tcPr>
-          <w:p>
-            <w:r/>
-            <w:r>
-              <w:rPr>
-                <w:sz w:val="18"/>
-              </w:rPr>
-              <w:t>`d6f12ad1c4f70ad3230afd7d86e971421e02fef4` (`git rev-parse HEAD`, recursive clone)</w:t>
-            </w:r>
-          </w:p>
-        </w:tc>
-      </w:tr>
-      <w:tr>
-        <w:tc>
-          <w:tcPr>
-            <w:tcW w:type="dxa" w:w="4320"/>
-          </w:tcPr>
-          <w:p>
-            <w:r/>
-            <w:r>
-              <w:rPr>
-                <w:sz w:val="18"/>
-              </w:rPr>
-              <w:t>Clone command</w:t>
-            </w:r>
-          </w:p>
-        </w:tc>
-        <w:tc>
-          <w:tcPr>
-            <w:tcW w:type="dxa" w:w="4320"/>
-          </w:tcPr>
-          <w:p>
-            <w:r/>
-            <w:r>
-              <w:rPr>
-                <w:sz w:val="18"/>
-              </w:rPr>
-              <w:t>`git clone --branch v1.17.0 --recursive https://github.com/PX4/PX4-Autopilot.git`</w:t>
-            </w:r>
-          </w:p>
-        </w:tc>
-      </w:tr>
-      <w:tr>
-        <w:tc>
-          <w:tcPr>
-            <w:tcW w:type="dxa" w:w="4320"/>
-          </w:tcPr>
-          <w:p>
-            <w:r/>
-            <w:r>
-              <w:rPr>
-                <w:sz w:val="18"/>
-              </w:rPr>
-              <w:t>OS / arch</w:t>
-            </w:r>
-          </w:p>
-        </w:tc>
-        <w:tc>
-          <w:tcPr>
-            <w:tcW w:type="dxa" w:w="4320"/>
-          </w:tcPr>
-          <w:p>
-            <w:r/>
-            <w:r>
-              <w:rPr>
-                <w:sz w:val="18"/>
-              </w:rPr>
-              <w:t>Linux Mint 22.3 (Ubuntu 24.04 base) / x86_64</w:t>
-            </w:r>
-          </w:p>
-        </w:tc>
-      </w:tr>
-      <w:tr>
-        <w:tc>
-          <w:tcPr>
-            <w:tcW w:type="dxa" w:w="4320"/>
-          </w:tcPr>
-          <w:p>
-            <w:r/>
-            <w:r>
-              <w:rPr>
-                <w:sz w:val="18"/>
-              </w:rPr>
-              <w:t>Compiler/toolchain</w:t>
-            </w:r>
-          </w:p>
-        </w:tc>
-        <w:tc>
-          <w:tcPr>
-            <w:tcW w:type="dxa" w:w="4320"/>
-          </w:tcPr>
-          <w:p>
-            <w:r/>
-            <w:r>
-              <w:rPr>
-                <w:sz w:val="18"/>
-              </w:rPr>
-              <w:t>gcc/g++ 13.3.0, cmake 3.28.3, ninja 1.11.1, lcov 2.0-1 (gcov 13.3.0), Python 3.12.3, git 2.43.0</w:t>
-            </w:r>
-          </w:p>
-        </w:tc>
-      </w:tr>
-      <w:tr>
-        <w:tc>
-          <w:tcPr>
-            <w:tcW w:type="dxa" w:w="4320"/>
-          </w:tcPr>
-          <w:p>
-            <w:r/>
-            <w:r>
-              <w:rPr>
-                <w:sz w:val="18"/>
-              </w:rPr>
-              <w:t>Baseline commands</w:t>
-            </w:r>
-          </w:p>
-        </w:tc>
-        <w:tc>
-          <w:tcPr>
-            <w:tcW w:type="dxa" w:w="4320"/>
-          </w:tcPr>
-          <w:p>
-            <w:r/>
-            <w:r>
-              <w:rPr>
-                <w:sz w:val="18"/>
-              </w:rPr>
-              <w:t>Direct cmake+ninja (see §10; the `make tests` wrapper was bypassed for an unquoted-path bug — environment note, not a prod change)</w:t>
-            </w:r>
-          </w:p>
-        </w:tc>
-      </w:tr>
-      <w:tr>
-        <w:tc>
-          <w:tcPr>
-            <w:tcW w:type="dxa" w:w="4320"/>
-          </w:tcPr>
-          <w:p>
-            <w:r/>
-            <w:r>
-              <w:rPr>
-                <w:sz w:val="18"/>
-              </w:rPr>
-              <w:t>Baseline result</w:t>
-            </w:r>
-          </w:p>
-        </w:tc>
-        <w:tc>
-          <w:tcPr>
-            <w:tcW w:type="dxa" w:w="4320"/>
-          </w:tcPr>
-          <w:p>
-            <w:r/>
-            <w:r>
-              <w:rPr>
-                <w:sz w:val="18"/>
-              </w:rPr>
-              <w:t>Upstream `unit-Hysteresis` 7/7, `unit-PID` 4/4 PASS (`evidence/baseline/unit-{Hysteresis,PID}_run.log`); scope baseline coverage `evidence/baseline/scope_baseline_branch.info`</w:t>
-            </w:r>
-          </w:p>
-        </w:tc>
-      </w:tr>
-    </w:tbl>
-    <w:p>
-      <w:pPr>
-        <w:pStyle w:val="Heading2"/>
-      </w:pPr>
-      <w:r>
-        <w:t>3. Repository analysis and scope selection [Part 1 — 20 marks]</w:t>
+        <w:rPr>
+          <w:color w:val="1F4E79"/>
+        </w:rPr>
+        <w:t>2. Local setup and fixed baseline</w:t>
       </w:r>
     </w:p>
     <w:p>
       <w:r>
-        <w:t>*Concise prose/bullets per scoped area (no separate scope/decision-inventory table): file/class, responsibility or critical behaviour, key deps/state, why non-trivial + included, planned PX4 test level + why. Excluded by rule: GUI/presentation, generated, test-only, pure accessors, trivial wrappers.*</w:t>
-      </w:r>
-    </w:p>
-    <w:p>
-      <w:pPr>
-        <w:pStyle w:val="ListBullet"/>
-      </w:pPr>
-      <w:r>
-        <w:t xml:space="preserve">**Scoped area 1 — </w:t>
+        <w:t xml:space="preserve">All work was cloned, built, tested, and measured locally on a student-owned machine. The repository was cloned recursively at the fixed tag </w:t>
       </w:r>
       <w:r>
         <w:rPr>
           <w:rFonts w:ascii="Consolas" w:hAnsi="Consolas"/>
           <w:sz w:val="20"/>
         </w:rPr>
-        <w:t>src/lib/hysteresis/hysteresis.cpp</w:t>
+        <w:t>v1.17.0</w:t>
       </w:r>
       <w:r>
-        <w:t xml:space="preserve"> (class </w:t>
+        <w:t xml:space="preserve"> (</w:t>
       </w:r>
       <w:r>
         <w:rPr>
           <w:rFonts w:ascii="Consolas" w:hAnsi="Consolas"/>
           <w:sz w:val="20"/>
         </w:rPr>
-        <w:t>systemlib::Hysteresis</w:t>
+        <w:t>git clone --branch v1.17.0 --recursive https://github.com/PX4/PX4-Autopilot.git</w:t>
       </w:r>
       <w:r>
-        <w:t xml:space="preserve">):** boolean state with asymmetric time delays; deps = caller-supplied </w:t>
+        <w:t xml:space="preserve">), and the local HEAD was verified as </w:t>
       </w:r>
       <w:r>
         <w:rPr>
           <w:rFonts w:ascii="Consolas" w:hAnsi="Consolas"/>
           <w:sz w:val="20"/>
         </w:rPr>
-        <w:t>hrt_abstime</w:t>
+        <w:t>d6f12ad1c4f70ad3230afd7d86e971421e02fef4</w:t>
       </w:r>
       <w:r>
-        <w:t xml:space="preserve"> timestamps only (fully deterministic). Non-trivial: two-sided time-guarded state machine (</w:t>
+        <w:t xml:space="preserve">, so every coverage figure in this report traces to that baseline plus our own test-only changes. The environment was Linux Mint 22.3 (Ubuntu 24.04 base) on x86_64, with gcc/g++ 13.3.0, cmake 3.28.3, ninja 1.11.1, lcov 2.0-1 (gcov 13.3.0), Python 3.12.3, and git 2.43.0. One environment note: the top-level </w:t>
+      </w:r>
+      <w:r>
+        <w:rPr>
+          <w:rFonts w:ascii="Consolas" w:hAnsi="Consolas"/>
+          <w:sz w:val="20"/>
+        </w:rPr>
+        <w:t>make tests</w:t>
+      </w:r>
+      <w:r>
+        <w:t xml:space="preserve"> wrapper was bypassed because its </w:t>
+      </w:r>
+      <w:r>
+        <w:rPr>
+          <w:rFonts w:ascii="Consolas" w:hAnsi="Consolas"/>
+          <w:sz w:val="20"/>
+        </w:rPr>
+        <w:t>cmake-build</w:t>
+      </w:r>
+      <w:r>
+        <w:t xml:space="preserve"> macro mishandles paths (an unquoted </w:t>
+      </w:r>
+      <w:r>
+        <w:rPr>
+          <w:rFonts w:ascii="Consolas" w:hAnsi="Consolas"/>
+          <w:sz w:val="20"/>
+        </w:rPr>
+        <w:t>$(SRC_DIR)</w:t>
+      </w:r>
+      <w:r>
+        <w:t xml:space="preserve">); we configured and built directly with cmake and ninja (§10), which is equivalent and is what all evidence was produced with — this is a build-invocation detail, not a production change. The baseline runs green: upstream </w:t>
+      </w:r>
+      <w:r>
+        <w:rPr>
+          <w:rFonts w:ascii="Consolas" w:hAnsi="Consolas"/>
+          <w:sz w:val="20"/>
+        </w:rPr>
+        <w:t>unit-Hysteresis</w:t>
+      </w:r>
+      <w:r>
+        <w:t xml:space="preserve"> passes 7 of 7 and upstream </w:t>
+      </w:r>
+      <w:r>
+        <w:rPr>
+          <w:rFonts w:ascii="Consolas" w:hAnsi="Consolas"/>
+          <w:sz w:val="20"/>
+        </w:rPr>
+        <w:t>unit-PID</w:t>
+      </w:r>
+      <w:r>
+        <w:t xml:space="preserve"> passes 4 of 4, with logs in </w:t>
+      </w:r>
+      <w:r>
+        <w:rPr>
+          <w:rFonts w:ascii="Consolas" w:hAnsi="Consolas"/>
+          <w:sz w:val="20"/>
+        </w:rPr>
+        <w:t>evidence/baseline/</w:t>
+      </w:r>
+      <w:r>
+        <w:t xml:space="preserve"> and baseline scope coverage in </w:t>
+      </w:r>
+      <w:r>
+        <w:rPr>
+          <w:rFonts w:ascii="Consolas" w:hAnsi="Consolas"/>
+          <w:sz w:val="20"/>
+        </w:rPr>
+        <w:t>evidence/baseline/scope_baseline_branch.info</w:t>
+      </w:r>
+      <w:r>
+        <w:t>.</w:t>
+      </w:r>
+    </w:p>
+    <w:p>
+      <w:pPr>
+        <w:pStyle w:val="Heading2"/>
+      </w:pPr>
+      <w:r>
+        <w:rPr>
+          <w:color w:val="1F4E79"/>
+        </w:rPr>
+        <w:t>3. Repository analysis and scope selection</w:t>
+      </w:r>
+    </w:p>
+    <w:p>
+      <w:r>
+        <w:t>We began from the production code. The hysteresis class holds a boolean state with independent per-direction delay windows and is driven entirely through caller-supplied timestamps, which makes it fully deterministic and ideal for unit testing; its two-sided time-guarded state machine (</w:t>
       </w:r>
       <w:r>
         <w:rPr>
@@ -556,7 +244,7 @@
         <w:t>set_state_and_update</w:t>
       </w:r>
       <w:r>
-        <w:t xml:space="preserve"> + </w:t>
+        <w:t xml:space="preserve"> plus </w:t>
       </w:r>
       <w:r>
         <w:rPr>
@@ -566,110 +254,7 @@
         <w:t>update</w:t>
       </w:r>
       <w:r>
-        <w:t xml:space="preserve">, ~7 decisions incl. 2 compound direction guards). Test level: </w:t>
-      </w:r>
-      <w:r>
-        <w:rPr>
-          <w:b/>
-        </w:rPr>
-        <w:t>GTest unit</w:t>
-      </w:r>
-      <w:r>
-        <w:t xml:space="preserve"> (internal-only deps).</w:t>
-      </w:r>
-    </w:p>
-    <w:p>
-      <w:pPr>
-        <w:pStyle w:val="ListBullet"/>
-      </w:pPr>
-      <w:r>
-        <w:t xml:space="preserve">**Scoped area 2 — </w:t>
-      </w:r>
-      <w:r>
-        <w:rPr>
-          <w:rFonts w:ascii="Consolas" w:hAnsi="Consolas"/>
-          <w:sz w:val="20"/>
-        </w:rPr>
-        <w:t>src/lib/pid/PID.cpp</w:t>
-      </w:r>
-      <w:r>
-        <w:t xml:space="preserve"> (class </w:t>
-      </w:r>
-      <w:r>
-        <w:rPr>
-          <w:rFonts w:ascii="Consolas" w:hAnsi="Consolas"/>
-          <w:sz w:val="20"/>
-        </w:rPr>
-        <w:t>PID</w:t>
-      </w:r>
-      <w:r>
-        <w:t>):</w:t>
-      </w:r>
-      <w:r>
-        <w:rPr>
-          <w:b/>
-        </w:rPr>
-        <w:t xml:space="preserve"> control-loop PID with output/integral saturation, NaN/integral guard, dt guard. Non-trivial: saturation + anti-windup + degenerate-input guards on a control-critical path. Test level: </w:t>
-      </w:r>
-      <w:r>
-        <w:t>GTest unit**.</w:t>
-      </w:r>
-    </w:p>
-    <w:p>
-      <w:pPr>
-        <w:pStyle w:val="ListBullet"/>
-      </w:pPr>
-      <w:r>
-        <w:t xml:space="preserve">**Scoped area 3 + MC/DC component — </w:t>
-      </w:r>
-      <w:r>
-        <w:rPr>
-          <w:rFonts w:ascii="Consolas" w:hAnsi="Consolas"/>
-          <w:sz w:val="20"/>
-        </w:rPr>
-        <w:t>src/lib/battery/battery.cpp</w:t>
-      </w:r>
-      <w:r>
-        <w:t xml:space="preserve"> (class </w:t>
-      </w:r>
-      <w:r>
-        <w:rPr>
-          <w:rFonts w:ascii="Consolas" w:hAnsi="Consolas"/>
-          <w:sz w:val="20"/>
-        </w:rPr>
-        <w:t>Battery</w:t>
-      </w:r>
-      <w:r>
-        <w:t>):** SoC fusion, RLS internal-resistance estimation, warning ladder (</w:t>
-      </w:r>
-      <w:r>
-        <w:rPr>
-          <w:rFonts w:ascii="Consolas" w:hAnsi="Consolas"/>
-          <w:sz w:val="20"/>
-        </w:rPr>
-        <w:t>determineWarning</w:t>
-      </w:r>
-      <w:r>
-        <w:t>), fault detection (</w:t>
-      </w:r>
-      <w:r>
-        <w:rPr>
-          <w:rFonts w:ascii="Consolas" w:hAnsi="Consolas"/>
-          <w:sz w:val="20"/>
-        </w:rPr>
-        <w:t>determineFaults</w:t>
-      </w:r>
-      <w:r>
-        <w:t xml:space="preserve">), remaining-time estimation. Critical behaviour for MC/DC: </w:t>
-      </w:r>
-      <w:r>
-        <w:rPr>
-          <w:b/>
-        </w:rPr>
-        <w:t>battery warning/fault classification driving failsafe</w:t>
-      </w:r>
-      <w:r>
-        <w:t xml:space="preserve"> (emergency/critical/low/none + spike fault). Deps: PX4 params (</w:t>
+        <w:t>) contains about seven decisions, including two compound direction guards, so it is genuinely non-trivial despite its small size. The PID class sits on a control-critical path with output and integral saturation, conditional integration, a non-finite-integral guard, and a time/history guard on its derivative term — again deterministic through its direct API, and squarely unit-testable. The Battery class is the richest target: it fuses voltage-based and coulomb-counted state of charge, runs a recursive-least-squares internal-resistance estimator, classifies warnings across a four-rung ladder, detects over-voltage faults, and estimates remaining flight time. It depends on PX4 parameters (</w:t>
       </w:r>
       <w:r>
         <w:rPr>
@@ -679,7 +264,7 @@
         <w:t>BAT_*</w:t>
       </w:r>
       <w:r>
-        <w:t>), uORB (</w:t>
+        <w:t>), uORB topics (</w:t>
       </w:r>
       <w:r>
         <w:rPr>
@@ -699,30 +284,27 @@
         <w:t>flight_phase_estimation</w:t>
       </w:r>
       <w:r>
-        <w:t xml:space="preserve">), hrt time. Test level: </w:t>
+        <w:t xml:space="preserve">), and high-resolution time, which is exactly what the GTest functional level exists for; notably, no upstream test links this library, so its baseline coverage was zero and authorship is clean. We deliberately excluded </w:t>
       </w:r>
       <w:r>
         <w:rPr>
-          <w:b/>
+          <w:rFonts w:ascii="Consolas" w:hAnsi="Consolas"/>
+          <w:sz w:val="20"/>
         </w:rPr>
-        <w:t>GTest functional</w:t>
+        <w:t>SlewRate</w:t>
       </w:r>
       <w:r>
-        <w:t xml:space="preserve"> (params/uORB support required). No upstream battery test exists — clean authorship.</w:t>
+        <w:t xml:space="preserve"> (branch-free math with nothing to decide), </w:t>
       </w:r>
-    </w:p>
-    <w:p>
-      <w:pPr>
-        <w:pStyle w:val="ListBullet"/>
-      </w:pPr>
       <w:r>
         <w:rPr>
-          <w:b/>
+          <w:rFonts w:ascii="Consolas" w:hAnsi="Consolas"/>
+          <w:sz w:val="20"/>
         </w:rPr>
-        <w:t>MC/DC decisions (Battery):</w:t>
+        <w:t>circuit_breaker</w:t>
       </w:r>
       <w:r>
-        <w:t xml:space="preserve"> L130 4-condition guard, L327–328 over-voltage fault (2-cond </w:t>
+        <w:t xml:space="preserve"> (a single superficial </w:t>
       </w:r>
       <w:r>
         <w:rPr>
@@ -732,79 +314,7 @@
         <w:t>&amp;&amp;</w:t>
       </w:r>
       <w:r>
-        <w:t xml:space="preserve">), L370–371 filter-reset (3-cond </w:t>
-      </w:r>
-      <w:r>
-        <w:rPr>
-          <w:rFonts w:ascii="Consolas" w:hAnsi="Consolas"/>
-          <w:sz w:val="20"/>
-        </w:rPr>
-        <w:t>||</w:t>
-      </w:r>
-      <w:r>
-        <w:t xml:space="preserve">), L375 armed-update guard (2-cond </w:t>
-      </w:r>
-      <w:r>
-        <w:rPr>
-          <w:rFonts w:ascii="Consolas" w:hAnsi="Consolas"/>
-          <w:sz w:val="20"/>
-        </w:rPr>
-        <w:t>&amp;&amp;</w:t>
-      </w:r>
-      <w:r>
-        <w:t>), L377–378 FW level-flight gate (3-cond mix). Criticality: wrong warning/fault → missed or spurious low-battery failsafe (loss of vehicle).</w:t>
-      </w:r>
-    </w:p>
-    <w:p>
-      <w:pPr>
-        <w:pStyle w:val="ListBullet"/>
-      </w:pPr>
-      <w:r>
-        <w:rPr>
-          <w:b/>
-        </w:rPr>
-        <w:t>Explicitly excluded:</w:t>
-      </w:r>
-      <w:r>
-        <w:t xml:space="preserve"> </w:t>
-      </w:r>
-      <w:r>
-        <w:rPr>
-          <w:rFonts w:ascii="Consolas" w:hAnsi="Consolas"/>
-          <w:sz w:val="20"/>
-        </w:rPr>
-        <w:t>SlewRate</w:t>
-      </w:r>
-      <w:r>
-        <w:t xml:space="preserve"> (branch-free math — trivial), </w:t>
-      </w:r>
-      <w:r>
-        <w:rPr>
-          <w:rFonts w:ascii="Consolas" w:hAnsi="Consolas"/>
-          <w:sz w:val="20"/>
-        </w:rPr>
-        <w:t>circuit_breaker</w:t>
-      </w:r>
-      <w:r>
-        <w:t xml:space="preserve"> (single-</w:t>
-      </w:r>
-      <w:r>
-        <w:rPr>
-          <w:rFonts w:ascii="Consolas" w:hAnsi="Consolas"/>
-          <w:sz w:val="20"/>
-        </w:rPr>
-        <w:t>&amp;&amp;</w:t>
-      </w:r>
-      <w:r>
-        <w:t xml:space="preserve"> wrapper — superficial per brief), GUI/presentation, generated, test-only code.</w:t>
-      </w:r>
-    </w:p>
-    <w:p>
-      <w:pPr>
-        <w:pStyle w:val="ListBullet"/>
-      </w:pPr>
-      <w:r>
-        <w:t>Dependencies &amp; controllability: hysteresis/PID via direct API + synthetic timestamps; Battery via param handles (functional harness), synthetic voltage/current/temperature + timestamps, uORB subs for remaining-time paths.</w:t>
+        <w:t xml:space="preserve"> wrapper the brief rejects as a target), and all GUI, generated, and test-only code, while refusing to exclude difficult business logic to flatter the percentage.</w:t>
       </w:r>
     </w:p>
     <w:p>
@@ -812,15 +322,15 @@
         <w:pStyle w:val="Heading2"/>
       </w:pPr>
       <w:r>
-        <w:t>4. Structural test derivation [Part 2 — 30 marks]</w:t>
+        <w:rPr>
+          <w:color w:val="1F4E79"/>
+        </w:rPr>
+        <w:t>4. Structural test derivation</w:t>
       </w:r>
     </w:p>
     <w:p>
-      <w:pPr>
-        <w:pStyle w:val="ListBullet"/>
-      </w:pPr>
       <w:r>
-        <w:t xml:space="preserve">Statement obligations → tests: Hysteresis H-D1..H-D8 via 11 </w:t>
+        <w:t xml:space="preserve">Statement obligations were discharged by 61 student tests: 11 </w:t>
       </w:r>
       <w:r>
         <w:rPr>
@@ -830,7 +340,7 @@
         <w:t>HysteresisStructural</w:t>
       </w:r>
       <w:r>
-        <w:t xml:space="preserve"> tests (incl. exact-</w:t>
+        <w:t xml:space="preserve"> unit tests covering decisions H-D1 through H-D8, including exact </w:t>
       </w:r>
       <w:r>
         <w:rPr>
@@ -840,7 +350,7 @@
         <w:t>&gt;=</w:t>
       </w:r>
       <w:r>
-        <w:t xml:space="preserve">-expiry boundaries upstream never probes); Battery B-D1..B-D12 via 33 </w:t>
+        <w:t xml:space="preserve">-expiry boundaries the upstream suite never probes; 33 </w:t>
       </w:r>
       <w:r>
         <w:rPr>
@@ -850,7 +360,7 @@
         <w:t>BatteryStructural</w:t>
       </w:r>
       <w:r>
-        <w:t xml:space="preserve"> functional tests (warning ladder, spike fault, RLS gate, SoC fusion, dt clamp, scale fallback, publish paths, remaining-time gates, index&lt;1 clamp, armed+NaN hold, FW second-copy hold, unadvertised-topic robustness); PID P-D1..P-D3 (+ saturation edges) via 17 </w:t>
+        <w:t xml:space="preserve"> functional tests covering B-D1 through B-D12 across the warning ladder, spike-fault detection, the RLS-reset gate, state-of-charge fusion, the discharge time-delta clamp, scale fallback, publish paths, and the armed and fixed-wing remaining-time gates; and 17 </w:t>
       </w:r>
       <w:r>
         <w:rPr>
@@ -860,81 +370,17 @@
         <w:t>PIDStructural</w:t>
       </w:r>
       <w:r>
-        <w:t xml:space="preserve"> tests (update-integral flag, saturation/clamp pairs, NaN/−Inf guards, derivative-guard MC/DC quad, FLT_EPSILON boundary, negative-dt, windup clamp, limit edges, zero-gain degenerate). Full per-test mapping: workbook Sheet 1 (61 rows: HST-01..11, BST-01..33, PST-01..17).</w:t>
-      </w:r>
-    </w:p>
-    <w:p>
-      <w:pPr>
-        <w:pStyle w:val="ListBullet"/>
-      </w:pPr>
-      <w:r>
-        <w:t>Decision/branch obligations → tests: both outcomes of every reachable decision demonstrated; MC/DC independence pairs in §5 + workbook Sheet 2 (32 rows).</w:t>
-      </w:r>
-    </w:p>
-    <w:p>
-      <w:pPr>
-        <w:pStyle w:val="ListBullet"/>
-      </w:pPr>
-      <w:r>
-        <w:t>Edge/boundary/invalid/error/state-transition cases: timestamp-exactness, repeat-request stamp keeping, asymmetric windows (Hysteresis); NaN/Inf/degenerate-dt/saturation limits (PID); threshold-exactness, 1.05-boundary, stale-phase, unconnected, zero-cell (Battery).</w:t>
-      </w:r>
-    </w:p>
-    <w:p>
-      <w:pPr>
-        <w:pStyle w:val="ListBullet"/>
-      </w:pPr>
-      <w:r>
-        <w:t xml:space="preserve">Execution: upstream </w:t>
+        <w:t xml:space="preserve"> tests covering P-D1 through P-D3 plus saturation edges, from the update-integral flag through NaN and negative-infinity guards, the derivative-guard quad, the exact </w:t>
       </w:r>
       <w:r>
         <w:rPr>
           <w:rFonts w:ascii="Consolas" w:hAnsi="Consolas"/>
           <w:sz w:val="20"/>
         </w:rPr>
-        <w:t>unit-Hysteresis</w:t>
+        <w:t>FLT_EPSILON</w:t>
       </w:r>
       <w:r>
-        <w:t xml:space="preserve"> 7/7, </w:t>
-      </w:r>
-      <w:r>
-        <w:rPr>
-          <w:rFonts w:ascii="Consolas" w:hAnsi="Consolas"/>
-          <w:sz w:val="20"/>
-        </w:rPr>
-        <w:t>unit-PID</w:t>
-      </w:r>
-      <w:r>
-        <w:t xml:space="preserve"> 4/4 (baseline logs); student </w:t>
-      </w:r>
-      <w:r>
-        <w:rPr>
-          <w:rFonts w:ascii="Consolas" w:hAnsi="Consolas"/>
-          <w:sz w:val="20"/>
-        </w:rPr>
-        <w:t>unit-HysteresisStructural</w:t>
-      </w:r>
-      <w:r>
-        <w:t xml:space="preserve"> 11/11, </w:t>
-      </w:r>
-      <w:r>
-        <w:rPr>
-          <w:rFonts w:ascii="Consolas" w:hAnsi="Consolas"/>
-          <w:sz w:val="20"/>
-        </w:rPr>
-        <w:t>unit-PIDStructural</w:t>
-      </w:r>
-      <w:r>
-        <w:t xml:space="preserve"> 17/17, </w:t>
-      </w:r>
-      <w:r>
-        <w:rPr>
-          <w:rFonts w:ascii="Consolas" w:hAnsi="Consolas"/>
-          <w:sz w:val="20"/>
-        </w:rPr>
-        <w:t>functional-BatteryStructural</w:t>
-      </w:r>
-      <w:r>
-        <w:t xml:space="preserve"> 33/33 (logs in </w:t>
+        <w:t xml:space="preserve"> boundary, negative-dt robustness, windup clamping, output-limit edges, and a zero-gain degenerate configuration. Every test maps to its obligations in workbook Sheet 1 (61 rows: HST-01–11, BST-01–33, PST-01–17), and both outcomes of every reachable decision are demonstrated, with MC/DC independence pairs in §5 and workbook Sheet 2 (32 rows). Edge, boundary, invalid, error, and state-transition cases follow the source wherever it implies them: timestamp exactness and repeat-request stamp keeping in hysteresis; NaN, infinity, degenerate-dt, and saturation limits in PID; threshold exactness, the 1.05 over-voltage boundary, stale-phase handling, unconnected and zero-cell states in Battery. Execution is fully green: upstream 7/7 and 4/4 at baseline, and student suites 11/11, 17/17, and 33/33, with logs in </w:t>
       </w:r>
       <w:r>
         <w:rPr>
@@ -944,25 +390,7 @@
         <w:t>evidence/logs/</w:t>
       </w:r>
       <w:r>
-        <w:t>). No manufactured failures; 8 student-test failures investigated in total → all test-side expectation errors (L130 gate timing, NaN output value, D-term sign, saturation freeze assumption), corrected without touching production code.</w:t>
-      </w:r>
-    </w:p>
-    <w:p>
-      <w:pPr>
-        <w:pStyle w:val="ListBullet"/>
-      </w:pPr>
-      <w:r>
-        <w:t xml:space="preserve">PID authorship: </w:t>
-      </w:r>
-      <w:r>
-        <w:rPr>
-          <w:rFonts w:ascii="Consolas" w:hAnsi="Consolas"/>
-          <w:sz w:val="20"/>
-        </w:rPr>
-        <w:t>PIDStructuralTest.cpp</w:t>
-      </w:r>
-      <w:r>
-        <w:t xml:space="preserve"> authored by Ashar Ahmed (24i3072) from his own derivation (branch </w:t>
+        <w:t xml:space="preserve">. No failure was manufactured; eight development-time failures were investigated and all traced to wrong test-side expectations (L130 gate timing twice, a NaN output value, two D-term signs, and three saturation-freeze assumptions), corrected without touching production code. The PID file deserves an authorship note: it was authored by Ashar Ahmed from his own derivation (branch </w:t>
       </w:r>
       <w:r>
         <w:rPr>
@@ -972,17 +400,7 @@
         <w:t>ashar-pid-work</w:t>
       </w:r>
       <w:r>
-        <w:t xml:space="preserve">, </w:t>
-      </w:r>
-      <w:r>
-        <w:rPr>
-          <w:rFonts w:ascii="Consolas" w:hAnsi="Consolas"/>
-          <w:sz w:val="20"/>
-        </w:rPr>
-        <w:t>ASHAR_HANDOFF.md</w:t>
-      </w:r>
-      <w:r>
-        <w:t>); lead-verified on Linux — 5 expectations corrected against v1.17.0 source during verification (D-term PLUS sign, PID.cpp L47: 2 tests; no conditional-integration freeze gate, L57-64: 3 tests + header/comments), final 17/17 PASS. The corrections are documented in-test and in Ashar's handoff; the earlier lead fallback is fully superseded.</w:t>
+        <w:t xml:space="preserve"> with a living handoff document) and verified on Linux by the lead, who corrected five expectations against the v1.17.0 source — the D-term sign is PLUS (PID.cpp line 47), and no conditional-integration freeze gate exists (lines 57–64) — reaching a final 17/17 pass, with the original delivery preserved for provenance.</w:t>
       </w:r>
     </w:p>
     <w:p>
@@ -990,69 +408,15 @@
         <w:pStyle w:val="Heading2"/>
       </w:pPr>
       <w:r>
-        <w:t>5. MC/DC analysis — critical component [Part 2, focused]</w:t>
+        <w:rPr>
+          <w:color w:val="1F4E79"/>
+        </w:rPr>
+        <w:t>5. MC/DC analysis of the critical component</w:t>
       </w:r>
     </w:p>
     <w:p>
-      <w:pPr>
-        <w:pStyle w:val="ListBullet"/>
-      </w:pPr>
       <w:r>
-        <w:rPr>
-          <w:b/>
-        </w:rPr>
-        <w:t>Selected component:</w:t>
-      </w:r>
-      <w:r>
-        <w:t xml:space="preserve"> </w:t>
-      </w:r>
-      <w:r>
-        <w:rPr>
-          <w:rFonts w:ascii="Consolas" w:hAnsi="Consolas"/>
-          <w:sz w:val="20"/>
-        </w:rPr>
-        <w:t>Battery</w:t>
-      </w:r>
-      <w:r>
-        <w:t xml:space="preserve"> (</w:t>
-      </w:r>
-      <w:r>
-        <w:rPr>
-          <w:rFonts w:ascii="Consolas" w:hAnsi="Consolas"/>
-          <w:sz w:val="20"/>
-        </w:rPr>
-        <w:t>src/lib/battery/battery.cpp</w:t>
-      </w:r>
-      <w:r>
-        <w:t>, GTest functional level)</w:t>
-      </w:r>
-    </w:p>
-    <w:p>
-      <w:pPr>
-        <w:pStyle w:val="ListBullet"/>
-      </w:pPr>
-      <w:r>
-        <w:rPr>
-          <w:b/>
-        </w:rPr>
-        <w:t>Why critical (safety/mission/control argument):</w:t>
-      </w:r>
-      <w:r>
-        <w:t xml:space="preserve"> battery warning/fault outputs feed the failsafe logic (RTL/land on low battery); a missed EMERGENCY warning risks loss of vehicle, a spurious one aborts the mission.</w:t>
-      </w:r>
-    </w:p>
-    <w:p>
-      <w:pPr>
-        <w:pStyle w:val="ListBullet"/>
-      </w:pPr>
-      <w:r>
-        <w:rPr>
-          <w:b/>
-        </w:rPr>
-        <w:t>Critical behaviour defined:</w:t>
-      </w:r>
-      <w:r>
-        <w:t xml:space="preserve"> warning-ladder + spike-fault classification and the guards that arm them (</w:t>
+        <w:t xml:space="preserve">Battery was selected as the MC/DC component because its warning and fault classification directly drives failsafe behavior: a missed EMERGENCY warning risks loss of the vehicle, while a spurious one aborts the mission. The critical behavior under analysis is the warning-ladder and spike-fault classification together with the guards that arm them — the </w:t>
       </w:r>
       <w:r>
         <w:rPr>
@@ -1082,109 +446,7 @@
         <w:t>determineFaults</w:t>
       </w:r>
       <w:r>
-        <w:t>, remaining-time reset/update gates).</w:t>
-      </w:r>
-    </w:p>
-    <w:p>
-      <w:pPr>
-        <w:pStyle w:val="ListBullet"/>
-      </w:pPr>
-      <w:r>
-        <w:rPr>
-          <w:b/>
-        </w:rPr>
-        <w:t>Applicable non-trivial compound decisions:</w:t>
-      </w:r>
-      <w:r>
-        <w:t xml:space="preserve"> L130 (4-cond), L327–328 (2-cond), L370–371 (3-cond), L375 (2-cond), L377–378 (3-cond). Trivial/logging/wrapper decisions elsewhere excluded with reason at derivation time.</w:t>
-      </w:r>
-    </w:p>
-    <w:p>
-      <w:pPr>
-        <w:pStyle w:val="ListBullet"/>
-      </w:pPr>
-      <w:r>
-        <w:rPr>
-          <w:b/>
-        </w:rPr>
-        <w:t>Per-decision analysis:</w:t>
-      </w:r>
-      <w:r>
-        <w:t xml:space="preserve"> workbook Sheet 2 (32 rows) records, per applicable decision, the atomic-condition values, overall outcome, independence pair, demonstrated condition, and source/test reference. H-D5/H-D7: 2-condition direction guards shown via armed-vs-quiescent and fired-vs-held pairs at exact </w:t>
-      </w:r>
-      <w:r>
-        <w:rPr>
-          <w:rFonts w:ascii="Consolas" w:hAnsi="Consolas"/>
-          <w:sz w:val="20"/>
-        </w:rPr>
-        <w:t>&gt;=</w:t>
-      </w:r>
-      <w:r>
-        <w:t xml:space="preserve"> boundaries. B-D4: 4-condition RLS-reset gate — each condition flipped while the other three hold (unconnected / pre-vs-post-init / IR-flag-cleared / zero-cell), observable </w:t>
-      </w:r>
-      <w:r>
-        <w:rPr>
-          <w:rFonts w:ascii="Consolas" w:hAnsi="Consolas"/>
-          <w:sz w:val="20"/>
-        </w:rPr>
-        <w:t>ocv_estimate_filtered</w:t>
-      </w:r>
-      <w:r>
-        <w:t xml:space="preserve"> 16.0 vs 0.0 with I=0. B-D8: spike-fault pair incl. exact 1.05-boundary (strict </w:t>
-      </w:r>
-      <w:r>
-        <w:rPr>
-          <w:rFonts w:ascii="Consolas" w:hAnsi="Consolas"/>
-          <w:sz w:val="20"/>
-        </w:rPr>
-        <w:t>&gt;</w:t>
-      </w:r>
-      <w:r>
-        <w:t xml:space="preserve">). B-D9: reset-vs-hold pairs for near-zero state and consumed FW transition (moved reset target 5.0→7.0 discriminates). B-D10: armed-vs-unarmed and finite-vs-NaN-current pairs. B-D11: multirotor-vs-FW, fresh-vs-stale stamp, LEVEL-vs-CLIMB pairs. P-D3: derivative-guard MC/DC quad (dt×history) plus exact </w:t>
-      </w:r>
-      <w:r>
-        <w:rPr>
-          <w:rFonts w:ascii="Consolas" w:hAnsi="Consolas"/>
-          <w:sz w:val="20"/>
-        </w:rPr>
-        <w:t>FLT_EPSILON</w:t>
-      </w:r>
-      <w:r>
-        <w:t xml:space="preserve"> boundary. Short-circuit/state/param setup is explicit in test bodies (synthetic timestamps, direct </w:t>
-      </w:r>
-      <w:r>
-        <w:rPr>
-          <w:rFonts w:ascii="Consolas" w:hAnsi="Consolas"/>
-          <w:sz w:val="20"/>
-        </w:rPr>
-        <w:t>_params</w:t>
-      </w:r>
-      <w:r>
-        <w:t xml:space="preserve"> control, fixture-held uORB publications so </w:t>
-      </w:r>
-      <w:r>
-        <w:rPr>
-          <w:rFonts w:ascii="Consolas" w:hAnsi="Consolas"/>
-          <w:sz w:val="20"/>
-        </w:rPr>
-        <w:t>Subscription::copy()</w:t>
-      </w:r>
-      <w:r>
-        <w:t xml:space="preserve"> succeeds).</w:t>
-      </w:r>
-    </w:p>
-    <w:p>
-      <w:pPr>
-        <w:pStyle w:val="ListBullet"/>
-      </w:pPr>
-      <w:r>
-        <w:rPr>
-          <w:b/>
-        </w:rPr>
-        <w:t>Interpretation:</w:t>
-      </w:r>
-      <w:r>
-        <w:t xml:space="preserve"> the pairs prove each atomic condition can independently flip its decision's outcome on the real code path that arms warnings, faults, and remaining-time updates — i.e. no condition is dead or masked in the failsafe-critical classification logic, except the two investigated unreachable cases (§7) which are unreachable by construction, not by weak tests.</w:t>
+        <w:t>, and the remaining-time reset and update gates. Five non-trivial compound decisions implement or directly govern this behavior and were analyzed: the four-condition RLS-reset gate at line 130, the two-condition over-voltage fault at lines 327–328, the three-condition filter-reset disjunction at lines 370–371, the two-condition armed-update guard at line 375, and the three-way fixed-wing level-flight gate at lines 377–378. Trivial logging, wrapper, and routing decisions elsewhere were excluded with reasons recorded at derivation time. Workbook Sheet 2 carries the full per-decision evidence — atomic-condition values, overall outcome, independence pair, demonstrated condition, and source/test reference — thirty-two rows in total. The hysteresis direction guards are shown through armed-versus-quiescent and fired-versus-held pairs at exact expiry boundaries; the four-condition reset gate is shown by flipping each condition while the other three hold (unconnected, pre- versus post-initialization, cleared resistance flag, zero cells), observed as an open-circuit-voltage estimate of 16.0 versus 0.0 with zero current; the spike fault is shown including the exact 1.05 boundary that proves the comparison is strict; the filter reset is shown through near-zero-state and consumed-transition pairs, where a moved reset target (5.0 to 7.0) discriminates a genuine hold from a re-reset; the armed guard is shown through unarmed-versus-armed and finite-versus-NaN-current pairs; the fixed-wing gate is shown through multirotor-versus-fixed-wing, fresh-versus-stale stamp, and level-versus-climb pairs; and the PID derivative guard is shown through its time-by-history quad with the exact epsilon boundary. All short-circuit, state, parameter, and message setup needed to reach each condition is explicit in the test bodies — synthetic timestamps, direct parameter control, and fixture-held uORB publications so subscriptions actually receive data. The honest reading of these pairs is that every atomic condition can independently flip its decision's outcome on the real code path that arms warnings, faults, and remaining-time updates, so no condition in this failsafe-critical classification logic is dead or masked — except for two cases investigated in §7 that are unreachable by construction rather than by weak testing.</w:t>
       </w:r>
     </w:p>
     <w:p>
@@ -1192,15 +454,15 @@
         <w:pStyle w:val="Heading2"/>
       </w:pPr>
       <w:r>
-        <w:t>6. Test implementation and execution [Part 3A — 15 marks]</w:t>
+        <w:rPr>
+          <w:color w:val="1F4E79"/>
+        </w:rPr>
+        <w:t>6. Test implementation and execution</w:t>
       </w:r>
     </w:p>
     <w:p>
-      <w:pPr>
-        <w:pStyle w:val="ListBullet"/>
-      </w:pPr>
       <w:r>
-        <w:t xml:space="preserve">Mechanisms used: </w:t>
+        <w:t xml:space="preserve">Hysteresis and PID tests use </w:t>
       </w:r>
       <w:r>
         <w:rPr>
@@ -1210,47 +472,7 @@
         <w:t>px4_add_unit_gtest</w:t>
       </w:r>
       <w:r>
-        <w:t xml:space="preserve"> for </w:t>
-      </w:r>
-      <w:r>
-        <w:rPr>
-          <w:rFonts w:ascii="Consolas" w:hAnsi="Consolas"/>
-          <w:sz w:val="20"/>
-        </w:rPr>
-        <w:t>HysteresisStructural</w:t>
-      </w:r>
-      <w:r>
-        <w:t xml:space="preserve"> (LINKLIBS </w:t>
-      </w:r>
-      <w:r>
-        <w:rPr>
-          <w:rFonts w:ascii="Consolas" w:hAnsi="Consolas"/>
-          <w:sz w:val="20"/>
-        </w:rPr>
-        <w:t>hysteresis</w:t>
-      </w:r>
-      <w:r>
-        <w:t xml:space="preserve">) and </w:t>
-      </w:r>
-      <w:r>
-        <w:rPr>
-          <w:rFonts w:ascii="Consolas" w:hAnsi="Consolas"/>
-          <w:sz w:val="20"/>
-        </w:rPr>
-        <w:t>PIDStructural</w:t>
-      </w:r>
-      <w:r>
-        <w:t xml:space="preserve"> (LINKLIBS </w:t>
-      </w:r>
-      <w:r>
-        <w:rPr>
-          <w:rFonts w:ascii="Consolas" w:hAnsi="Consolas"/>
-          <w:sz w:val="20"/>
-        </w:rPr>
-        <w:t>PID</w:t>
-      </w:r>
-      <w:r>
-        <w:t xml:space="preserve">); </w:t>
+        <w:t xml:space="preserve">, linking only their libraries, while the Battery suite uses </w:t>
       </w:r>
       <w:r>
         <w:rPr>
@@ -1260,181 +482,7 @@
         <w:t>px4_add_functional_gtest</w:t>
       </w:r>
       <w:r>
-        <w:t xml:space="preserve"> for </w:t>
-      </w:r>
-      <w:r>
-        <w:rPr>
-          <w:rFonts w:ascii="Consolas" w:hAnsi="Consolas"/>
-          <w:sz w:val="20"/>
-        </w:rPr>
-        <w:t>BatteryStructural</w:t>
-      </w:r>
-      <w:r>
-        <w:t xml:space="preserve"> (LINKLIBS </w:t>
-      </w:r>
-      <w:r>
-        <w:rPr>
-          <w:rFonts w:ascii="Consolas" w:hAnsi="Consolas"/>
-          <w:sz w:val="20"/>
-        </w:rPr>
-        <w:t>battery</w:t>
-      </w:r>
-      <w:r>
-        <w:t xml:space="preserve">, plus the standard functional link set: </w:t>
-      </w:r>
-      <w:r>
-        <w:rPr>
-          <w:rFonts w:ascii="Consolas" w:hAnsi="Consolas"/>
-          <w:sz w:val="20"/>
-        </w:rPr>
-        <w:t>gtest_functional_main</w:t>
-      </w:r>
-      <w:r>
-        <w:t xml:space="preserve">, px4_layer/uORB/params). Upstream </w:t>
-      </w:r>
-      <w:r>
-        <w:rPr>
-          <w:rFonts w:ascii="Consolas" w:hAnsi="Consolas"/>
-          <w:sz w:val="20"/>
-        </w:rPr>
-        <w:t>HysteresisTest</w:t>
-      </w:r>
-      <w:r>
-        <w:t>/</w:t>
-      </w:r>
-      <w:r>
-        <w:rPr>
-          <w:rFonts w:ascii="Consolas" w:hAnsi="Consolas"/>
-          <w:sz w:val="20"/>
-        </w:rPr>
-        <w:t>PIDTest</w:t>
-      </w:r>
-      <w:r>
-        <w:t xml:space="preserve"> registrations untouched; there was no upstream battery test to disturb.</w:t>
-      </w:r>
-    </w:p>
-    <w:p>
-      <w:pPr>
-        <w:pStyle w:val="ListBullet"/>
-      </w:pPr>
-      <w:r>
-        <w:t>Setup–run–check discipline + determinism controls: every test constructs a fresh object per case (no inter-test state); Hysteresis/PID drive the API directly with fixed synthetic timestamps (</w:t>
-      </w:r>
-      <w:r>
-        <w:rPr>
-          <w:rFonts w:ascii="Consolas" w:hAnsi="Consolas"/>
-          <w:sz w:val="20"/>
-        </w:rPr>
-        <w:t>T0</w:t>
-      </w:r>
-      <w:r>
-        <w:t xml:space="preserve">, exact </w:t>
-      </w:r>
-      <w:r>
-        <w:rPr>
-          <w:rFonts w:ascii="Consolas" w:hAnsi="Consolas"/>
-          <w:sz w:val="20"/>
-        </w:rPr>
-        <w:t>±1µs</w:t>
-      </w:r>
-      <w:r>
-        <w:t xml:space="preserve"> boundaries); Battery uses a </w:t>
-      </w:r>
-      <w:r>
-        <w:rPr>
-          <w:rFonts w:ascii="Consolas" w:hAnsi="Consolas"/>
-          <w:sz w:val="20"/>
-        </w:rPr>
-        <w:t>TestBattery</w:t>
-      </w:r>
-      <w:r>
-        <w:t xml:space="preserve"> subclass exposing protected </w:t>
-      </w:r>
-      <w:r>
-        <w:rPr>
-          <w:rFonts w:ascii="Consolas" w:hAnsi="Consolas"/>
-          <w:sz w:val="20"/>
-        </w:rPr>
-        <w:t>_params</w:t>
-      </w:r>
-      <w:r>
-        <w:t xml:space="preserve"> plus a </w:t>
-      </w:r>
-      <w:r>
-        <w:rPr>
-          <w:rFonts w:ascii="Consolas" w:hAnsi="Consolas"/>
-          <w:sz w:val="20"/>
-        </w:rPr>
-        <w:t>TestBatteryIndexed</w:t>
-      </w:r>
-      <w:r>
-        <w:t xml:space="preserve"> ctor variant, deterministic thresholds, and fixture-held uORB publications (a helper-local </w:t>
-      </w:r>
-      <w:r>
-        <w:rPr>
-          <w:rFonts w:ascii="Consolas" w:hAnsi="Consolas"/>
-          <w:sz w:val="20"/>
-        </w:rPr>
-        <w:t>Publication</w:t>
-      </w:r>
-      <w:r>
-        <w:t xml:space="preserve"> was found to unadvertise on destruction and break </w:t>
-      </w:r>
-      <w:r>
-        <w:rPr>
-          <w:rFonts w:ascii="Consolas" w:hAnsi="Consolas"/>
-          <w:sz w:val="20"/>
-        </w:rPr>
-        <w:t>Subscription::copy()</w:t>
-      </w:r>
-      <w:r>
-        <w:t xml:space="preserve"> — fixed by holding pubs in the fixture). No sleeps, no randomness, no ordering dependence.</w:t>
-      </w:r>
-    </w:p>
-    <w:p>
-      <w:pPr>
-        <w:pStyle w:val="ListBullet"/>
-      </w:pPr>
-      <w:r>
-        <w:t xml:space="preserve">CMake/registration changes included in patch: </w:t>
-      </w:r>
-      <w:r>
-        <w:rPr>
-          <w:rFonts w:ascii="Consolas" w:hAnsi="Consolas"/>
-          <w:sz w:val="20"/>
-        </w:rPr>
-        <w:t>src/lib/hysteresis/CMakeLists.txt</w:t>
-      </w:r>
-      <w:r>
-        <w:t xml:space="preserve"> (+1 line), </w:t>
-      </w:r>
-      <w:r>
-        <w:rPr>
-          <w:rFonts w:ascii="Consolas" w:hAnsi="Consolas"/>
-          <w:sz w:val="20"/>
-        </w:rPr>
-        <w:t>src/lib/pid/CMakeLists.txt</w:t>
-      </w:r>
-      <w:r>
-        <w:t xml:space="preserve"> (+1 line), </w:t>
-      </w:r>
-      <w:r>
-        <w:rPr>
-          <w:rFonts w:ascii="Consolas" w:hAnsi="Consolas"/>
-          <w:sz w:val="20"/>
-        </w:rPr>
-        <w:t>src/lib/battery/CMakeLists.txt</w:t>
-      </w:r>
-      <w:r>
-        <w:t xml:space="preserve"> (+2 lines). Zero production-code changes — the diff touches only test registrations plus 3 new test files (1140 insertions, 0 deletions in production logic).</w:t>
-      </w:r>
-    </w:p>
-    <w:p>
-      <w:pPr>
-        <w:pStyle w:val="ListBullet"/>
-      </w:pPr>
-      <w:r>
-        <w:t xml:space="preserve">Authorship proof: </w:t>
+        <w:t xml:space="preserve">, which additionally links the functional main, the PX4 layers, uORB, and parameters. Upstream test registrations were left untouched, and there was no upstream battery test to disturb. Every test follows setup–run–check discipline with a freshly constructed object per case, so there is no inter-test state and no ordering dependence: hysteresis and PID drive the public API directly with fixed synthetic timestamps (including exact plus-or-minus-one-microsecond boundaries), while Battery uses a test subclass exposing protected parameters, deterministic thresholds, and fixture-held uORB publications — a design forced by a real discovery that helper-local publications unadvertise on destruction and silently break subscriptions. CMake and registration changes in the patch are three added lines across the hysteresis, PID, and battery build files (plus two lines for the functional registration). Authorship is proven by </w:t>
       </w:r>
       <w:r>
         <w:rPr>
@@ -1444,95 +492,17 @@
         <w:t>patch/full_reconstruction.patch</w:t>
       </w:r>
       <w:r>
-        <w:t xml:space="preserve"> (</w:t>
+        <w:t xml:space="preserve">, a clean </w:t>
       </w:r>
       <w:r>
         <w:rPr>
           <w:rFonts w:ascii="Consolas" w:hAnsi="Consolas"/>
           <w:sz w:val="20"/>
         </w:rPr>
-        <w:t>git diff HEAD</w:t>
+        <w:t>git diff</w:t>
       </w:r>
       <w:r>
-        <w:t>, 1140 insertions across 6 files) reconstructs the submission against v1.17.0; upstream tests were read/run for conventions and baseline only.</w:t>
-      </w:r>
-    </w:p>
-    <w:p>
-      <w:pPr>
-        <w:pStyle w:val="ListBullet"/>
-      </w:pPr>
-      <w:r>
-        <w:t xml:space="preserve">Execution evidence: </w:t>
-      </w:r>
-      <w:r>
-        <w:rPr>
-          <w:rFonts w:ascii="Consolas" w:hAnsi="Consolas"/>
-          <w:sz w:val="20"/>
-        </w:rPr>
-        <w:t>evidence/baseline/unit-{Hysteresis,PID}_run.log</w:t>
-      </w:r>
-      <w:r>
-        <w:t xml:space="preserve"> (7/7, 4/4); </w:t>
-      </w:r>
-      <w:r>
-        <w:rPr>
-          <w:rFonts w:ascii="Consolas" w:hAnsi="Consolas"/>
-          <w:sz w:val="20"/>
-        </w:rPr>
-        <w:t>evidence/logs/student_{HysteresisStructural,PIDStructural,BatteryStructural}_run.log</w:t>
-      </w:r>
-      <w:r>
-        <w:t xml:space="preserve"> (11/11, 17/17, 33/33). Binaries: </w:t>
-      </w:r>
-      <w:r>
-        <w:rPr>
-          <w:rFonts w:ascii="Consolas" w:hAnsi="Consolas"/>
-          <w:sz w:val="20"/>
-        </w:rPr>
-        <w:t>unit-HysteresisStructural</w:t>
-      </w:r>
-      <w:r>
-        <w:t xml:space="preserve">, </w:t>
-      </w:r>
-      <w:r>
-        <w:rPr>
-          <w:rFonts w:ascii="Consolas" w:hAnsi="Consolas"/>
-          <w:sz w:val="20"/>
-        </w:rPr>
-        <w:t>unit-PIDStructural</w:t>
-      </w:r>
-      <w:r>
-        <w:t xml:space="preserve">, </w:t>
-      </w:r>
-      <w:r>
-        <w:rPr>
-          <w:rFonts w:ascii="Consolas" w:hAnsi="Consolas"/>
-          <w:sz w:val="20"/>
-        </w:rPr>
-        <w:t>functional-BatteryStructural</w:t>
-      </w:r>
-      <w:r>
-        <w:t xml:space="preserve"> in both </w:t>
-      </w:r>
-      <w:r>
-        <w:rPr>
-          <w:rFonts w:ascii="Consolas" w:hAnsi="Consolas"/>
-          <w:sz w:val="20"/>
-        </w:rPr>
-        <w:t>build/px4_sitl_test</w:t>
-      </w:r>
-      <w:r>
-        <w:t xml:space="preserve"> and </w:t>
-      </w:r>
-      <w:r>
-        <w:rPr>
-          <w:rFonts w:ascii="Consolas" w:hAnsi="Consolas"/>
-          <w:sz w:val="20"/>
-        </w:rPr>
-        <w:t>build/px4_sitl_coverage</w:t>
-      </w:r>
-      <w:r>
-        <w:t>.</w:t>
+        <w:t xml:space="preserve"> against v1.17.0 containing 1,140 insertions across six files with zero production-line edits. Execution evidence is complete: baseline logs show upstream 7/7 and 4/4, student logs show 11/11, 17/17, and 33/33, and all five binaries build and run in both the normal and the instrumented coverage configurations from the documented commands.</w:t>
       </w:r>
     </w:p>
     <w:p>
@@ -1540,203 +510,15 @@
         <w:pStyle w:val="Heading2"/>
       </w:pPr>
       <w:r>
-        <w:t>7. Coverage measurement and gap analysis [Part 3B — 20 marks]</w:t>
+        <w:rPr>
+          <w:color w:val="1F4E79"/>
+        </w:rPr>
+        <w:t>7. Coverage measurement and gap analysis</w:t>
       </w:r>
     </w:p>
     <w:p>
-      <w:pPr>
-        <w:pStyle w:val="ListBullet"/>
-      </w:pPr>
       <w:r>
-        <w:t xml:space="preserve">Baseline vs final (per scoped item, </w:t>
-      </w:r>
-      <w:r>
-        <w:rPr>
-          <w:rFonts w:ascii="Consolas" w:hAnsi="Consolas"/>
-          <w:sz w:val="20"/>
-        </w:rPr>
-        <w:t>evidence/baseline/</w:t>
-      </w:r>
-      <w:r>
-        <w:t xml:space="preserve"> vs </w:t>
-      </w:r>
-      <w:r>
-        <w:rPr>
-          <w:rFonts w:ascii="Consolas" w:hAnsi="Consolas"/>
-          <w:sz w:val="20"/>
-        </w:rPr>
-        <w:t>evidence/final/</w:t>
-      </w:r>
-      <w:r>
-        <w:t xml:space="preserve">, lcov+gcov </w:t>
-      </w:r>
-      <w:r>
-        <w:rPr>
-          <w:rFonts w:ascii="Consolas" w:hAnsi="Consolas"/>
-          <w:sz w:val="20"/>
-        </w:rPr>
-        <w:t>--branch-coverage</w:t>
-      </w:r>
-      <w:r>
-        <w:t xml:space="preserve">, HTML in </w:t>
-      </w:r>
-      <w:r>
-        <w:rPr>
-          <w:rFonts w:ascii="Consolas" w:hAnsi="Consolas"/>
-          <w:sz w:val="20"/>
-        </w:rPr>
-        <w:t>final/html/</w:t>
-      </w:r>
-      <w:r>
-        <w:t>):</w:t>
-      </w:r>
-    </w:p>
-    <w:p>
-      <w:pPr>
-        <w:pStyle w:val="ListBullet"/>
-      </w:pPr>
-      <w:r>
-        <w:t>hysteresis.cpp: baseline 22/22 lines (upstream) → final 22/22 (100%), arcs 17/20 both runs — the 3 missing arcs are provably unreachable (L77/L83 operand combos contradicting the L75 entry guard; proven by inspection).</w:t>
-      </w:r>
-    </w:p>
-    <w:p>
-      <w:pPr>
-        <w:pStyle w:val="ListBullet"/>
-      </w:pPr>
-      <w:r>
-        <w:t xml:space="preserve">PID.cpp: baseline 22/22 → final 22/22 (100%), arcs 10/10 (100%) — the non-finite-integral guard and all four derivative-guard operand outcomes are exercised by Ashar's submitted </w:t>
-      </w:r>
-      <w:r>
-        <w:rPr>
-          <w:rFonts w:ascii="Consolas" w:hAnsi="Consolas"/>
-          <w:sz w:val="20"/>
-        </w:rPr>
-        <w:t>PIDStructural</w:t>
-      </w:r>
-      <w:r>
-        <w:t xml:space="preserve"> tests (PST-01..17).</w:t>
-      </w:r>
-    </w:p>
-    <w:p>
-      <w:pPr>
-        <w:pStyle w:val="ListBullet"/>
-      </w:pPr>
-      <w:r>
-        <w:t>battery.cpp: baseline ABSENT from coverage (0% — no upstream test links the library) → final 230/231 lines (99.6%), 19/19 functions, arcs 174/248. Sole line gap: L72 (</w:t>
-      </w:r>
-      <w:r>
-        <w:rPr>
-          <w:rFonts w:ascii="Consolas" w:hAnsi="Consolas"/>
-          <w:sz w:val="20"/>
-        </w:rPr>
-        <w:t>PARAM_INVALID</w:t>
-      </w:r>
-      <w:r>
-        <w:t xml:space="preserve"> error log), unreachable with intact v1.17.0 param metadata — defensive code requiring a corrupted param store.</w:t>
-      </w:r>
-    </w:p>
-    <w:p>
-      <w:pPr>
-        <w:pStyle w:val="ListBullet"/>
-      </w:pPr>
-      <w:r>
-        <w:t xml:space="preserve">Contribution of own suite: 11 </w:t>
-      </w:r>
-      <w:r>
-        <w:rPr>
-          <w:rFonts w:ascii="Consolas" w:hAnsi="Consolas"/>
-          <w:sz w:val="20"/>
-        </w:rPr>
-        <w:t>HysteresisStructural</w:t>
-      </w:r>
-      <w:r>
-        <w:t xml:space="preserve"> tests (MC/DC quads + exact-</w:t>
-      </w:r>
-      <w:r>
-        <w:rPr>
-          <w:rFonts w:ascii="Consolas" w:hAnsi="Consolas"/>
-          <w:sz w:val="20"/>
-        </w:rPr>
-        <w:t>&gt;=</w:t>
-      </w:r>
-      <w:r>
-        <w:t xml:space="preserve"> boundaries upstream never probes), 17 </w:t>
-      </w:r>
-      <w:r>
-        <w:rPr>
-          <w:rFonts w:ascii="Consolas" w:hAnsi="Consolas"/>
-          <w:sz w:val="20"/>
-        </w:rPr>
-        <w:t>PIDStructural</w:t>
-      </w:r>
-      <w:r>
-        <w:t xml:space="preserve"> tests (Ashar-authored, lead-verified; update flag, saturation/clamp pairs, NaN/−Inf guards, derivative-guard quad, </w:t>
-      </w:r>
-      <w:r>
-        <w:rPr>
-          <w:rFonts w:ascii="Consolas" w:hAnsi="Consolas"/>
-          <w:sz w:val="20"/>
-        </w:rPr>
-        <w:t>FLT_EPSILON</w:t>
-      </w:r>
-      <w:r>
-        <w:t xml:space="preserve">/negative-dt edges, windup/limit boundaries, zero-gain degenerate — closing the 2 sub-arcs upstream left open), and 33 </w:t>
-      </w:r>
-      <w:r>
-        <w:rPr>
-          <w:rFonts w:ascii="Consolas" w:hAnsi="Consolas"/>
-          <w:sz w:val="20"/>
-        </w:rPr>
-        <w:t>BatteryStructural</w:t>
-      </w:r>
-      <w:r>
-        <w:t xml:space="preserve"> functional tests (warning ladder, spike fault, RLS-gate MC/DC, SoC fusion, dt clamp, scale fallback, publish paths, uORB/armed/FW phase gates incl. a Publication-lifetime fix discovered during development, plus Taimoor-audit probes: index&lt;1 clamp, armed+NaN hold, FW second-copy hold, unadvertised-topic robustness).</w:t>
-      </w:r>
-    </w:p>
-    <w:p>
-      <w:pPr>
-        <w:pStyle w:val="ListBullet"/>
-      </w:pPr>
-      <w:r>
-        <w:t xml:space="preserve">Remaining gaps: L71/L72 </w:t>
-      </w:r>
-      <w:r>
-        <w:rPr>
-          <w:rFonts w:ascii="Consolas" w:hAnsi="Consolas"/>
-          <w:sz w:val="20"/>
-        </w:rPr>
-        <w:t>PARAM_INVALID</w:t>
-      </w:r>
-      <w:r>
-        <w:t xml:space="preserve"> defensive path (same corrupted-store requirement); hysteresis 3 unreachable arcs (above); B-D9 c1 </w:t>
-      </w:r>
-      <w:r>
-        <w:rPr>
-          <w:rFonts w:ascii="Consolas" w:hAnsi="Consolas"/>
-          <w:sz w:val="20"/>
-        </w:rPr>
-        <w:t>!finite(avg)</w:t>
-      </w:r>
-      <w:r>
-        <w:t xml:space="preserve"> unreachable via public API (the only average writer is itself guarded by B-D10's finite check — defense-in-depth subsumed downstream); L356 copy-false path not deterministically reachable (requires updated()=T with copy()=F, i.e. topic withdrawal mid-call — the unadvertised-topic test documents safe behavior instead). Branch totals include ~70 compiler-generated </w:t>
-      </w:r>
-      <w:r>
-        <w:rPr>
-          <w:rFonts w:ascii="Consolas" w:hAnsi="Consolas"/>
-          <w:sz w:val="20"/>
-        </w:rPr>
-        <w:t>e0</w:t>
-      </w:r>
-      <w:r>
-        <w:t xml:space="preserve"> exception/unwind arcs (matrix/filter/param templates) with no corresponding source decision — reported separately, never excluded. No gap is hand-waved: each names the exact line/arc, why it cannot fire locally, and what would be needed.</w:t>
-      </w:r>
-    </w:p>
-    <w:p>
-      <w:pPr>
-        <w:pStyle w:val="ListBullet"/>
-      </w:pPr>
-      <w:r>
-        <w:t>MC/DC completeness for applicable decisions: H-D5/H-D7, B-D4 (4 conditions), B-D8, B-D9 c2/c3, B-D10 (both conditions, c2 via BST-19 vs BST-31 armed+NaN pair), B-D11 (all conditions), P-D3 (dt×history quad) demonstrated with independence pairs in workbook Sheet 2; B-D9 c1 justified unreachable (above).</w:t>
+        <w:t>Coverage was captured before our tests (baseline) and after (final) with lcov and gcov branch coverage, and both machine-readable reports and full HTML are submitted. Hysteresis stands at 22 of 22 lines in both runs with 17 of 20 branch arcs; the three missing arcs are provably unreachable because the operand combinations contradict the line-75 entry guard, as proven by inspection. PID stands at 22 of 22 lines with all 10 of 10 arcs, closing the two non-finite-integral and derivative-guard sub-cases the upstream baseline left open at 8 of 10. Battery, absent from the baseline entirely since no upstream test links the library, reaches 230 of 231 lines (99.6%) with all 19 functions covered and 174 of 248 branch arcs. Our suite's contribution is therefore the entire battery coverage from a zero baseline, plus the hysteresis boundary and MC/DC obligations and the PID sub-arcs upstream never exercised. The remaining gaps are few and each is named precisely. The sole uncovered line is battery line 72, an error log for a missing parameter handle that cannot fire with intact v1.17.0 metadata and would require a corrupted parameter store. The hysteresis arcs above are unreachable by construction. The B-D9 non-finite-average arm is unreachable through the public API because its only writer is itself guarded by the B-D10 finiteness check — defense in depth subsumed downstream. The L356 copy-failure path is not deterministically reachable because it requires a topic withdrawal between the update check and the copy inside a single call; our unadvertised-topic test documents safe behavior there instead. Branch totals also include roughly seventy compiler-generated exception and unwind arcs from matrix, filter, and parameter templates that correspond to no source decision and cannot be driven from the public API; they are reported separately and never excluded. Nothing here is hand-waved, and difficult logic was never omitted to improve a percentage. On MC/DC completeness: every applicable decision — H-D5, H-D7, the four-condition B-D4, B-D8, B-D9's second and third conditions, all of B-D10 including the armed-plus-NaN pair, all of B-D11, and the P-D3 quad — is demonstrated with independence pairs, with only the unreachable B-D9 first condition justified rather than shown.</w:t>
       </w:r>
     </w:p>
     <w:p>
@@ -1744,237 +526,25 @@
         <w:pStyle w:val="Heading2"/>
       </w:pPr>
       <w:r>
-        <w:t>8. Findings and limitations [Part 4 — 15 marks]</w:t>
+        <w:rPr>
+          <w:color w:val="1F4E79"/>
+        </w:rPr>
+        <w:t>8. Findings, limitations, and improvements</w:t>
       </w:r>
     </w:p>
     <w:p>
-      <w:pPr>
-        <w:pStyle w:val="ListBullet"/>
-      </w:pPr>
       <w:r>
-        <w:t xml:space="preserve">FAIL/BLOCKED investigations: 8 student-test failures occurred during development, all investigated before any defect claim and all resolved as test-side expectation errors with production code untouched. (1) </w:t>
+        <w:t xml:space="preserve">Eight student-test failures occurred during development, and each was investigated before any defect claim — setup, expected values, and dependency behavior first — and each resolved as a wrong test-side expectation with production code untouched: two inverted models of the L130 reset gate's pre-init firing; one NaN output where IEEE semantics give NaN for infinite feedback while the integral guard itself held; two D-term sign errors against the PLUS in PID line 47; and three saturation expectations written against a freeze gate that does not exist in v1.17.0. No reproducible production defect was found, and none is manufactured to fill a quota — the suite is green because the covered logic met its specification on the exercised paths. Our conclusions stay limited to what was analyzed and executed. Residual risks are: only three of thousands of PX4 files are covered, so failsafe consumers, estimators, controllers, and drivers are outside the evidence; the L72 corrupted-parameter path is untested by construction; estimator convergence was shown only on synthetic steps, never on real noisy flight data; fixed-wing remaining-time paths used synthetic phase stamps rather than estimator output; and all timing is synthetic, so real-time scheduling effects are out of scope. Concretely, we recommend replaying long-horizon current and voltage traces through state-of-charge estimation, adding a scratch-store test for the corrupted-parameter path, covering the fixed-wing gate with estimator-produced phase data in simulation, and upstreaming this first-ever Battery functional test so its zero baseline never returns. An independent consistency audit by Taimoor Khalid (audit report, gap analysis with per-arc BRDA classification, packaging checklist in </w:t>
       </w:r>
       <w:r>
         <w:rPr>
           <w:rFonts w:ascii="Consolas" w:hAnsi="Consolas"/>
           <w:sz w:val="20"/>
         </w:rPr>
-        <w:t>RlsResetGateAllTrueResets</w:t>
+        <w:t>taimoor/</w:t>
       </w:r>
       <w:r>
-        <w:t xml:space="preserve"> + </w:t>
-      </w:r>
-      <w:r>
-        <w:rPr>
-          <w:rFonts w:ascii="Consolas" w:hAnsi="Consolas"/>
-          <w:sz w:val="20"/>
-        </w:rPr>
-        <w:t>...BlockedWhenAlreadyInitialized</w:t>
-      </w:r>
-      <w:r>
-        <w:t xml:space="preserve">: inverted model of the L130 gate — the gate fires only pre-init with the IR flag set, not post-init; corrected the base/pair design. (2) </w:t>
-      </w:r>
-      <w:r>
-        <w:rPr>
-          <w:rFonts w:ascii="Consolas" w:hAnsi="Consolas"/>
-          <w:sz w:val="20"/>
-        </w:rPr>
-        <w:t>NonFiniteIntegralGuarded</w:t>
-      </w:r>
-      <w:r>
-        <w:t xml:space="preserve">: expected output 0.0 for </w:t>
-      </w:r>
-      <w:r>
-        <w:rPr>
-          <w:rFonts w:ascii="Consolas" w:hAnsi="Consolas"/>
-          <w:sz w:val="20"/>
-        </w:rPr>
-        <w:t>+Inf</w:t>
-      </w:r>
-      <w:r>
-        <w:t xml:space="preserve"> feedback, actual NaN — </w:t>
-      </w:r>
-      <w:r>
-        <w:rPr>
-          <w:rFonts w:ascii="Consolas" w:hAnsi="Consolas"/>
-          <w:sz w:val="20"/>
-        </w:rPr>
-        <w:t>P*(-Inf)</w:t>
-      </w:r>
-      <w:r>
-        <w:t xml:space="preserve"> is NaN by IEEE semantics while the integral guard itself held (</w:t>
-      </w:r>
-      <w:r>
-        <w:rPr>
-          <w:rFonts w:ascii="Consolas" w:hAnsi="Consolas"/>
-          <w:sz w:val="20"/>
-        </w:rPr>
-        <w:t>getIntegral()==0</w:t>
-      </w:r>
-      <w:r>
-        <w:t xml:space="preserve">); corrected the expectation to </w:t>
-      </w:r>
-      <w:r>
-        <w:rPr>
-          <w:rFonts w:ascii="Consolas" w:hAnsi="Consolas"/>
-          <w:sz w:val="20"/>
-        </w:rPr>
-        <w:t>isnan</w:t>
-      </w:r>
-      <w:r>
-        <w:t xml:space="preserve"> plus the guard assertion. (3–7) Ashar PID integration: 2 D-term sign expectations (</w:t>
-      </w:r>
-      <w:r>
-        <w:rPr>
-          <w:rFonts w:ascii="Consolas" w:hAnsi="Consolas"/>
-          <w:sz w:val="20"/>
-        </w:rPr>
-        <w:t>−4/−100</w:t>
-      </w:r>
-      <w:r>
-        <w:t xml:space="preserve"> vs actual </w:t>
-      </w:r>
-      <w:r>
-        <w:rPr>
-          <w:rFonts w:ascii="Consolas" w:hAnsi="Consolas"/>
-          <w:sz w:val="20"/>
-        </w:rPr>
-        <w:t>+4/+100</w:t>
-      </w:r>
-      <w:r>
-        <w:t xml:space="preserve"> — v1.17.0 uses PLUS, PID.cpp L47) and 3 saturation tests assuming a conditional-integration freeze gate that does not exist in v1.17.0 (</w:t>
-      </w:r>
-      <w:r>
-        <w:rPr>
-          <w:rFonts w:ascii="Consolas" w:hAnsi="Consolas"/>
-          <w:sz w:val="20"/>
-        </w:rPr>
-        <w:t>updateIntegral</w:t>
-      </w:r>
-      <w:r>
-        <w:t xml:space="preserve"> L57-64 always integrates); all corrected to source-verified expectations, final 17/17 PASS. In each case the setup, expected value, and dependency behavior (uORB advertisement lifetime, </w:t>
-      </w:r>
-      <w:r>
-        <w:rPr>
-          <w:rFonts w:ascii="Consolas" w:hAnsi="Consolas"/>
-          <w:sz w:val="20"/>
-        </w:rPr>
-        <w:t>AlphaFilter</w:t>
-      </w:r>
-      <w:r>
-        <w:t xml:space="preserve"> reset-vs-update semantics, </w:t>
-      </w:r>
-      <w:r>
-        <w:rPr>
-          <w:rFonts w:ascii="Consolas" w:hAnsi="Consolas"/>
-          <w:sz w:val="20"/>
-        </w:rPr>
-        <w:t>constrain</w:t>
-      </w:r>
-      <w:r>
-        <w:t xml:space="preserve"> NaN passthrough) were checked first.</w:t>
-      </w:r>
-    </w:p>
-    <w:p>
-      <w:pPr>
-        <w:pStyle w:val="ListBullet"/>
-      </w:pPr>
-      <w:r>
-        <w:t>Confirmed reproducible defects: none in the analyzed production logic. No defect is manufactured to fill a quota; the suite is green because the covered logic behaves as specified on the exercised paths.</w:t>
-      </w:r>
-    </w:p>
-    <w:p>
-      <w:pPr>
-        <w:pStyle w:val="ListBullet"/>
-      </w:pPr>
-      <w:r>
-        <w:t xml:space="preserve">Residual risk + limits of tested scope: (a) only 3 of thousands of PX4 files are analyzed — commander failsafe consumers, EKF, controllers, and drivers are outside the evidence; (b) L72 param-corruption handling is untested by construction; (c) RLS estimator convergence under real noisy flight data is not exercised (synthetic steps only); (d) FW remaining-time paths use synthetic phase stamps, not estimator output; (e) timing uses synthetic </w:t>
-      </w:r>
-      <w:r>
-        <w:rPr>
-          <w:rFonts w:ascii="Consolas" w:hAnsi="Consolas"/>
-          <w:sz w:val="20"/>
-        </w:rPr>
-        <w:t>hrt_abstime</w:t>
-      </w:r>
-      <w:r>
-        <w:t>, so real-time scheduling effects are out of scope.</w:t>
-      </w:r>
-    </w:p>
-    <w:p>
-      <w:pPr>
-        <w:pStyle w:val="ListBullet"/>
-      </w:pPr>
-      <w:r>
-        <w:t xml:space="preserve">Concrete improvements: replay long-horizon current/voltage traces through </w:t>
-      </w:r>
-      <w:r>
-        <w:rPr>
-          <w:rFonts w:ascii="Consolas" w:hAnsi="Consolas"/>
-          <w:sz w:val="20"/>
-        </w:rPr>
-        <w:t>estimateStateOfCharge</w:t>
-      </w:r>
-      <w:r>
-        <w:t xml:space="preserve"> (the existing </w:t>
-      </w:r>
-      <w:r>
-        <w:rPr>
-          <w:rFonts w:ascii="Consolas" w:hAnsi="Consolas"/>
-          <w:sz w:val="20"/>
-        </w:rPr>
-        <w:t>int_res_est_replay.py</w:t>
-      </w:r>
-      <w:r>
-        <w:t xml:space="preserve"> pattern) to test SoC drift; add a param-corruption test for the L72 path using a scratch param store; cover the FW level-flight gate with estimator-produced (not hand-published) phase data in SITL; upstream the first-ever </w:t>
-      </w:r>
-      <w:r>
-        <w:rPr>
-          <w:rFonts w:ascii="Consolas" w:hAnsi="Consolas"/>
-          <w:sz w:val="20"/>
-        </w:rPr>
-        <w:t>Battery</w:t>
-      </w:r>
-      <w:r>
-        <w:t xml:space="preserve"> functional test to PX4 so the 0%-baseline gap stays closed.</w:t>
-      </w:r>
-    </w:p>
-    <w:p>
-      <w:pPr>
-        <w:pStyle w:val="ListBullet"/>
-      </w:pPr>
-      <w:r>
-        <w:t xml:space="preserve">Audit trail: an independent consistency audit (Taimoor Khalid 24i3052: </w:t>
-      </w:r>
-      <w:r>
-        <w:rPr>
-          <w:rFonts w:ascii="Consolas" w:hAnsi="Consolas"/>
-          <w:sz w:val="20"/>
-        </w:rPr>
-        <w:t>taimoor/AUDIT_REPORT.md</w:t>
-      </w:r>
-      <w:r>
-        <w:t xml:space="preserve">, </w:t>
-      </w:r>
-      <w:r>
-        <w:rPr>
-          <w:rFonts w:ascii="Consolas" w:hAnsi="Consolas"/>
-          <w:sz w:val="20"/>
-        </w:rPr>
-        <w:t>taimoor/COVERAGE_GAP_ANALYSIS.md</w:t>
-      </w:r>
-      <w:r>
-        <w:t xml:space="preserve">) verified hashes, counts, patch applicability, and every BRDA gap classification against the </w:t>
-      </w:r>
-      <w:r>
-        <w:rPr>
-          <w:rFonts w:ascii="Consolas" w:hAnsi="Consolas"/>
-          <w:sz w:val="20"/>
-        </w:rPr>
-        <w:t>.info</w:t>
-      </w:r>
-      <w:r>
-        <w:t xml:space="preserve"> evidence; its must-fix findings (workbook source-ref column, B-D10 c2 probe, failure-count lock) are all closed in this revision.</w:t>
+        <w:t>) verified hashes, counts, patch applicability, and every gap claim against the evidence; its findings were each re-verified and either closed with new probe tests or absorbed into this report.</w:t>
       </w:r>
     </w:p>
     <w:p>
@@ -1982,7 +552,10 @@
         <w:pStyle w:val="Heading2"/>
       </w:pPr>
       <w:r>
-        <w:t>9. Final quality judgment [Part 4 — 300–400 WORDS, enforced]</w:t>
+        <w:rPr>
+          <w:color w:val="1F4E79"/>
+        </w:rPr>
+        <w:t>9. Final quality judgment</w:t>
       </w:r>
     </w:p>
     <w:p>
@@ -2005,14 +578,20 @@
         <w:pStyle w:val="Heading2"/>
       </w:pPr>
       <w:r>
-        <w:t>10. Reproduction instructions (exact commands)</w:t>
+        <w:rPr>
+          <w:color w:val="1F4E79"/>
+        </w:rPr>
+        <w:t>10. Reproduction instructions</w:t>
       </w:r>
     </w:p>
     <w:p>
+      <w:pPr>
+        <w:spacing w:after="120"/>
+      </w:pPr>
       <w:r>
         <w:rPr>
           <w:rFonts w:ascii="Consolas" w:hAnsi="Consolas"/>
-          <w:sz w:val="18"/>
+          <w:sz w:val="17"/>
         </w:rPr>
         <w:t># 1. Baseline (inside PX4-Autopilot @ d6f12ad, see §2 for clone/setup)</w:t>
         <w:br/>
@@ -2054,35 +633,15 @@
         <w:pStyle w:val="Heading2"/>
       </w:pPr>
       <w:r>
-        <w:t>11. AI-assistance record (brief)</w:t>
+        <w:rPr>
+          <w:color w:val="1F4E79"/>
+        </w:rPr>
+        <w:t>11. AI-assistance record</w:t>
       </w:r>
     </w:p>
     <w:p>
-      <w:pPr>
-        <w:pStyle w:val="ListBullet"/>
-      </w:pPr>
       <w:r>
-        <w:t xml:space="preserve">AI tools assisted repository navigation, build troubleshooting, test scaffolding, and coverage analysis throughout; every AI-suggested test, expectation value, and coverage claim was independently verified by compiling, running, and measuring (8 wrong AI-assisted expectations were caught and corrected during development: 2 Battery RLS-gate timings, 1 PID NaN output, 2 Ashar PID sign expectations refuted by PID.cpp L47, 3 Ashar saturation expectations refuted by the absence of a freeze gate in L57-64). Scope, MC/DC pairs, and gap justifications were derived from direct source reading, not from model assertions. Ashar's record (per </w:t>
-      </w:r>
-      <w:r>
-        <w:rPr>
-          <w:rFonts w:ascii="Consolas" w:hAnsi="Consolas"/>
-          <w:sz w:val="20"/>
-        </w:rPr>
-        <w:t>ASHAR_HANDOFF.md</w:t>
-      </w:r>
-      <w:r>
-        <w:t xml:space="preserve"> §10): OpenCode/Muse Spark for navigation, float32 verification scripting, scaffolding, handoff drafting; assumptions it introduced (brief's line/decision framing; fallback sign expectations) were corrected by direct source reading, hand recomputation, and an independent float32 model (5 riskiest values bit-exact). Taimoor's record: AI (OpenCode) used for cross-file consistency audit, coverage-gap classification from </w:t>
-      </w:r>
-      <w:r>
-        <w:rPr>
-          <w:rFonts w:ascii="Consolas" w:hAnsi="Consolas"/>
-          <w:sz w:val="20"/>
-        </w:rPr>
-        <w:t>.info</w:t>
-      </w:r>
-      <w:r>
-        <w:t xml:space="preserve">/BRDA data, report prose drafting, viva-bank derivation, and packaging checklist; wrote no PX4 or test code. Assumption risk (line↔arc mapping from lcov numbering) mitigated by citing raw BRDA strings; all numbers rechecked against evidence files, and every one of his audit findings was independently re-verified (BRDA strings, counts, patch applicability) before merging — including the B-D10 c2 gap, which was closed with a new probe test rather than taken on word. Full per-iteration log: </w:t>
+        <w:t xml:space="preserve">AI tooling assisted repository navigation, build troubleshooting, test scaffolding, and coverage analysis throughout, but every AI-suggested test, expectation value, and coverage claim was independently verified by compiling, running, and measuring — eight wrong AI-assisted expectations were caught and corrected during development (two Battery reset-gate timings, one PID NaN output, two Ashar PID sign expectations refuted by PID line 47, and three Ashar saturation expectations refuted by the absence of a freeze gate in lines 57–64). Scope, MC/DC pairs, and gap justifications were derived from direct source reading rather than model assertions. Ashar's record: OpenCode and Muse Spark for navigation, float32 verification scripting, scaffolding, and handoff drafting, with introduced assumptions (brief line and decision framing, fallback sign expectations) corrected through direct source reading, hand recomputation, and an independent float32 model. Taimoor's record: OpenCode for the cross-file consistency audit, coverage-gap classification from raw branch data, report prose drafting, viva-bank derivation, and the packaging checklist, writing no PX4 or test code; his line-to-arc mapping risk was contained by citing raw branch-data strings, and every one of his findings was re-verified before merging. No raw chat transcripts are submitted, and no production code was AI-modified — the diff contains only test registrations and new test files. The full per-iteration log is </w:t>
       </w:r>
       <w:r>
         <w:rPr>
@@ -2092,7 +651,7 @@
         <w:t>AI_ASSISTANCE_LOG.md</w:t>
       </w:r>
       <w:r>
-        <w:t>. No raw chat transcripts. No production code was AI-modified (diff contains only test registrations + new test files).</w:t>
+        <w:t>.</w:t>
       </w:r>
     </w:p>
     <w:p>
@@ -2100,6 +659,9 @@
         <w:pStyle w:val="Heading2"/>
       </w:pPr>
       <w:r>
+        <w:rPr>
+          <w:color w:val="1F4E79"/>
+        </w:rPr>
         <w:t>12. References and evidence index</w:t>
       </w:r>
     </w:p>
@@ -2153,7 +715,17 @@
         <w:t>workbook/</w:t>
       </w:r>
       <w:r>
-        <w:t xml:space="preserve"> (.xlsx at packaging; ≤2 sheets) · Patch: </w:t>
+        <w:t xml:space="preserve"> (proposed submission copy: </w:t>
+      </w:r>
+      <w:r>
+        <w:rPr>
+          <w:rFonts w:ascii="Consolas" w:hAnsi="Consolas"/>
+          <w:sz w:val="20"/>
+        </w:rPr>
+        <w:t>Workbook_proposed.xlsx</w:t>
+      </w:r>
+      <w:r>
+        <w:t xml:space="preserve">, 2 sheets) · Patch: </w:t>
       </w:r>
       <w:r>
         <w:rPr>
@@ -2192,6 +764,26 @@
         </w:rPr>
         <w:t>evidence/logs/</w:t>
       </w:r>
+      <w:r>
+        <w:t xml:space="preserve"> · Teammate deliveries: </w:t>
+      </w:r>
+      <w:r>
+        <w:rPr>
+          <w:rFonts w:ascii="Consolas" w:hAnsi="Consolas"/>
+          <w:sz w:val="20"/>
+        </w:rPr>
+        <w:t>ashar/</w:t>
+      </w:r>
+      <w:r>
+        <w:t xml:space="preserve">, </w:t>
+      </w:r>
+      <w:r>
+        <w:rPr>
+          <w:rFonts w:ascii="Consolas" w:hAnsi="Consolas"/>
+          <w:sz w:val="20"/>
+        </w:rPr>
+        <w:t>taimoor/</w:t>
+      </w:r>
     </w:p>
     <w:p>
       <w:pPr>
@@ -2201,27 +793,52 @@
         <w:t>Official: PX4 Repository, Developer Environment, Unit Tests, Testing &amp; CI, Simulation, v1.17 Release Notes (per brief).</w:t>
       </w:r>
     </w:p>
-    <w:p>
-      <w:r>
-        <w:t>——————————————————————————————</w:t>
-      </w:r>
-    </w:p>
-    <w:p>
-      <w:r>
-        <w:rPr>
-          <w:i/>
-        </w:rPr>
-        <w:t>Final draft v2 — 2026-10-01. Remaining placeholders: group member names + section (cover), `&lt;Roll1_Roll2_Roll3_Section&gt;` filename values at packaging.</w:t>
-      </w:r>
-    </w:p>
     <w:sectPr>
+      <w:footerReference w:type="default" r:id="rId9"/>
       <w:pgSz w:w="12240" w:h="15840"/>
       <w:pgMar w:top="1440" w:right="1800" w:bottom="1440" w:left="1800" w:header="720" w:footer="720" w:gutter="0"/>
       <w:cols w:space="720"/>
+      <w:titlePg/>
       <w:docGrid w:linePitch="360"/>
     </w:sectPr>
   </w:body>
 </w:document>
+</file>
+
+<file path=word/footer1.xml><?xml version="1.0" encoding="utf-8"?>
+<w:ftr xmlns:m="http://schemas.openxmlformats.org/officeDocument/2006/math" xmlns:mc="http://schemas.openxmlformats.org/markup-compatibility/2006" xmlns:mo="http://schemas.microsoft.com/office/mac/office/2008/main" xmlns:mv="urn:schemas-microsoft-com:mac:vml" xmlns:o="urn:schemas-microsoft-com:office:office" xmlns:r="http://schemas.openxmlformats.org/officeDocument/2006/relationships" xmlns:v="urn:schemas-microsoft-com:vml" xmlns:w10="urn:schemas-microsoft-com:office:word" xmlns:w14="http://schemas.microsoft.com/office/word/2010/wordml" xmlns:w="http://schemas.openxmlformats.org/wordprocessingml/2006/main" xmlns:wne="http://schemas.microsoft.com/office/word/2006/wordml" xmlns:wp14="http://schemas.microsoft.com/office/word/2010/wordprocessingDrawing" xmlns:wp="http://schemas.openxmlformats.org/drawingml/2006/wordprocessingDrawing" xmlns:wpc="http://schemas.microsoft.com/office/word/2010/wordprocessingCanvas" xmlns:wpg="http://schemas.microsoft.com/office/word/2010/wordprocessingGroup" xmlns:wpi="http://schemas.microsoft.com/office/word/2010/wordprocessingInk" xmlns:wps="http://schemas.microsoft.com/office/word/2010/wordprocessingShape" mc:Ignorable="w14 wp14">
+  <w:p>
+    <w:pPr>
+      <w:pStyle w:val="Footer"/>
+      <w:jc w:val="center"/>
+    </w:pPr>
+    <w:r>
+      <w:rPr>
+        <w:color w:val="444444"/>
+        <w:sz w:val="18"/>
+      </w:rPr>
+      <w:fldChar w:fldCharType="begin"/>
+      <w:instrText xml:space="preserve">PAGE</w:instrText>
+      <w:fldChar w:fldCharType="end"/>
+    </w:r>
+    <w:r>
+      <w:rPr>
+        <w:color w:val="444444"/>
+        <w:sz w:val="18"/>
+      </w:rPr>
+      <w:t xml:space="preserve"> / </w:t>
+    </w:r>
+    <w:r>
+      <w:rPr>
+        <w:color w:val="444444"/>
+        <w:sz w:val="18"/>
+      </w:rPr>
+      <w:fldChar w:fldCharType="begin"/>
+      <w:instrText xml:space="preserve">NUMPAGES</w:instrText>
+      <w:fldChar w:fldCharType="end"/>
+    </w:r>
+  </w:p>
+</w:ftr>
 </file>
 
 <file path=word/numbering.xml><?xml version="1.0" encoding="utf-8"?>

</xml_diff>

<commit_message>
Demo-ready report rewrite (6 tables, plain sentences, Option A framing); sync packages
</commit_message>
<xml_diff>
--- a/24i3102_24i3052_24i3072_C_Report.docx
+++ b/24i3102_24i3052_24i3072_C_Report.docx
@@ -67,42 +67,12 @@
         <w:rPr>
           <w:color w:val="1F4E79"/>
         </w:rPr>
-        <w:t>1. Introduction and testing approach</w:t>
+        <w:t>1. What this report covers</w:t>
       </w:r>
     </w:p>
     <w:p>
       <w:r>
-        <w:t xml:space="preserve">We performed white-box structural testing of three selected PX4 v1.17.0 production areas, chosen from direct source reading rather than from any coverage target: </w:t>
-      </w:r>
-      <w:r>
-        <w:rPr>
-          <w:rFonts w:ascii="Consolas" w:hAnsi="Consolas"/>
-          <w:sz w:val="20"/>
-        </w:rPr>
-        <w:t>src/lib/hysteresis/hysteresis.cpp</w:t>
-      </w:r>
-      <w:r>
-        <w:t xml:space="preserve"> (a boolean state machine with asymmetric time delays, tested at GTest unit level), </w:t>
-      </w:r>
-      <w:r>
-        <w:rPr>
-          <w:rFonts w:ascii="Consolas" w:hAnsi="Consolas"/>
-          <w:sz w:val="20"/>
-        </w:rPr>
-        <w:t>src/lib/pid/PID.cpp</w:t>
-      </w:r>
-      <w:r>
-        <w:t xml:space="preserve"> (a control-loop PID with saturation, anti-windup, and degenerate-input guards, GTest unit), and </w:t>
-      </w:r>
-      <w:r>
-        <w:rPr>
-          <w:rFonts w:ascii="Consolas" w:hAnsi="Consolas"/>
-          <w:sz w:val="20"/>
-        </w:rPr>
-        <w:t>src/lib/battery/battery.cpp</w:t>
-      </w:r>
-      <w:r>
-        <w:t xml:space="preserve"> (state-of-charge fusion, internal-resistance estimation, warning and fault classification, and remaining-time estimation, GTest functional). The Battery class doubles as our MC/DC component, because its warning and fault outputs drive failsafe behavior. Our obligations were 100% statement coverage and 100% decision and branch coverage over this scope wherever practically achievable, with every residual gap individually investigated and justified, plus MC/DC independence pairs for the applicable compound decisions of the critical component, recorded with each atomic condition and each overall decision showing both outcomes in the workbook matrix. Upstream tests were read and run to learn project conventions and to establish a baseline, but every claimed test is student-authored, as the reconstructing patch proves. No production behavior was changed to gain coverage; the entire diff consists of test registrations and three new test files.</w:t>
+        <w:t>We structurally tested three production areas of PX4 v1.17.0, wrote 61 tests of our own against them, measured statement and branch coverage before and after, and performed MC/DC analysis on the failsafe-critical Battery component. No production code was changed at any point. This report records the group, the machine and baseline everything traces to, why these three areas were chosen, how each test was derived from the production logic, what the MC/DC evidence shows, what coverage was achieved, what gaps remain and why, and a final judgment on what the evidence does and does not prove.</w:t>
       </w:r>
     </w:p>
     <w:p>
@@ -113,42 +83,300 @@
         <w:rPr>
           <w:color w:val="1F4E79"/>
         </w:rPr>
-        <w:t>2. Local setup and fixed baseline</w:t>
+        <w:t>2. Environment and fixed baseline</w:t>
       </w:r>
     </w:p>
     <w:p>
       <w:r>
-        <w:t xml:space="preserve">All work was cloned, built, tested, and measured locally on a student-owned machine. The repository was cloned recursively at the fixed tag </w:t>
+        <w:t>Everything was cloned, built, tested, and measured locally on a student-owned machine. The table below is the complete environment record.</w:t>
       </w:r>
+    </w:p>
+    <w:tbl>
+      <w:tblPr>
+        <w:tblStyle w:val="LightGrid-Accent1"/>
+        <w:tblW w:type="auto" w:w="0"/>
+        <w:tblLook w:firstColumn="1" w:firstRow="1" w:lastColumn="0" w:lastRow="0" w:noHBand="0" w:noVBand="1" w:val="04A0"/>
+      </w:tblPr>
+      <w:tblGrid>
+        <w:gridCol w:w="4320"/>
+        <w:gridCol w:w="4320"/>
+      </w:tblGrid>
+      <w:tr>
+        <w:tc>
+          <w:tcPr>
+            <w:tcW w:type="dxa" w:w="4320"/>
+          </w:tcPr>
+          <w:p>
+            <w:r/>
+            <w:r>
+              <w:rPr>
+                <w:b/>
+                <w:sz w:val="18"/>
+              </w:rPr>
+              <w:t>Item</w:t>
+            </w:r>
+          </w:p>
+        </w:tc>
+        <w:tc>
+          <w:tcPr>
+            <w:tcW w:type="dxa" w:w="4320"/>
+          </w:tcPr>
+          <w:p>
+            <w:r/>
+            <w:r>
+              <w:rPr>
+                <w:b/>
+                <w:sz w:val="18"/>
+              </w:rPr>
+              <w:t>Value</w:t>
+            </w:r>
+          </w:p>
+        </w:tc>
+      </w:tr>
+      <w:tr>
+        <w:tc>
+          <w:tcPr>
+            <w:tcW w:type="dxa" w:w="4320"/>
+          </w:tcPr>
+          <w:p>
+            <w:r/>
+            <w:r>
+              <w:rPr>
+                <w:sz w:val="18"/>
+              </w:rPr>
+              <w:t>OS</w:t>
+            </w:r>
+          </w:p>
+        </w:tc>
+        <w:tc>
+          <w:tcPr>
+            <w:tcW w:type="dxa" w:w="4320"/>
+          </w:tcPr>
+          <w:p>
+            <w:r/>
+            <w:r>
+              <w:rPr>
+                <w:sz w:val="18"/>
+              </w:rPr>
+              <w:t>Linux Mint 22.3 (Ubuntu 24.04 base)</w:t>
+            </w:r>
+          </w:p>
+        </w:tc>
+      </w:tr>
+      <w:tr>
+        <w:tc>
+          <w:tcPr>
+            <w:tcW w:type="dxa" w:w="4320"/>
+          </w:tcPr>
+          <w:p>
+            <w:r/>
+            <w:r>
+              <w:rPr>
+                <w:sz w:val="18"/>
+              </w:rPr>
+              <w:t>Hardware architecture</w:t>
+            </w:r>
+          </w:p>
+        </w:tc>
+        <w:tc>
+          <w:tcPr>
+            <w:tcW w:type="dxa" w:w="4320"/>
+          </w:tcPr>
+          <w:p>
+            <w:r/>
+            <w:r>
+              <w:rPr>
+                <w:sz w:val="18"/>
+              </w:rPr>
+              <w:t>x86_64</w:t>
+            </w:r>
+          </w:p>
+        </w:tc>
+      </w:tr>
+      <w:tr>
+        <w:tc>
+          <w:tcPr>
+            <w:tcW w:type="dxa" w:w="4320"/>
+          </w:tcPr>
+          <w:p>
+            <w:r/>
+            <w:r>
+              <w:rPr>
+                <w:sz w:val="18"/>
+              </w:rPr>
+              <w:t>Compiler</w:t>
+            </w:r>
+          </w:p>
+        </w:tc>
+        <w:tc>
+          <w:tcPr>
+            <w:tcW w:type="dxa" w:w="4320"/>
+          </w:tcPr>
+          <w:p>
+            <w:r/>
+            <w:r>
+              <w:rPr>
+                <w:sz w:val="18"/>
+              </w:rPr>
+              <w:t>gcc / g++ 13.3.0</w:t>
+            </w:r>
+          </w:p>
+        </w:tc>
+      </w:tr>
+      <w:tr>
+        <w:tc>
+          <w:tcPr>
+            <w:tcW w:type="dxa" w:w="4320"/>
+          </w:tcPr>
+          <w:p>
+            <w:r/>
+            <w:r>
+              <w:rPr>
+                <w:sz w:val="18"/>
+              </w:rPr>
+              <w:t>Build tools</w:t>
+            </w:r>
+          </w:p>
+        </w:tc>
+        <w:tc>
+          <w:tcPr>
+            <w:tcW w:type="dxa" w:w="4320"/>
+          </w:tcPr>
+          <w:p>
+            <w:r/>
+            <w:r>
+              <w:rPr>
+                <w:sz w:val="18"/>
+              </w:rPr>
+              <w:t>cmake 3.28.3, ninja 1.11.1</w:t>
+            </w:r>
+          </w:p>
+        </w:tc>
+      </w:tr>
+      <w:tr>
+        <w:tc>
+          <w:tcPr>
+            <w:tcW w:type="dxa" w:w="4320"/>
+          </w:tcPr>
+          <w:p>
+            <w:r/>
+            <w:r>
+              <w:rPr>
+                <w:sz w:val="18"/>
+              </w:rPr>
+              <w:t>Coverage tools</w:t>
+            </w:r>
+          </w:p>
+        </w:tc>
+        <w:tc>
+          <w:tcPr>
+            <w:tcW w:type="dxa" w:w="4320"/>
+          </w:tcPr>
+          <w:p>
+            <w:r/>
+            <w:r>
+              <w:rPr>
+                <w:sz w:val="18"/>
+              </w:rPr>
+              <w:t>lcov 2.0-1 (gcov 13.3.0)</w:t>
+            </w:r>
+          </w:p>
+        </w:tc>
+      </w:tr>
+      <w:tr>
+        <w:tc>
+          <w:tcPr>
+            <w:tcW w:type="dxa" w:w="4320"/>
+          </w:tcPr>
+          <w:p>
+            <w:r/>
+            <w:r>
+              <w:rPr>
+                <w:sz w:val="18"/>
+              </w:rPr>
+              <w:t>Other tools</w:t>
+            </w:r>
+          </w:p>
+        </w:tc>
+        <w:tc>
+          <w:tcPr>
+            <w:tcW w:type="dxa" w:w="4320"/>
+          </w:tcPr>
+          <w:p>
+            <w:r/>
+            <w:r>
+              <w:rPr>
+                <w:sz w:val="18"/>
+              </w:rPr>
+              <w:t>Python 3.12.3, git 2.43.0</w:t>
+            </w:r>
+          </w:p>
+        </w:tc>
+      </w:tr>
+      <w:tr>
+        <w:tc>
+          <w:tcPr>
+            <w:tcW w:type="dxa" w:w="4320"/>
+          </w:tcPr>
+          <w:p>
+            <w:r/>
+            <w:r>
+              <w:rPr>
+                <w:sz w:val="18"/>
+              </w:rPr>
+              <w:t>Repository</w:t>
+            </w:r>
+          </w:p>
+        </w:tc>
+        <w:tc>
+          <w:tcPr>
+            <w:tcW w:type="dxa" w:w="4320"/>
+          </w:tcPr>
+          <w:p>
+            <w:r/>
+            <w:r>
+              <w:rPr>
+                <w:sz w:val="18"/>
+              </w:rPr>
+              <w:t>`https://github.com/PX4/PX4-Autopilot.git`, cloned recursively at tag `v1.17.0`</w:t>
+            </w:r>
+          </w:p>
+        </w:tc>
+      </w:tr>
+      <w:tr>
+        <w:tc>
+          <w:tcPr>
+            <w:tcW w:type="dxa" w:w="4320"/>
+          </w:tcPr>
+          <w:p>
+            <w:r/>
+            <w:r>
+              <w:rPr>
+                <w:sz w:val="18"/>
+              </w:rPr>
+              <w:t>Fixed commit</w:t>
+            </w:r>
+          </w:p>
+        </w:tc>
+        <w:tc>
+          <w:tcPr>
+            <w:tcW w:type="dxa" w:w="4320"/>
+          </w:tcPr>
+          <w:p>
+            <w:r/>
+            <w:r>
+              <w:rPr>
+                <w:sz w:val="18"/>
+              </w:rPr>
+              <w:t>`d6f12ad1c4f70ad3230afd7d86e971421e02fef4`</w:t>
+            </w:r>
+          </w:p>
+        </w:tc>
+      </w:tr>
+    </w:tbl>
+    <w:p>
       <w:r>
-        <w:rPr>
-          <w:rFonts w:ascii="Consolas" w:hAnsi="Consolas"/>
-          <w:sz w:val="20"/>
-        </w:rPr>
-        <w:t>v1.17.0</w:t>
-      </w:r>
-      <w:r>
-        <w:t xml:space="preserve"> (</w:t>
-      </w:r>
-      <w:r>
-        <w:rPr>
-          <w:rFonts w:ascii="Consolas" w:hAnsi="Consolas"/>
-          <w:sz w:val="20"/>
-        </w:rPr>
-        <w:t>git clone --branch v1.17.0 --recursive https://github.com/PX4/PX4-Autopilot.git</w:t>
-      </w:r>
-      <w:r>
-        <w:t xml:space="preserve">), and the local HEAD was verified as </w:t>
-      </w:r>
-      <w:r>
-        <w:rPr>
-          <w:rFonts w:ascii="Consolas" w:hAnsi="Consolas"/>
-          <w:sz w:val="20"/>
-        </w:rPr>
-        <w:t>d6f12ad1c4f70ad3230afd7d86e971421e02fef4</w:t>
-      </w:r>
-      <w:r>
-        <w:t xml:space="preserve">, so every coverage figure in this report traces to that baseline plus our own test-only changes. The environment was Linux Mint 22.3 (Ubuntu 24.04 base) on x86_64, with gcc/g++ 13.3.0, cmake 3.28.3, ninja 1.11.1, lcov 2.0-1 (gcov 13.3.0), Python 3.12.3, and git 2.43.0. One environment note: the top-level </w:t>
+        <w:t xml:space="preserve">Every coverage number in this report traces to that commit plus our own test-only changes. One build note: the top-level </w:t>
       </w:r>
       <w:r>
         <w:rPr>
@@ -158,27 +386,7 @@
         <w:t>make tests</w:t>
       </w:r>
       <w:r>
-        <w:t xml:space="preserve"> wrapper was bypassed because its </w:t>
-      </w:r>
-      <w:r>
-        <w:rPr>
-          <w:rFonts w:ascii="Consolas" w:hAnsi="Consolas"/>
-          <w:sz w:val="20"/>
-        </w:rPr>
-        <w:t>cmake-build</w:t>
-      </w:r>
-      <w:r>
-        <w:t xml:space="preserve"> macro mishandles paths (an unquoted </w:t>
-      </w:r>
-      <w:r>
-        <w:rPr>
-          <w:rFonts w:ascii="Consolas" w:hAnsi="Consolas"/>
-          <w:sz w:val="20"/>
-        </w:rPr>
-        <w:t>$(SRC_DIR)</w:t>
-      </w:r>
-      <w:r>
-        <w:t xml:space="preserve">); we configured and built directly with cmake and ninja (§10), which is equivalent and is what all evidence was produced with — this is a build-invocation detail, not a production change. The baseline runs green: upstream </w:t>
+        <w:t xml:space="preserve"> wrapper was bypassed because its build macro mishandles paths, and we configured and built directly with cmake and ninja instead (§10). This is only a difference in how the build is invoked, not a change to any code. The upstream baseline runs green before our tests were added: </w:t>
       </w:r>
       <w:r>
         <w:rPr>
@@ -188,7 +396,7 @@
         <w:t>unit-Hysteresis</w:t>
       </w:r>
       <w:r>
-        <w:t xml:space="preserve"> passes 7 of 7 and upstream </w:t>
+        <w:t xml:space="preserve"> passes 7 of 7 and </w:t>
       </w:r>
       <w:r>
         <w:rPr>
@@ -198,7 +406,7 @@
         <w:t>unit-PID</w:t>
       </w:r>
       <w:r>
-        <w:t xml:space="preserve"> passes 4 of 4, with logs in </w:t>
+        <w:t xml:space="preserve"> passes 4 of 4, with the logs kept in </w:t>
       </w:r>
       <w:r>
         <w:rPr>
@@ -206,16 +414,6 @@
           <w:sz w:val="20"/>
         </w:rPr>
         <w:t>evidence/baseline/</w:t>
-      </w:r>
-      <w:r>
-        <w:t xml:space="preserve"> and baseline scope coverage in </w:t>
-      </w:r>
-      <w:r>
-        <w:rPr>
-          <w:rFonts w:ascii="Consolas" w:hAnsi="Consolas"/>
-          <w:sz w:val="20"/>
-        </w:rPr>
-        <w:t>evidence/baseline/scope_baseline_branch.info</w:t>
       </w:r>
       <w:r>
         <w:t>.</w:t>
@@ -229,62 +427,382 @@
         <w:rPr>
           <w:color w:val="1F4E79"/>
         </w:rPr>
-        <w:t>3. Repository analysis and scope selection</w:t>
+        <w:t>3. Scope selection: the three areas and why they qualify</w:t>
       </w:r>
     </w:p>
     <w:p>
       <w:r>
-        <w:t>We began from the production code. The hysteresis class holds a boolean state with independent per-direction delay windows and is driven entirely through caller-supplied timestamps, which makes it fully deterministic and ideal for unit testing; its two-sided time-guarded state machine (</w:t>
+        <w:t>We read the production code first and selected three areas. Each one is real control or business logic with decisions worth testing — not a wrapper, not branch-free math, and not generated or GUI code. The Battery file in particular is a large, substantial component (497 lines) covering state-of-charge fusion, internal-resistance estimation, warning and fault classification, and remaining-time estimation. Across the three areas we exercise roughly 274 lines of production logic, the great majority of it inside Battery's failsafe paths.</w:t>
       </w:r>
+    </w:p>
+    <w:tbl>
+      <w:tblPr>
+        <w:tblStyle w:val="LightGrid-Accent1"/>
+        <w:tblW w:type="auto" w:w="0"/>
+        <w:tblLook w:firstColumn="1" w:firstRow="1" w:lastColumn="0" w:lastRow="0" w:noHBand="0" w:noVBand="1" w:val="04A0"/>
+      </w:tblPr>
+      <w:tblGrid>
+        <w:gridCol w:w="1440"/>
+        <w:gridCol w:w="1440"/>
+        <w:gridCol w:w="1440"/>
+        <w:gridCol w:w="1440"/>
+        <w:gridCol w:w="1440"/>
+        <w:gridCol w:w="1440"/>
+      </w:tblGrid>
+      <w:tr>
+        <w:tc>
+          <w:tcPr>
+            <w:tcW w:type="dxa" w:w="1440"/>
+          </w:tcPr>
+          <w:p>
+            <w:r/>
+            <w:r>
+              <w:rPr>
+                <w:b/>
+                <w:sz w:val="18"/>
+              </w:rPr>
+              <w:t>#</w:t>
+            </w:r>
+          </w:p>
+        </w:tc>
+        <w:tc>
+          <w:tcPr>
+            <w:tcW w:type="dxa" w:w="1440"/>
+          </w:tcPr>
+          <w:p>
+            <w:r/>
+            <w:r>
+              <w:rPr>
+                <w:b/>
+                <w:sz w:val="18"/>
+              </w:rPr>
+              <w:t>Production area</w:t>
+            </w:r>
+          </w:p>
+        </w:tc>
+        <w:tc>
+          <w:tcPr>
+            <w:tcW w:type="dxa" w:w="1440"/>
+          </w:tcPr>
+          <w:p>
+            <w:r/>
+            <w:r>
+              <w:rPr>
+                <w:b/>
+                <w:sz w:val="18"/>
+              </w:rPr>
+              <w:t>What it does, in plain words</w:t>
+            </w:r>
+          </w:p>
+        </w:tc>
+        <w:tc>
+          <w:tcPr>
+            <w:tcW w:type="dxa" w:w="1440"/>
+          </w:tcPr>
+          <w:p>
+            <w:r/>
+            <w:r>
+              <w:rPr>
+                <w:b/>
+                <w:sz w:val="18"/>
+              </w:rPr>
+              <w:t>Why it is worth testing</w:t>
+            </w:r>
+          </w:p>
+        </w:tc>
+        <w:tc>
+          <w:tcPr>
+            <w:tcW w:type="dxa" w:w="1440"/>
+          </w:tcPr>
+          <w:p>
+            <w:r/>
+            <w:r>
+              <w:rPr>
+                <w:b/>
+                <w:sz w:val="18"/>
+              </w:rPr>
+              <w:t>Size</w:t>
+            </w:r>
+          </w:p>
+        </w:tc>
+        <w:tc>
+          <w:tcPr>
+            <w:tcW w:type="dxa" w:w="1440"/>
+          </w:tcPr>
+          <w:p>
+            <w:r/>
+            <w:r>
+              <w:rPr>
+                <w:b/>
+                <w:sz w:val="18"/>
+              </w:rPr>
+              <w:t>Test level</w:t>
+            </w:r>
+          </w:p>
+        </w:tc>
+      </w:tr>
+      <w:tr>
+        <w:tc>
+          <w:tcPr>
+            <w:tcW w:type="dxa" w:w="1440"/>
+          </w:tcPr>
+          <w:p>
+            <w:r/>
+            <w:r>
+              <w:rPr>
+                <w:sz w:val="18"/>
+              </w:rPr>
+              <w:t>1</w:t>
+            </w:r>
+          </w:p>
+        </w:tc>
+        <w:tc>
+          <w:tcPr>
+            <w:tcW w:type="dxa" w:w="1440"/>
+          </w:tcPr>
+          <w:p>
+            <w:r/>
+            <w:r>
+              <w:rPr>
+                <w:sz w:val="18"/>
+              </w:rPr>
+              <w:t>`src/lib/hysteresis/hysteresis.cpp`</w:t>
+            </w:r>
+          </w:p>
+        </w:tc>
+        <w:tc>
+          <w:tcPr>
+            <w:tcW w:type="dxa" w:w="1440"/>
+          </w:tcPr>
+          <w:p>
+            <w:r/>
+            <w:r>
+              <w:rPr>
+                <w:sz w:val="18"/>
+              </w:rPr>
+              <w:t>A boolean switch with separate on/off time delays, driven by caller-supplied timestamps</w:t>
+            </w:r>
+          </w:p>
+        </w:tc>
+        <w:tc>
+          <w:tcPr>
+            <w:tcW w:type="dxa" w:w="1440"/>
+          </w:tcPr>
+          <w:p>
+            <w:r/>
+            <w:r>
+              <w:rPr>
+                <w:sz w:val="18"/>
+              </w:rPr>
+              <w:t>A genuine two-sided time-guarded state machine with two compound direction guards; fully deterministic, ideal for unit testing</w:t>
+            </w:r>
+          </w:p>
+        </w:tc>
+        <w:tc>
+          <w:tcPr>
+            <w:tcW w:type="dxa" w:w="1440"/>
+          </w:tcPr>
+          <w:p>
+            <w:r/>
+            <w:r>
+              <w:rPr>
+                <w:sz w:val="18"/>
+              </w:rPr>
+              <w:t>60 lines</w:t>
+            </w:r>
+          </w:p>
+        </w:tc>
+        <w:tc>
+          <w:tcPr>
+            <w:tcW w:type="dxa" w:w="1440"/>
+          </w:tcPr>
+          <w:p>
+            <w:r/>
+            <w:r>
+              <w:rPr>
+                <w:sz w:val="18"/>
+              </w:rPr>
+              <w:t>GTest unit</w:t>
+            </w:r>
+          </w:p>
+        </w:tc>
+      </w:tr>
+      <w:tr>
+        <w:tc>
+          <w:tcPr>
+            <w:tcW w:type="dxa" w:w="1440"/>
+          </w:tcPr>
+          <w:p>
+            <w:r/>
+            <w:r>
+              <w:rPr>
+                <w:sz w:val="18"/>
+              </w:rPr>
+              <w:t>2</w:t>
+            </w:r>
+          </w:p>
+        </w:tc>
+        <w:tc>
+          <w:tcPr>
+            <w:tcW w:type="dxa" w:w="1440"/>
+          </w:tcPr>
+          <w:p>
+            <w:r/>
+            <w:r>
+              <w:rPr>
+                <w:sz w:val="18"/>
+              </w:rPr>
+              <w:t>`src/lib/pid/PID.cpp`</w:t>
+            </w:r>
+          </w:p>
+        </w:tc>
+        <w:tc>
+          <w:tcPr>
+            <w:tcW w:type="dxa" w:w="1440"/>
+          </w:tcPr>
+          <w:p>
+            <w:r/>
+            <w:r>
+              <w:rPr>
+                <w:sz w:val="18"/>
+              </w:rPr>
+              <w:t>A control-loop PID with output and integral saturation, anti-windup, and guards against invalid inputs</w:t>
+            </w:r>
+          </w:p>
+        </w:tc>
+        <w:tc>
+          <w:tcPr>
+            <w:tcW w:type="dxa" w:w="1440"/>
+          </w:tcPr>
+          <w:p>
+            <w:r/>
+            <w:r>
+              <w:rPr>
+                <w:sz w:val="18"/>
+              </w:rPr>
+              <w:t>Sits on a control-critical path with saturation, conditional integration, and degenerate-input guards; deterministic through its direct API</w:t>
+            </w:r>
+          </w:p>
+        </w:tc>
+        <w:tc>
+          <w:tcPr>
+            <w:tcW w:type="dxa" w:w="1440"/>
+          </w:tcPr>
+          <w:p>
+            <w:r/>
+            <w:r>
+              <w:rPr>
+                <w:sz w:val="18"/>
+              </w:rPr>
+              <w:t>47 lines</w:t>
+            </w:r>
+          </w:p>
+        </w:tc>
+        <w:tc>
+          <w:tcPr>
+            <w:tcW w:type="dxa" w:w="1440"/>
+          </w:tcPr>
+          <w:p>
+            <w:r/>
+            <w:r>
+              <w:rPr>
+                <w:sz w:val="18"/>
+              </w:rPr>
+              <w:t>GTest unit</w:t>
+            </w:r>
+          </w:p>
+        </w:tc>
+      </w:tr>
+      <w:tr>
+        <w:tc>
+          <w:tcPr>
+            <w:tcW w:type="dxa" w:w="1440"/>
+          </w:tcPr>
+          <w:p>
+            <w:r/>
+            <w:r>
+              <w:rPr>
+                <w:sz w:val="18"/>
+              </w:rPr>
+              <w:t>3</w:t>
+            </w:r>
+          </w:p>
+        </w:tc>
+        <w:tc>
+          <w:tcPr>
+            <w:tcW w:type="dxa" w:w="1440"/>
+          </w:tcPr>
+          <w:p>
+            <w:r/>
+            <w:r>
+              <w:rPr>
+                <w:sz w:val="18"/>
+              </w:rPr>
+              <w:t>`src/lib/battery/battery.cpp`</w:t>
+            </w:r>
+          </w:p>
+        </w:tc>
+        <w:tc>
+          <w:tcPr>
+            <w:tcW w:type="dxa" w:w="1440"/>
+          </w:tcPr>
+          <w:p>
+            <w:r/>
+            <w:r>
+              <w:rPr>
+                <w:sz w:val="18"/>
+              </w:rPr>
+              <w:t>Fuses voltage-based and coulomb-counted charge, estimates internal resistance, classifies warnings across a four-rung ladder, detects faults, estimates remaining flight time</w:t>
+            </w:r>
+          </w:p>
+        </w:tc>
+        <w:tc>
+          <w:tcPr>
+            <w:tcW w:type="dxa" w:w="1440"/>
+          </w:tcPr>
+          <w:p>
+            <w:r/>
+            <w:r>
+              <w:rPr>
+                <w:sz w:val="18"/>
+              </w:rPr>
+              <w:t>Directly drives failsafe behavior (a missed EMERGENCY warning risks the vehicle); depends on parameters, uORB topics, and time, which is exactly what functional testing exists for; no upstream test links this library, so its baseline coverage was zero</w:t>
+            </w:r>
+          </w:p>
+        </w:tc>
+        <w:tc>
+          <w:tcPr>
+            <w:tcW w:type="dxa" w:w="1440"/>
+          </w:tcPr>
+          <w:p>
+            <w:r/>
+            <w:r>
+              <w:rPr>
+                <w:sz w:val="18"/>
+              </w:rPr>
+              <w:t>497 lines</w:t>
+            </w:r>
+          </w:p>
+        </w:tc>
+        <w:tc>
+          <w:tcPr>
+            <w:tcW w:type="dxa" w:w="1440"/>
+          </w:tcPr>
+          <w:p>
+            <w:r/>
+            <w:r>
+              <w:rPr>
+                <w:sz w:val="18"/>
+              </w:rPr>
+              <w:t>GTest functional</w:t>
+            </w:r>
+          </w:p>
+        </w:tc>
+      </w:tr>
+    </w:tbl>
+    <w:p>
       <w:r>
-        <w:rPr>
-          <w:rFonts w:ascii="Consolas" w:hAnsi="Consolas"/>
-          <w:sz w:val="20"/>
-        </w:rPr>
-        <w:t>set_state_and_update</w:t>
-      </w:r>
-      <w:r>
-        <w:t xml:space="preserve"> plus </w:t>
-      </w:r>
-      <w:r>
-        <w:rPr>
-          <w:rFonts w:ascii="Consolas" w:hAnsi="Consolas"/>
-          <w:sz w:val="20"/>
-        </w:rPr>
-        <w:t>update</w:t>
-      </w:r>
-      <w:r>
-        <w:t>) contains about seven decisions, including two compound direction guards, so it is genuinely non-trivial despite its small size. The PID class sits on a control-critical path with output and integral saturation, conditional integration, a non-finite-integral guard, and a time/history guard on its derivative term — again deterministic through its direct API, and squarely unit-testable. The Battery class is the richest target: it fuses voltage-based and coulomb-counted state of charge, runs a recursive-least-squares internal-resistance estimator, classifies warnings across a four-rung ladder, detects over-voltage faults, and estimates remaining flight time. It depends on PX4 parameters (</w:t>
-      </w:r>
-      <w:r>
-        <w:rPr>
-          <w:rFonts w:ascii="Consolas" w:hAnsi="Consolas"/>
-          <w:sz w:val="20"/>
-        </w:rPr>
-        <w:t>BAT_*</w:t>
-      </w:r>
-      <w:r>
-        <w:t>), uORB topics (</w:t>
-      </w:r>
-      <w:r>
-        <w:rPr>
-          <w:rFonts w:ascii="Consolas" w:hAnsi="Consolas"/>
-          <w:sz w:val="20"/>
-        </w:rPr>
-        <w:t>vehicle_status</w:t>
-      </w:r>
-      <w:r>
-        <w:t xml:space="preserve">, </w:t>
-      </w:r>
-      <w:r>
-        <w:rPr>
-          <w:rFonts w:ascii="Consolas" w:hAnsi="Consolas"/>
-          <w:sz w:val="20"/>
-        </w:rPr>
-        <w:t>flight_phase_estimation</w:t>
-      </w:r>
-      <w:r>
-        <w:t xml:space="preserve">), and high-resolution time, which is exactly what the GTest functional level exists for; notably, no upstream test links this library, so its baseline coverage was zero and authorship is clean. We deliberately excluded </w:t>
+        <w:t xml:space="preserve">Deliberately excluded: </w:t>
       </w:r>
       <w:r>
         <w:rPr>
@@ -304,17 +822,7 @@
         <w:t>circuit_breaker</w:t>
       </w:r>
       <w:r>
-        <w:t xml:space="preserve"> (a single superficial </w:t>
-      </w:r>
-      <w:r>
-        <w:rPr>
-          <w:rFonts w:ascii="Consolas" w:hAnsi="Consolas"/>
-          <w:sz w:val="20"/>
-        </w:rPr>
-        <w:t>&amp;&amp;</w:t>
-      </w:r>
-      <w:r>
-        <w:t xml:space="preserve"> wrapper the brief rejects as a target), and all GUI, generated, and test-only code, while refusing to exclude difficult business logic to flatter the percentage.</w:t>
+        <w:t xml:space="preserve"> (a single superficial wrapper of the kind the assignment rejects), and all GUI, generated, and test-only code. Difficult logic was never excluded to flatter a percentage — Battery's estimator and failsafe chains are the hardest logic in the scope and they are the center of it.</w:t>
       </w:r>
     </w:p>
     <w:p>
@@ -325,22 +833,42 @@
         <w:rPr>
           <w:color w:val="1F4E79"/>
         </w:rPr>
-        <w:t>4. Structural test derivation</w:t>
+        <w:t>4. How the 61 tests were derived from the production code</w:t>
       </w:r>
     </w:p>
     <w:p>
       <w:r>
-        <w:t xml:space="preserve">Statement obligations were discharged by 61 student tests: 11 </w:t>
+        <w:t xml:space="preserve">We started from the source, not from a coverage target. Every </w:t>
       </w:r>
       <w:r>
         <w:rPr>
           <w:rFonts w:ascii="Consolas" w:hAnsi="Consolas"/>
           <w:sz w:val="20"/>
         </w:rPr>
-        <w:t>HysteresisStructural</w:t>
+        <w:t>if</w:t>
       </w:r>
       <w:r>
-        <w:t xml:space="preserve"> unit tests covering decisions H-D1 through H-D8, including exact </w:t>
+        <w:t xml:space="preserve">, </w:t>
+      </w:r>
+      <w:r>
+        <w:rPr>
+          <w:rFonts w:ascii="Consolas" w:hAnsi="Consolas"/>
+          <w:sz w:val="20"/>
+        </w:rPr>
+        <w:t>&amp;&amp;</w:t>
+      </w:r>
+      <w:r>
+        <w:t xml:space="preserve">, and </w:t>
+      </w:r>
+      <w:r>
+        <w:rPr>
+          <w:rFonts w:ascii="Consolas" w:hAnsi="Consolas"/>
+          <w:sz w:val="20"/>
+        </w:rPr>
+        <w:t>||</w:t>
+      </w:r>
+      <w:r>
+        <w:t xml:space="preserve"> in the three files became a decision that must be shown both true and false. Every boundary comparison (</w:t>
       </w:r>
       <w:r>
         <w:rPr>
@@ -350,47 +878,329 @@
         <w:t>&gt;=</w:t>
       </w:r>
       <w:r>
-        <w:t xml:space="preserve">-expiry boundaries the upstream suite never probes; 33 </w:t>
+        <w:t xml:space="preserve">, </w:t>
       </w:r>
       <w:r>
         <w:rPr>
           <w:rFonts w:ascii="Consolas" w:hAnsi="Consolas"/>
           <w:sz w:val="20"/>
         </w:rPr>
-        <w:t>BatteryStructural</w:t>
+        <w:t>&lt;</w:t>
       </w:r>
       <w:r>
-        <w:t xml:space="preserve"> functional tests covering B-D1 through B-D12 across the warning ladder, spike-fault detection, the RLS-reset gate, state-of-charge fusion, the discharge time-delta clamp, scale fallback, publish paths, and the armed and fixed-wing remaining-time gates; and 17 </w:t>
+        <w:t>, exact constants such as the 1.05 over-voltage factor) became a boundary test at the exact value and one step on either side. Every invalid or error path (NaN, infinity, zero cells, unconnected battery, stale timestamps) became an error or robustness test. The resulting suites and the decisions they discharge are summarized below; the per-test record (61 rows: HST-01–11, BST-01–33, PST-01–17) is workbook Sheet 1.</w:t>
       </w:r>
+    </w:p>
+    <w:tbl>
+      <w:tblPr>
+        <w:tblStyle w:val="LightGrid-Accent1"/>
+        <w:tblW w:type="auto" w:w="0"/>
+        <w:tblLook w:firstColumn="1" w:firstRow="1" w:lastColumn="0" w:lastRow="0" w:noHBand="0" w:noVBand="1" w:val="04A0"/>
+      </w:tblPr>
+      <w:tblGrid>
+        <w:gridCol w:w="1728"/>
+        <w:gridCol w:w="1728"/>
+        <w:gridCol w:w="1728"/>
+        <w:gridCol w:w="1728"/>
+        <w:gridCol w:w="1728"/>
+      </w:tblGrid>
+      <w:tr>
+        <w:tc>
+          <w:tcPr>
+            <w:tcW w:type="dxa" w:w="1728"/>
+          </w:tcPr>
+          <w:p>
+            <w:r/>
+            <w:r>
+              <w:rPr>
+                <w:b/>
+                <w:sz w:val="18"/>
+              </w:rPr>
+              <w:t>Suite</w:t>
+            </w:r>
+          </w:p>
+        </w:tc>
+        <w:tc>
+          <w:tcPr>
+            <w:tcW w:type="dxa" w:w="1728"/>
+          </w:tcPr>
+          <w:p>
+            <w:r/>
+            <w:r>
+              <w:rPr>
+                <w:b/>
+                <w:sz w:val="18"/>
+              </w:rPr>
+              <w:t>Level</w:t>
+            </w:r>
+          </w:p>
+        </w:tc>
+        <w:tc>
+          <w:tcPr>
+            <w:tcW w:type="dxa" w:w="1728"/>
+          </w:tcPr>
+          <w:p>
+            <w:r/>
+            <w:r>
+              <w:rPr>
+                <w:b/>
+                <w:sz w:val="18"/>
+              </w:rPr>
+              <w:t>Tests</w:t>
+            </w:r>
+          </w:p>
+        </w:tc>
+        <w:tc>
+          <w:tcPr>
+            <w:tcW w:type="dxa" w:w="1728"/>
+          </w:tcPr>
+          <w:p>
+            <w:r/>
+            <w:r>
+              <w:rPr>
+                <w:b/>
+                <w:sz w:val="18"/>
+              </w:rPr>
+              <w:t>Decisions covered</w:t>
+            </w:r>
+          </w:p>
+        </w:tc>
+        <w:tc>
+          <w:tcPr>
+            <w:tcW w:type="dxa" w:w="1728"/>
+          </w:tcPr>
+          <w:p>
+            <w:r/>
+            <w:r>
+              <w:rPr>
+                <w:b/>
+                <w:sz w:val="18"/>
+              </w:rPr>
+              <w:t>Result</w:t>
+            </w:r>
+          </w:p>
+        </w:tc>
+      </w:tr>
+      <w:tr>
+        <w:tc>
+          <w:tcPr>
+            <w:tcW w:type="dxa" w:w="1728"/>
+          </w:tcPr>
+          <w:p>
+            <w:r/>
+            <w:r>
+              <w:rPr>
+                <w:sz w:val="18"/>
+              </w:rPr>
+              <w:t>`HysteresisStructural`</w:t>
+            </w:r>
+          </w:p>
+        </w:tc>
+        <w:tc>
+          <w:tcPr>
+            <w:tcW w:type="dxa" w:w="1728"/>
+          </w:tcPr>
+          <w:p>
+            <w:r/>
+            <w:r>
+              <w:rPr>
+                <w:sz w:val="18"/>
+              </w:rPr>
+              <w:t>Unit</w:t>
+            </w:r>
+          </w:p>
+        </w:tc>
+        <w:tc>
+          <w:tcPr>
+            <w:tcW w:type="dxa" w:w="1728"/>
+          </w:tcPr>
+          <w:p>
+            <w:r/>
+            <w:r>
+              <w:rPr>
+                <w:sz w:val="18"/>
+              </w:rPr>
+              <w:t>11</w:t>
+            </w:r>
+          </w:p>
+        </w:tc>
+        <w:tc>
+          <w:tcPr>
+            <w:tcW w:type="dxa" w:w="1728"/>
+          </w:tcPr>
+          <w:p>
+            <w:r/>
+            <w:r>
+              <w:rPr>
+                <w:sz w:val="18"/>
+              </w:rPr>
+              <w:t>H-D1–H-D8, including exact `&gt;=`-expiry boundaries the upstream suite never probes</w:t>
+            </w:r>
+          </w:p>
+        </w:tc>
+        <w:tc>
+          <w:tcPr>
+            <w:tcW w:type="dxa" w:w="1728"/>
+          </w:tcPr>
+          <w:p>
+            <w:r/>
+            <w:r>
+              <w:rPr>
+                <w:sz w:val="18"/>
+              </w:rPr>
+              <w:t>11/11 pass</w:t>
+            </w:r>
+          </w:p>
+        </w:tc>
+      </w:tr>
+      <w:tr>
+        <w:tc>
+          <w:tcPr>
+            <w:tcW w:type="dxa" w:w="1728"/>
+          </w:tcPr>
+          <w:p>
+            <w:r/>
+            <w:r>
+              <w:rPr>
+                <w:sz w:val="18"/>
+              </w:rPr>
+              <w:t>`BatteryStructural`</w:t>
+            </w:r>
+          </w:p>
+        </w:tc>
+        <w:tc>
+          <w:tcPr>
+            <w:tcW w:type="dxa" w:w="1728"/>
+          </w:tcPr>
+          <w:p>
+            <w:r/>
+            <w:r>
+              <w:rPr>
+                <w:sz w:val="18"/>
+              </w:rPr>
+              <w:t>Functional</w:t>
+            </w:r>
+          </w:p>
+        </w:tc>
+        <w:tc>
+          <w:tcPr>
+            <w:tcW w:type="dxa" w:w="1728"/>
+          </w:tcPr>
+          <w:p>
+            <w:r/>
+            <w:r>
+              <w:rPr>
+                <w:sz w:val="18"/>
+              </w:rPr>
+              <w:t>33</w:t>
+            </w:r>
+          </w:p>
+        </w:tc>
+        <w:tc>
+          <w:tcPr>
+            <w:tcW w:type="dxa" w:w="1728"/>
+          </w:tcPr>
+          <w:p>
+            <w:r/>
+            <w:r>
+              <w:rPr>
+                <w:sz w:val="18"/>
+              </w:rPr>
+              <w:t>B-D1–B-D12: warning ladder, spike-fault detection, estimator-reset gate, charge fusion, time-delta clamp, scale fallback, publish paths, armed and fixed-wing remaining-time gates</w:t>
+            </w:r>
+          </w:p>
+        </w:tc>
+        <w:tc>
+          <w:tcPr>
+            <w:tcW w:type="dxa" w:w="1728"/>
+          </w:tcPr>
+          <w:p>
+            <w:r/>
+            <w:r>
+              <w:rPr>
+                <w:sz w:val="18"/>
+              </w:rPr>
+              <w:t>33/33 pass</w:t>
+            </w:r>
+          </w:p>
+        </w:tc>
+      </w:tr>
+      <w:tr>
+        <w:tc>
+          <w:tcPr>
+            <w:tcW w:type="dxa" w:w="1728"/>
+          </w:tcPr>
+          <w:p>
+            <w:r/>
+            <w:r>
+              <w:rPr>
+                <w:sz w:val="18"/>
+              </w:rPr>
+              <w:t>`PIDStructural`</w:t>
+            </w:r>
+          </w:p>
+        </w:tc>
+        <w:tc>
+          <w:tcPr>
+            <w:tcW w:type="dxa" w:w="1728"/>
+          </w:tcPr>
+          <w:p>
+            <w:r/>
+            <w:r>
+              <w:rPr>
+                <w:sz w:val="18"/>
+              </w:rPr>
+              <w:t>Unit</w:t>
+            </w:r>
+          </w:p>
+        </w:tc>
+        <w:tc>
+          <w:tcPr>
+            <w:tcW w:type="dxa" w:w="1728"/>
+          </w:tcPr>
+          <w:p>
+            <w:r/>
+            <w:r>
+              <w:rPr>
+                <w:sz w:val="18"/>
+              </w:rPr>
+              <w:t>17</w:t>
+            </w:r>
+          </w:p>
+        </w:tc>
+        <w:tc>
+          <w:tcPr>
+            <w:tcW w:type="dxa" w:w="1728"/>
+          </w:tcPr>
+          <w:p>
+            <w:r/>
+            <w:r>
+              <w:rPr>
+                <w:sz w:val="18"/>
+              </w:rPr>
+              <w:t>P-D1–P-D3 plus saturation edges, update-integral flag, NaN/negative-infinity guards, derivative-guard cases, exact `FLT_EPSILON` boundary, negative-dt robustness, windup clamping, limit edges, zero-gain configuration</w:t>
+            </w:r>
+          </w:p>
+        </w:tc>
+        <w:tc>
+          <w:tcPr>
+            <w:tcW w:type="dxa" w:w="1728"/>
+          </w:tcPr>
+          <w:p>
+            <w:r/>
+            <w:r>
+              <w:rPr>
+                <w:sz w:val="18"/>
+              </w:rPr>
+              <w:t>17/17 pass</w:t>
+            </w:r>
+          </w:p>
+        </w:tc>
+      </w:tr>
+    </w:tbl>
+    <w:p>
       <w:r>
-        <w:rPr>
-          <w:rFonts w:ascii="Consolas" w:hAnsi="Consolas"/>
-          <w:sz w:val="20"/>
-        </w:rPr>
-        <w:t>PIDStructural</w:t>
-      </w:r>
-      <w:r>
-        <w:t xml:space="preserve"> tests covering P-D1 through P-D3 plus saturation edges, from the update-integral flag through NaN and negative-infinity guards, the derivative-guard quad, the exact </w:t>
-      </w:r>
-      <w:r>
-        <w:rPr>
-          <w:rFonts w:ascii="Consolas" w:hAnsi="Consolas"/>
-          <w:sz w:val="20"/>
-        </w:rPr>
-        <w:t>FLT_EPSILON</w:t>
-      </w:r>
-      <w:r>
-        <w:t xml:space="preserve"> boundary, negative-dt robustness, windup clamping, output-limit edges, and a zero-gain degenerate configuration. Every test maps to its obligations in workbook Sheet 1 (61 rows: HST-01–11, BST-01–33, PST-01–17), and both outcomes of every reachable decision are demonstrated, with MC/DC independence pairs in §5 and workbook Sheet 2 (32 rows). Edge, boundary, invalid, error, and state-transition cases follow the source wherever it implies them: timestamp exactness and repeat-request stamp keeping in hysteresis; NaN, infinity, degenerate-dt, and saturation limits in PID; threshold exactness, the 1.05 over-voltage boundary, stale-phase handling, unconnected and zero-cell states in Battery. Execution is fully green: upstream 7/7 and 4/4 at baseline, and student suites 11/11, 17/17, and 33/33, with logs in </w:t>
-      </w:r>
-      <w:r>
-        <w:rPr>
-          <w:rFonts w:ascii="Consolas" w:hAnsi="Consolas"/>
-          <w:sz w:val="20"/>
-        </w:rPr>
-        <w:t>evidence/logs/</w:t>
-      </w:r>
-      <w:r>
-        <w:t xml:space="preserve">. No failure was manufactured; eight development-time failures were investigated and all traced to wrong test-side expectations (L130 gate timing twice, a NaN output value, two D-term signs, and three saturation-freeze assumptions), corrected without touching production code. The PID file deserves an authorship note: it was authored by Ashar Ahmed from his own derivation (branch </w:t>
+        <w:t xml:space="preserve">Authorship note for the PID file: it was derived and authored by Ashar Ahmed (branch </w:t>
       </w:r>
       <w:r>
         <w:rPr>
@@ -400,7 +1210,7 @@
         <w:t>ashar-pid-work</w:t>
       </w:r>
       <w:r>
-        <w:t xml:space="preserve"> with a living handoff document) and verified on Linux by the lead, who corrected five expectations against the v1.17.0 source — the D-term sign is PLUS (PID.cpp line 47), and no conditional-integration freeze gate exists (lines 57–64) — reaching a final 17/17 pass, with the original delivery preserved for provenance.</w:t>
+        <w:t>, with a living handoff document) and independently verified on Linux by the lead, who corrected five expectations against the v1.17.0 source before the final green run. The original delivery is preserved untouched for provenance.</w:t>
       </w:r>
     </w:p>
     <w:p>
@@ -411,42 +1221,52 @@
         <w:rPr>
           <w:color w:val="1F4E79"/>
         </w:rPr>
-        <w:t>5. MC/DC analysis of the critical component</w:t>
+        <w:t>5. Test execution: results and the eight failures</w:t>
       </w:r>
     </w:p>
     <w:p>
       <w:r>
-        <w:t xml:space="preserve">Battery was selected as the MC/DC component because its warning and fault classification directly drives failsafe behavior: a missed EMERGENCY warning risks loss of the vehicle, while a spurious one aborts the mission. The critical behavior under analysis is the warning-ladder and spike-fault classification together with the guards that arm them — the </w:t>
+        <w:t xml:space="preserve">All five binaries build and run in both the normal and the instrumented coverage configurations. Baseline: upstream </w:t>
       </w:r>
       <w:r>
         <w:rPr>
           <w:rFonts w:ascii="Consolas" w:hAnsi="Consolas"/>
           <w:sz w:val="20"/>
         </w:rPr>
-        <w:t>updateBatteryStatus</w:t>
+        <w:t>unit-Hysteresis</w:t>
       </w:r>
       <w:r>
-        <w:t xml:space="preserve"> chain, </w:t>
+        <w:t xml:space="preserve"> 7/7, upstream </w:t>
       </w:r>
       <w:r>
         <w:rPr>
           <w:rFonts w:ascii="Consolas" w:hAnsi="Consolas"/>
           <w:sz w:val="20"/>
         </w:rPr>
-        <w:t>determineWarning</w:t>
+        <w:t>unit-PID</w:t>
       </w:r>
       <w:r>
-        <w:t xml:space="preserve">, </w:t>
+        <w:t xml:space="preserve"> 4/4. Student suites: 11/11, 17/17, 33/33. The logs in </w:t>
       </w:r>
       <w:r>
         <w:rPr>
           <w:rFonts w:ascii="Consolas" w:hAnsi="Consolas"/>
           <w:sz w:val="20"/>
         </w:rPr>
-        <w:t>determineFaults</w:t>
+        <w:t>evidence/logs/</w:t>
       </w:r>
       <w:r>
-        <w:t>, and the remaining-time reset and update gates. Five non-trivial compound decisions implement or directly govern this behavior and were analyzed: the four-condition RLS-reset gate at line 130, the two-condition over-voltage fault at lines 327–328, the three-condition filter-reset disjunction at lines 370–371, the two-condition armed-update guard at line 375, and the three-way fixed-wing level-flight gate at lines 377–378. Trivial logging, wrapper, and routing decisions elsewhere were excluded with reasons recorded at derivation time. Workbook Sheet 2 carries the full per-decision evidence — atomic-condition values, overall outcome, independence pair, demonstrated condition, and source/test reference — thirty-two rows in total. The hysteresis direction guards are shown through armed-versus-quiescent and fired-versus-held pairs at exact expiry boundaries; the four-condition reset gate is shown by flipping each condition while the other three hold (unconnected, pre- versus post-initialization, cleared resistance flag, zero cells), observed as an open-circuit-voltage estimate of 16.0 versus 0.0 with zero current; the spike fault is shown including the exact 1.05 boundary that proves the comparison is strict; the filter reset is shown through near-zero-state and consumed-transition pairs, where a moved reset target (5.0 to 7.0) discriminates a genuine hold from a re-reset; the armed guard is shown through unarmed-versus-armed and finite-versus-NaN-current pairs; the fixed-wing gate is shown through multirotor-versus-fixed-wing, fresh-versus-stale stamp, and level-versus-climb pairs; and the PID derivative guard is shown through its time-by-history quad with the exact epsilon boundary. All short-circuit, state, parameter, and message setup needed to reach each condition is explicit in the test bodies — synthetic timestamps, direct parameter control, and fixture-held uORB publications so subscriptions actually receive data. The honest reading of these pairs is that every atomic condition can independently flip its decision's outcome on the real code path that arms warnings, faults, and remaining-time updates, so no condition in this failsafe-critical classification logic is dead or masked — except for two cases investigated in §7 that are unreachable by construction rather than by weak testing.</w:t>
+        <w:t xml:space="preserve"> and </w:t>
+      </w:r>
+      <w:r>
+        <w:rPr>
+          <w:rFonts w:ascii="Consolas" w:hAnsi="Consolas"/>
+          <w:sz w:val="20"/>
+        </w:rPr>
+        <w:t>evidence/baseline/</w:t>
+      </w:r>
+      <w:r>
+        <w:t xml:space="preserve"> show every one of these runs. No failure was manufactured and none was hidden: eight development-time failures occurred, each was investigated (setup, expected values, and dependency behavior checked before any defect was suspected), and each turned out to be a wrong expectation on the test side — two inverted models of the estimator-reset gate's pre-initialization firing, one NaN output where IEEE semantics produce NaN for infinite feedback while the integral guard itself held, two D-term sign errors against the PLUS in PID line 47, and three saturation expectations written against a freeze gate that does not exist in v1.17.0. Production code was not touched in any of the eight corrections.</w:t>
       </w:r>
     </w:p>
     <w:p>
@@ -457,52 +1277,498 @@
         <w:rPr>
           <w:color w:val="1F4E79"/>
         </w:rPr>
-        <w:t>6. Test implementation and execution</w:t>
+        <w:t>6. MC/DC analysis of the critical component</w:t>
       </w:r>
     </w:p>
     <w:p>
       <w:r>
-        <w:t xml:space="preserve">Hysteresis and PID tests use </w:t>
+        <w:t>MC/DC means proving that each individual condition inside a compound decision can independently flip that decision's outcome — that no condition is dead or masked. Battery was chosen for this analysis because its warning and fault classification directly drives failsafe behavior. Five substantive compound decisions implement or directly arm that behavior, and all five were analyzed with independence pairs. Two-condition hysteresis and PID guards are additionally shown as supporting condition/decision evidence, not as the MC/DC claim. Workbook Sheet 2 carries the full per-pair record (32 rows): atomic-condition values, overall outcome, the pair, the demonstrated condition, and the source/test reference.</w:t>
       </w:r>
+    </w:p>
+    <w:tbl>
+      <w:tblPr>
+        <w:tblStyle w:val="LightGrid-Accent1"/>
+        <w:tblW w:type="auto" w:w="0"/>
+        <w:tblLook w:firstColumn="1" w:firstRow="1" w:lastColumn="0" w:lastRow="0" w:noHBand="0" w:noVBand="1" w:val="04A0"/>
+      </w:tblPr>
+      <w:tblGrid>
+        <w:gridCol w:w="2160"/>
+        <w:gridCol w:w="2160"/>
+        <w:gridCol w:w="2160"/>
+        <w:gridCol w:w="2160"/>
+      </w:tblGrid>
+      <w:tr>
+        <w:tc>
+          <w:tcPr>
+            <w:tcW w:type="dxa" w:w="2160"/>
+          </w:tcPr>
+          <w:p>
+            <w:r/>
+            <w:r>
+              <w:rPr>
+                <w:b/>
+                <w:sz w:val="18"/>
+              </w:rPr>
+              <w:t>Decision</w:t>
+            </w:r>
+          </w:p>
+        </w:tc>
+        <w:tc>
+          <w:tcPr>
+            <w:tcW w:type="dxa" w:w="2160"/>
+          </w:tcPr>
+          <w:p>
+            <w:r/>
+            <w:r>
+              <w:rPr>
+                <w:b/>
+                <w:sz w:val="18"/>
+              </w:rPr>
+              <w:t>Location</w:t>
+            </w:r>
+          </w:p>
+        </w:tc>
+        <w:tc>
+          <w:tcPr>
+            <w:tcW w:type="dxa" w:w="2160"/>
+          </w:tcPr>
+          <w:p>
+            <w:r/>
+            <w:r>
+              <w:rPr>
+                <w:b/>
+                <w:sz w:val="18"/>
+              </w:rPr>
+              <w:t>Conditions</w:t>
+            </w:r>
+          </w:p>
+        </w:tc>
+        <w:tc>
+          <w:tcPr>
+            <w:tcW w:type="dxa" w:w="2160"/>
+          </w:tcPr>
+          <w:p>
+            <w:r/>
+            <w:r>
+              <w:rPr>
+                <w:b/>
+                <w:sz w:val="18"/>
+              </w:rPr>
+              <w:t>What the pairs prove</w:t>
+            </w:r>
+          </w:p>
+        </w:tc>
+      </w:tr>
+      <w:tr>
+        <w:tc>
+          <w:tcPr>
+            <w:tcW w:type="dxa" w:w="2160"/>
+          </w:tcPr>
+          <w:p>
+            <w:r/>
+            <w:r>
+              <w:rPr>
+                <w:sz w:val="18"/>
+              </w:rPr>
+              <w:t>Estimator-reset gate (B-D4)</w:t>
+            </w:r>
+          </w:p>
+        </w:tc>
+        <w:tc>
+          <w:tcPr>
+            <w:tcW w:type="dxa" w:w="2160"/>
+          </w:tcPr>
+          <w:p>
+            <w:r/>
+            <w:r>
+              <w:rPr>
+                <w:sz w:val="18"/>
+              </w:rPr>
+              <w:t>line 130</w:t>
+            </w:r>
+          </w:p>
+        </w:tc>
+        <w:tc>
+          <w:tcPr>
+            <w:tcW w:type="dxa" w:w="2160"/>
+          </w:tcPr>
+          <w:p>
+            <w:r/>
+            <w:r>
+              <w:rPr>
+                <w:sz w:val="18"/>
+              </w:rPr>
+              <w:t>4 (connected, initialized, resistance flag, cell count)</w:t>
+            </w:r>
+          </w:p>
+        </w:tc>
+        <w:tc>
+          <w:tcPr>
+            <w:tcW w:type="dxa" w:w="2160"/>
+          </w:tcPr>
+          <w:p>
+            <w:r/>
+            <w:r>
+              <w:rPr>
+                <w:sz w:val="18"/>
+              </w:rPr>
+              <w:t>Each condition flipped while the other three hold; open-circuit estimate 16.0 vs 0.0 with zero current</w:t>
+            </w:r>
+          </w:p>
+        </w:tc>
+      </w:tr>
+      <w:tr>
+        <w:tc>
+          <w:tcPr>
+            <w:tcW w:type="dxa" w:w="2160"/>
+          </w:tcPr>
+          <w:p>
+            <w:r/>
+            <w:r>
+              <w:rPr>
+                <w:sz w:val="18"/>
+              </w:rPr>
+              <w:t>Over-voltage fault (B-D8)</w:t>
+            </w:r>
+          </w:p>
+        </w:tc>
+        <w:tc>
+          <w:tcPr>
+            <w:tcW w:type="dxa" w:w="2160"/>
+          </w:tcPr>
+          <w:p>
+            <w:r/>
+            <w:r>
+              <w:rPr>
+                <w:sz w:val="18"/>
+              </w:rPr>
+              <w:t>lines 327–328</w:t>
+            </w:r>
+          </w:p>
+        </w:tc>
+        <w:tc>
+          <w:tcPr>
+            <w:tcW w:type="dxa" w:w="2160"/>
+          </w:tcPr>
+          <w:p>
+            <w:r/>
+            <w:r>
+              <w:rPr>
+                <w:sz w:val="18"/>
+              </w:rPr>
+              <w:t>2 (limit set, spike above 1.05× limit)</w:t>
+            </w:r>
+          </w:p>
+        </w:tc>
+        <w:tc>
+          <w:tcPr>
+            <w:tcW w:type="dxa" w:w="2160"/>
+          </w:tcPr>
+          <w:p>
+            <w:r/>
+            <w:r>
+              <w:rPr>
+                <w:sz w:val="18"/>
+              </w:rPr>
+              <w:t>Fault shown present and absent, including the exact 1.05 boundary proving the comparison is strict</w:t>
+            </w:r>
+          </w:p>
+        </w:tc>
+      </w:tr>
+      <w:tr>
+        <w:tc>
+          <w:tcPr>
+            <w:tcW w:type="dxa" w:w="2160"/>
+          </w:tcPr>
+          <w:p>
+            <w:r/>
+            <w:r>
+              <w:rPr>
+                <w:sz w:val="18"/>
+              </w:rPr>
+              <w:t>Filter-reset disjunction (B-D9, conditions 2–3)</w:t>
+            </w:r>
+          </w:p>
+        </w:tc>
+        <w:tc>
+          <w:tcPr>
+            <w:tcW w:type="dxa" w:w="2160"/>
+          </w:tcPr>
+          <w:p>
+            <w:r/>
+            <w:r>
+              <w:rPr>
+                <w:sz w:val="18"/>
+              </w:rPr>
+              <w:t>lines 370–371</w:t>
+            </w:r>
+          </w:p>
+        </w:tc>
+        <w:tc>
+          <w:tcPr>
+            <w:tcW w:type="dxa" w:w="2160"/>
+          </w:tcPr>
+          <w:p>
+            <w:r/>
+            <w:r>
+              <w:rPr>
+                <w:sz w:val="18"/>
+              </w:rPr>
+              <w:t>2 shown of 3</w:t>
+            </w:r>
+          </w:p>
+        </w:tc>
+        <w:tc>
+          <w:tcPr>
+            <w:tcW w:type="dxa" w:w="2160"/>
+          </w:tcPr>
+          <w:p>
+            <w:r/>
+            <w:r>
+              <w:rPr>
+                <w:sz w:val="18"/>
+              </w:rPr>
+              <w:t>Near-zero-state and consumed-transition pairs; a moved reset target (5.0 → 7.0) discriminates a genuine hold from a re-reset</w:t>
+            </w:r>
+          </w:p>
+        </w:tc>
+      </w:tr>
+      <w:tr>
+        <w:tc>
+          <w:tcPr>
+            <w:tcW w:type="dxa" w:w="2160"/>
+          </w:tcPr>
+          <w:p>
+            <w:r/>
+            <w:r>
+              <w:rPr>
+                <w:sz w:val="18"/>
+              </w:rPr>
+              <w:t>Armed-update guard (B-D10)</w:t>
+            </w:r>
+          </w:p>
+        </w:tc>
+        <w:tc>
+          <w:tcPr>
+            <w:tcW w:type="dxa" w:w="2160"/>
+          </w:tcPr>
+          <w:p>
+            <w:r/>
+            <w:r>
+              <w:rPr>
+                <w:sz w:val="18"/>
+              </w:rPr>
+              <w:t>line 375</w:t>
+            </w:r>
+          </w:p>
+        </w:tc>
+        <w:tc>
+          <w:tcPr>
+            <w:tcW w:type="dxa" w:w="2160"/>
+          </w:tcPr>
+          <w:p>
+            <w:r/>
+            <w:r>
+              <w:rPr>
+                <w:sz w:val="18"/>
+              </w:rPr>
+              <w:t>2 (armed, finite current)</w:t>
+            </w:r>
+          </w:p>
+        </w:tc>
+        <w:tc>
+          <w:tcPr>
+            <w:tcW w:type="dxa" w:w="2160"/>
+          </w:tcPr>
+          <w:p>
+            <w:r/>
+            <w:r>
+              <w:rPr>
+                <w:sz w:val="18"/>
+              </w:rPr>
+              <w:t>Unarmed-vs-armed and finite-vs-NaN pairs on the remaining-time update path</w:t>
+            </w:r>
+          </w:p>
+        </w:tc>
+      </w:tr>
+      <w:tr>
+        <w:tc>
+          <w:tcPr>
+            <w:tcW w:type="dxa" w:w="2160"/>
+          </w:tcPr>
+          <w:p>
+            <w:r/>
+            <w:r>
+              <w:rPr>
+                <w:sz w:val="18"/>
+              </w:rPr>
+              <w:t>Fixed-wing level-flight gate (B-D11)</w:t>
+            </w:r>
+          </w:p>
+        </w:tc>
+        <w:tc>
+          <w:tcPr>
+            <w:tcW w:type="dxa" w:w="2160"/>
+          </w:tcPr>
+          <w:p>
+            <w:r/>
+            <w:r>
+              <w:rPr>
+                <w:sz w:val="18"/>
+              </w:rPr>
+              <w:t>lines 377–378</w:t>
+            </w:r>
+          </w:p>
+        </w:tc>
+        <w:tc>
+          <w:tcPr>
+            <w:tcW w:type="dxa" w:w="2160"/>
+          </w:tcPr>
+          <w:p>
+            <w:r/>
+            <w:r>
+              <w:rPr>
+                <w:sz w:val="18"/>
+              </w:rPr>
+              <w:t>3 (fixed-wing, fresh stamp, level flight)</w:t>
+            </w:r>
+          </w:p>
+        </w:tc>
+        <w:tc>
+          <w:tcPr>
+            <w:tcW w:type="dxa" w:w="2160"/>
+          </w:tcPr>
+          <w:p>
+            <w:r/>
+            <w:r>
+              <w:rPr>
+                <w:sz w:val="18"/>
+              </w:rPr>
+              <w:t>Multirotor-vs-fixed-wing, fresh-vs-stale, level-vs-climb pairs</w:t>
+            </w:r>
+          </w:p>
+        </w:tc>
+      </w:tr>
+      <w:tr>
+        <w:tc>
+          <w:tcPr>
+            <w:tcW w:type="dxa" w:w="2160"/>
+          </w:tcPr>
+          <w:p>
+            <w:r/>
+            <w:r>
+              <w:rPr>
+                <w:sz w:val="18"/>
+              </w:rPr>
+              <w:t>Hysteresis direction guards (supporting)</w:t>
+            </w:r>
+          </w:p>
+        </w:tc>
+        <w:tc>
+          <w:tcPr>
+            <w:tcW w:type="dxa" w:w="2160"/>
+          </w:tcPr>
+          <w:p>
+            <w:r/>
+            <w:r>
+              <w:rPr>
+                <w:sz w:val="18"/>
+              </w:rPr>
+              <w:t>H-D5, H-D7</w:t>
+            </w:r>
+          </w:p>
+        </w:tc>
+        <w:tc>
+          <w:tcPr>
+            <w:tcW w:type="dxa" w:w="2160"/>
+          </w:tcPr>
+          <w:p>
+            <w:r/>
+            <w:r>
+              <w:rPr>
+                <w:sz w:val="18"/>
+              </w:rPr>
+              <w:t>2 each</w:t>
+            </w:r>
+          </w:p>
+        </w:tc>
+        <w:tc>
+          <w:tcPr>
+            <w:tcW w:type="dxa" w:w="2160"/>
+          </w:tcPr>
+          <w:p>
+            <w:r/>
+            <w:r>
+              <w:rPr>
+                <w:sz w:val="18"/>
+              </w:rPr>
+              <w:t>Armed-vs-quiescent and fired-vs-held pairs at exact expiry boundaries</w:t>
+            </w:r>
+          </w:p>
+        </w:tc>
+      </w:tr>
+      <w:tr>
+        <w:tc>
+          <w:tcPr>
+            <w:tcW w:type="dxa" w:w="2160"/>
+          </w:tcPr>
+          <w:p>
+            <w:r/>
+            <w:r>
+              <w:rPr>
+                <w:sz w:val="18"/>
+              </w:rPr>
+              <w:t>PID derivative guard (supporting)</w:t>
+            </w:r>
+          </w:p>
+        </w:tc>
+        <w:tc>
+          <w:tcPr>
+            <w:tcW w:type="dxa" w:w="2160"/>
+          </w:tcPr>
+          <w:p>
+            <w:r/>
+            <w:r>
+              <w:rPr>
+                <w:sz w:val="18"/>
+              </w:rPr>
+              <w:t>P-D3</w:t>
+            </w:r>
+          </w:p>
+        </w:tc>
+        <w:tc>
+          <w:tcPr>
+            <w:tcW w:type="dxa" w:w="2160"/>
+          </w:tcPr>
+          <w:p>
+            <w:r/>
+            <w:r>
+              <w:rPr>
+                <w:sz w:val="18"/>
+              </w:rPr>
+              <w:t>time × history</w:t>
+            </w:r>
+          </w:p>
+        </w:tc>
+        <w:tc>
+          <w:tcPr>
+            <w:tcW w:type="dxa" w:w="2160"/>
+          </w:tcPr>
+          <w:p>
+            <w:r/>
+            <w:r>
+              <w:rPr>
+                <w:sz w:val="18"/>
+              </w:rPr>
+              <w:t>Time-by-history cases with the exact epsilon boundary</w:t>
+            </w:r>
+          </w:p>
+        </w:tc>
+      </w:tr>
+    </w:tbl>
+    <w:p>
       <w:r>
-        <w:rPr>
-          <w:rFonts w:ascii="Consolas" w:hAnsi="Consolas"/>
-          <w:sz w:val="20"/>
-        </w:rPr>
-        <w:t>px4_add_unit_gtest</w:t>
-      </w:r>
-      <w:r>
-        <w:t xml:space="preserve">, linking only their libraries, while the Battery suite uses </w:t>
-      </w:r>
-      <w:r>
-        <w:rPr>
-          <w:rFonts w:ascii="Consolas" w:hAnsi="Consolas"/>
-          <w:sz w:val="20"/>
-        </w:rPr>
-        <w:t>px4_add_functional_gtest</w:t>
-      </w:r>
-      <w:r>
-        <w:t xml:space="preserve">, which additionally links the functional main, the PX4 layers, uORB, and parameters. Upstream test registrations were left untouched, and there was no upstream battery test to disturb. Every test follows setup–run–check discipline with a freshly constructed object per case, so there is no inter-test state and no ordering dependence: hysteresis and PID drive the public API directly with fixed synthetic timestamps (including exact plus-or-minus-one-microsecond boundaries), while Battery uses a test subclass exposing protected parameters, deterministic thresholds, and fixture-held uORB publications — a design forced by a real discovery that helper-local publications unadvertise on destruction and silently break subscriptions. CMake and registration changes in the patch are three added lines across the hysteresis, PID, and battery build files (plus two lines for the functional registration). Authorship is proven by </w:t>
-      </w:r>
-      <w:r>
-        <w:rPr>
-          <w:rFonts w:ascii="Consolas" w:hAnsi="Consolas"/>
-          <w:sz w:val="20"/>
-        </w:rPr>
-        <w:t>patch/full_reconstruction.patch</w:t>
-      </w:r>
-      <w:r>
-        <w:t xml:space="preserve">, a clean </w:t>
-      </w:r>
-      <w:r>
-        <w:rPr>
-          <w:rFonts w:ascii="Consolas" w:hAnsi="Consolas"/>
-          <w:sz w:val="20"/>
-        </w:rPr>
-        <w:t>git diff</w:t>
-      </w:r>
-      <w:r>
-        <w:t xml:space="preserve"> against v1.17.0 containing 1,140 insertions across six files with zero production-line edits. Execution evidence is complete: baseline logs show upstream 7/7 and 4/4, student logs show 11/11, 17/17, and 33/33, and all five binaries build and run in both the normal and the instrumented coverage configurations from the documented commands.</w:t>
+        <w:t>Reaching each condition required explicit setup, all of it visible in the test bodies: synthetic timestamps, direct parameter control, and fixture-held uORB publications so subscriptions actually receive data. (A real discovery along the way: helper-local publications unadvertise on destruction and silently break subscriptions — a test-design defect we fixed by holding publications in the fixture. This is the correct use of test doubles the course teaches: the doubles serve the production logic, not the other way round.) The conclusion of the analysis is that every atomic condition in this failsafe-critical classification logic can independently decide its outcome on the real code path — except the two cases in §7 that are unreachable by construction rather than by weak testing.</w:t>
       </w:r>
     </w:p>
     <w:p>
@@ -513,12 +1779,266 @@
         <w:rPr>
           <w:color w:val="1F4E79"/>
         </w:rPr>
-        <w:t>7. Coverage measurement and gap analysis</w:t>
+        <w:t>7. Coverage results: baseline versus final</w:t>
       </w:r>
     </w:p>
     <w:p>
       <w:r>
-        <w:t>Coverage was captured before our tests (baseline) and after (final) with lcov and gcov branch coverage, and both machine-readable reports and full HTML are submitted. Hysteresis stands at 22 of 22 lines in both runs with 17 of 20 branch arcs; the three missing arcs are provably unreachable because the operand combinations contradict the line-75 entry guard, as proven by inspection. PID stands at 22 of 22 lines with all 10 of 10 arcs, closing the two non-finite-integral and derivative-guard sub-cases the upstream baseline left open at 8 of 10. Battery, absent from the baseline entirely since no upstream test links the library, reaches 230 of 231 lines (99.6%) with all 19 functions covered and 174 of 248 branch arcs. Our suite's contribution is therefore the entire battery coverage from a zero baseline, plus the hysteresis boundary and MC/DC obligations and the PID sub-arcs upstream never exercised. The remaining gaps are few and each is named precisely. The sole uncovered line is battery line 72, an error log for a missing parameter handle that cannot fire with intact v1.17.0 metadata and would require a corrupted parameter store. The hysteresis arcs above are unreachable by construction. The B-D9 non-finite-average arm is unreachable through the public API because its only writer is itself guarded by the B-D10 finiteness check — defense in depth subsumed downstream. The L356 copy-failure path is not deterministically reachable because it requires a topic withdrawal between the update check and the copy inside a single call; our unadvertised-topic test documents safe behavior there instead. Branch totals also include roughly seventy compiler-generated exception and unwind arcs from matrix, filter, and parameter templates that correspond to no source decision and cannot be driven from the public API; they are reported separately and never excluded. Nothing here is hand-waved, and difficult logic was never omitted to improve a percentage. On MC/DC completeness: every applicable decision — H-D5, H-D7, the four-condition B-D4, B-D8, B-D9's second and third conditions, all of B-D10 including the armed-plus-NaN pair, all of B-D11, and the P-D3 quad — is demonstrated with independence pairs, with only the unreachable B-D9 first condition justified rather than shown.</w:t>
+        <w:t>Coverage was captured with lcov and gcov branch coverage, once before our tests (baseline) and once after (final). Both machine-readable reports and the full final HTML are submitted; the table states the key line and branch results per scope item.</w:t>
+      </w:r>
+    </w:p>
+    <w:tbl>
+      <w:tblPr>
+        <w:tblStyle w:val="LightGrid-Accent1"/>
+        <w:tblW w:type="auto" w:w="0"/>
+        <w:tblLook w:firstColumn="1" w:firstRow="1" w:lastColumn="0" w:lastRow="0" w:noHBand="0" w:noVBand="1" w:val="04A0"/>
+      </w:tblPr>
+      <w:tblGrid>
+        <w:gridCol w:w="2160"/>
+        <w:gridCol w:w="2160"/>
+        <w:gridCol w:w="2160"/>
+        <w:gridCol w:w="2160"/>
+      </w:tblGrid>
+      <w:tr>
+        <w:tc>
+          <w:tcPr>
+            <w:tcW w:type="dxa" w:w="2160"/>
+          </w:tcPr>
+          <w:p>
+            <w:r/>
+            <w:r>
+              <w:rPr>
+                <w:b/>
+                <w:sz w:val="18"/>
+              </w:rPr>
+              <w:t>Scope item</w:t>
+            </w:r>
+          </w:p>
+        </w:tc>
+        <w:tc>
+          <w:tcPr>
+            <w:tcW w:type="dxa" w:w="2160"/>
+          </w:tcPr>
+          <w:p>
+            <w:r/>
+            <w:r>
+              <w:rPr>
+                <w:b/>
+                <w:sz w:val="18"/>
+              </w:rPr>
+              <w:t>Baseline</w:t>
+            </w:r>
+          </w:p>
+        </w:tc>
+        <w:tc>
+          <w:tcPr>
+            <w:tcW w:type="dxa" w:w="2160"/>
+          </w:tcPr>
+          <w:p>
+            <w:r/>
+            <w:r>
+              <w:rPr>
+                <w:b/>
+                <w:sz w:val="18"/>
+              </w:rPr>
+              <w:t>Final lines</w:t>
+            </w:r>
+          </w:p>
+        </w:tc>
+        <w:tc>
+          <w:tcPr>
+            <w:tcW w:type="dxa" w:w="2160"/>
+          </w:tcPr>
+          <w:p>
+            <w:r/>
+            <w:r>
+              <w:rPr>
+                <w:b/>
+                <w:sz w:val="18"/>
+              </w:rPr>
+              <w:t>Final branches</w:t>
+            </w:r>
+          </w:p>
+        </w:tc>
+      </w:tr>
+      <w:tr>
+        <w:tc>
+          <w:tcPr>
+            <w:tcW w:type="dxa" w:w="2160"/>
+          </w:tcPr>
+          <w:p>
+            <w:r/>
+            <w:r>
+              <w:rPr>
+                <w:sz w:val="18"/>
+              </w:rPr>
+              <w:t>Hysteresis</w:t>
+            </w:r>
+          </w:p>
+        </w:tc>
+        <w:tc>
+          <w:tcPr>
+            <w:tcW w:type="dxa" w:w="2160"/>
+          </w:tcPr>
+          <w:p>
+            <w:r/>
+            <w:r>
+              <w:rPr>
+                <w:sz w:val="18"/>
+              </w:rPr>
+              <w:t>22/22 lines, 17/20 arcs (upstream suite)</w:t>
+            </w:r>
+          </w:p>
+        </w:tc>
+        <w:tc>
+          <w:tcPr>
+            <w:tcW w:type="dxa" w:w="2160"/>
+          </w:tcPr>
+          <w:p>
+            <w:r/>
+            <w:r>
+              <w:rPr>
+                <w:sz w:val="18"/>
+              </w:rPr>
+              <w:t>22/22</w:t>
+            </w:r>
+          </w:p>
+        </w:tc>
+        <w:tc>
+          <w:tcPr>
+            <w:tcW w:type="dxa" w:w="2160"/>
+          </w:tcPr>
+          <w:p>
+            <w:r/>
+            <w:r>
+              <w:rPr>
+                <w:sz w:val="18"/>
+              </w:rPr>
+              <w:t>17/20 (3 arcs provably unreachable, §8)</w:t>
+            </w:r>
+          </w:p>
+        </w:tc>
+      </w:tr>
+      <w:tr>
+        <w:tc>
+          <w:tcPr>
+            <w:tcW w:type="dxa" w:w="2160"/>
+          </w:tcPr>
+          <w:p>
+            <w:r/>
+            <w:r>
+              <w:rPr>
+                <w:sz w:val="18"/>
+              </w:rPr>
+              <w:t>PID</w:t>
+            </w:r>
+          </w:p>
+        </w:tc>
+        <w:tc>
+          <w:tcPr>
+            <w:tcW w:type="dxa" w:w="2160"/>
+          </w:tcPr>
+          <w:p>
+            <w:r/>
+            <w:r>
+              <w:rPr>
+                <w:sz w:val="18"/>
+              </w:rPr>
+              <w:t>22/22 lines, 8/10 arcs (upstream suite)</w:t>
+            </w:r>
+          </w:p>
+        </w:tc>
+        <w:tc>
+          <w:tcPr>
+            <w:tcW w:type="dxa" w:w="2160"/>
+          </w:tcPr>
+          <w:p>
+            <w:r/>
+            <w:r>
+              <w:rPr>
+                <w:sz w:val="18"/>
+              </w:rPr>
+              <w:t>22/22</w:t>
+            </w:r>
+          </w:p>
+        </w:tc>
+        <w:tc>
+          <w:tcPr>
+            <w:tcW w:type="dxa" w:w="2160"/>
+          </w:tcPr>
+          <w:p>
+            <w:r/>
+            <w:r>
+              <w:rPr>
+                <w:sz w:val="18"/>
+              </w:rPr>
+              <w:t>10/10 (both gaps closed)</w:t>
+            </w:r>
+          </w:p>
+        </w:tc>
+      </w:tr>
+      <w:tr>
+        <w:tc>
+          <w:tcPr>
+            <w:tcW w:type="dxa" w:w="2160"/>
+          </w:tcPr>
+          <w:p>
+            <w:r/>
+            <w:r>
+              <w:rPr>
+                <w:sz w:val="18"/>
+              </w:rPr>
+              <w:t>Battery</w:t>
+            </w:r>
+          </w:p>
+        </w:tc>
+        <w:tc>
+          <w:tcPr>
+            <w:tcW w:type="dxa" w:w="2160"/>
+          </w:tcPr>
+          <w:p>
+            <w:r/>
+            <w:r>
+              <w:rPr>
+                <w:sz w:val="18"/>
+              </w:rPr>
+              <w:t>absent — no upstream test links the library</w:t>
+            </w:r>
+          </w:p>
+        </w:tc>
+        <w:tc>
+          <w:tcPr>
+            <w:tcW w:type="dxa" w:w="2160"/>
+          </w:tcPr>
+          <w:p>
+            <w:r/>
+            <w:r>
+              <w:rPr>
+                <w:sz w:val="18"/>
+              </w:rPr>
+              <w:t>230/231 (99.6%), all 19 functions</w:t>
+            </w:r>
+          </w:p>
+        </w:tc>
+        <w:tc>
+          <w:tcPr>
+            <w:tcW w:type="dxa" w:w="2160"/>
+          </w:tcPr>
+          <w:p>
+            <w:r/>
+            <w:r>
+              <w:rPr>
+                <w:sz w:val="18"/>
+              </w:rPr>
+              <w:t>174/248 (see §8 for the accounting)</w:t>
+            </w:r>
+          </w:p>
+        </w:tc>
+      </w:tr>
+    </w:tbl>
+    <w:p>
+      <w:r>
+        <w:t>Our contribution is therefore the entire Battery coverage from a zero baseline, plus the hysteresis boundary and MC/DC obligations and the two PID sub-cases (non-finite integral, derivative guard) that the upstream baseline left open.</w:t>
       </w:r>
     </w:p>
     <w:p>
@@ -529,12 +2049,428 @@
         <w:rPr>
           <w:color w:val="1F4E79"/>
         </w:rPr>
-        <w:t>8. Findings, limitations, and improvements</w:t>
+        <w:t>8. Findings, gaps, limitations, and improvements</w:t>
       </w:r>
     </w:p>
     <w:p>
       <w:r>
-        <w:t xml:space="preserve">Eight student-test failures occurred during development, and each was investigated before any defect claim — setup, expected values, and dependency behavior first — and each resolved as a wrong test-side expectation with production code untouched: two inverted models of the L130 reset gate's pre-init firing; one NaN output where IEEE semantics give NaN for infinite feedback while the integral guard itself held; two D-term sign errors against the PLUS in PID line 47; and three saturation expectations written against a freeze gate that does not exist in v1.17.0. No reproducible production defect was found, and none is manufactured to fill a quota — the suite is green because the covered logic met its specification on the exercised paths. Our conclusions stay limited to what was analyzed and executed. Residual risks are: only three of thousands of PX4 files are covered, so failsafe consumers, estimators, controllers, and drivers are outside the evidence; the L72 corrupted-parameter path is untested by construction; estimator convergence was shown only on synthetic steps, never on real noisy flight data; fixed-wing remaining-time paths used synthetic phase stamps rather than estimator output; and all timing is synthetic, so real-time scheduling effects are out of scope. Concretely, we recommend replaying long-horizon current and voltage traces through state-of-charge estimation, adding a scratch-store test for the corrupted-parameter path, covering the fixed-wing gate with estimator-produced phase data in simulation, and upstreaming this first-ever Battery functional test so its zero baseline never returns. An independent consistency audit by Taimoor Khalid (audit report, gap analysis with per-arc BRDA classification, packaging checklist in </w:t>
+        <w:rPr>
+          <w:b/>
+        </w:rPr>
+        <w:t>Defects found: none reproducible in production code.</w:t>
+      </w:r>
+      <w:r>
+        <w:t xml:space="preserve"> The eight development failures in §5 were all test-side expectation errors, corrected without touching production code, and no defect is manufactured to fill a quota. The suite is green because the covered logic met its specification on the exercised paths.</w:t>
+      </w:r>
+    </w:p>
+    <w:p>
+      <w:r>
+        <w:rPr>
+          <w:b/>
+        </w:rPr>
+        <w:t>Remaining gaps — each named exactly, with the reason and what would be needed.</w:t>
+      </w:r>
+      <w:r>
+        <w:t xml:space="preserve"> Branch totals include roughly seventy compiler-generated exception and unwind arcs from matrix, filter, and parameter templates; these correspond to no source decision, cannot be driven from the public API, and are reported separately rather than excluded.</w:t>
+      </w:r>
+    </w:p>
+    <w:tbl>
+      <w:tblPr>
+        <w:tblStyle w:val="LightGrid-Accent1"/>
+        <w:tblW w:type="auto" w:w="0"/>
+        <w:tblLook w:firstColumn="1" w:firstRow="1" w:lastColumn="0" w:lastRow="0" w:noHBand="0" w:noVBand="1" w:val="04A0"/>
+      </w:tblPr>
+      <w:tblGrid>
+        <w:gridCol w:w="1728"/>
+        <w:gridCol w:w="1728"/>
+        <w:gridCol w:w="1728"/>
+        <w:gridCol w:w="1728"/>
+        <w:gridCol w:w="1728"/>
+      </w:tblGrid>
+      <w:tr>
+        <w:tc>
+          <w:tcPr>
+            <w:tcW w:type="dxa" w:w="1728"/>
+          </w:tcPr>
+          <w:p>
+            <w:r/>
+            <w:r>
+              <w:rPr>
+                <w:b/>
+                <w:sz w:val="18"/>
+              </w:rPr>
+              <w:t>Gap</w:t>
+            </w:r>
+          </w:p>
+        </w:tc>
+        <w:tc>
+          <w:tcPr>
+            <w:tcW w:type="dxa" w:w="1728"/>
+          </w:tcPr>
+          <w:p>
+            <w:r/>
+            <w:r>
+              <w:rPr>
+                <w:b/>
+                <w:sz w:val="18"/>
+              </w:rPr>
+              <w:t>Location</w:t>
+            </w:r>
+          </w:p>
+        </w:tc>
+        <w:tc>
+          <w:tcPr>
+            <w:tcW w:type="dxa" w:w="1728"/>
+          </w:tcPr>
+          <w:p>
+            <w:r/>
+            <w:r>
+              <w:rPr>
+                <w:b/>
+                <w:sz w:val="18"/>
+              </w:rPr>
+              <w:t>Status</w:t>
+            </w:r>
+          </w:p>
+        </w:tc>
+        <w:tc>
+          <w:tcPr>
+            <w:tcW w:type="dxa" w:w="1728"/>
+          </w:tcPr>
+          <w:p>
+            <w:r/>
+            <w:r>
+              <w:rPr>
+                <w:b/>
+                <w:sz w:val="18"/>
+              </w:rPr>
+              <w:t>Why it remains</w:t>
+            </w:r>
+          </w:p>
+        </w:tc>
+        <w:tc>
+          <w:tcPr>
+            <w:tcW w:type="dxa" w:w="1728"/>
+          </w:tcPr>
+          <w:p>
+            <w:r/>
+            <w:r>
+              <w:rPr>
+                <w:b/>
+                <w:sz w:val="18"/>
+              </w:rPr>
+              <w:t>What would be needed</w:t>
+            </w:r>
+          </w:p>
+        </w:tc>
+      </w:tr>
+      <w:tr>
+        <w:tc>
+          <w:tcPr>
+            <w:tcW w:type="dxa" w:w="1728"/>
+          </w:tcPr>
+          <w:p>
+            <w:r/>
+            <w:r>
+              <w:rPr>
+                <w:sz w:val="18"/>
+              </w:rPr>
+              <w:t>Missing-parameter error log</w:t>
+            </w:r>
+          </w:p>
+        </w:tc>
+        <w:tc>
+          <w:tcPr>
+            <w:tcW w:type="dxa" w:w="1728"/>
+          </w:tcPr>
+          <w:p>
+            <w:r/>
+            <w:r>
+              <w:rPr>
+                <w:sz w:val="18"/>
+              </w:rPr>
+              <w:t>Battery line 72</w:t>
+            </w:r>
+          </w:p>
+        </w:tc>
+        <w:tc>
+          <w:tcPr>
+            <w:tcW w:type="dxa" w:w="1728"/>
+          </w:tcPr>
+          <w:p>
+            <w:r/>
+            <w:r>
+              <w:rPr>
+                <w:sz w:val="18"/>
+              </w:rPr>
+              <w:t>Uncovered line (the only one)</w:t>
+            </w:r>
+          </w:p>
+        </w:tc>
+        <w:tc>
+          <w:tcPr>
+            <w:tcW w:type="dxa" w:w="1728"/>
+          </w:tcPr>
+          <w:p>
+            <w:r/>
+            <w:r>
+              <w:rPr>
+                <w:sz w:val="18"/>
+              </w:rPr>
+              <w:t>Cannot fire with intact v1.17.0 parameter metadata</w:t>
+            </w:r>
+          </w:p>
+        </w:tc>
+        <w:tc>
+          <w:tcPr>
+            <w:tcW w:type="dxa" w:w="1728"/>
+          </w:tcPr>
+          <w:p>
+            <w:r/>
+            <w:r>
+              <w:rPr>
+                <w:sz w:val="18"/>
+              </w:rPr>
+              <w:t>A corrupted parameter store (scratch-store test), proposed below</w:t>
+            </w:r>
+          </w:p>
+        </w:tc>
+      </w:tr>
+      <w:tr>
+        <w:tc>
+          <w:tcPr>
+            <w:tcW w:type="dxa" w:w="1728"/>
+          </w:tcPr>
+          <w:p>
+            <w:r/>
+            <w:r>
+              <w:rPr>
+                <w:sz w:val="18"/>
+              </w:rPr>
+              <w:t>Three hysteresis arcs</w:t>
+            </w:r>
+          </w:p>
+        </w:tc>
+        <w:tc>
+          <w:tcPr>
+            <w:tcW w:type="dxa" w:w="1728"/>
+          </w:tcPr>
+          <w:p>
+            <w:r/>
+            <w:r>
+              <w:rPr>
+                <w:sz w:val="18"/>
+              </w:rPr>
+              <w:t>H-D5/H-D7 sub-cases</w:t>
+            </w:r>
+          </w:p>
+        </w:tc>
+        <w:tc>
+          <w:tcPr>
+            <w:tcW w:type="dxa" w:w="1728"/>
+          </w:tcPr>
+          <w:p>
+            <w:r/>
+            <w:r>
+              <w:rPr>
+                <w:sz w:val="18"/>
+              </w:rPr>
+              <w:t>Unreachable by construction</w:t>
+            </w:r>
+          </w:p>
+        </w:tc>
+        <w:tc>
+          <w:tcPr>
+            <w:tcW w:type="dxa" w:w="1728"/>
+          </w:tcPr>
+          <w:p>
+            <w:r/>
+            <w:r>
+              <w:rPr>
+                <w:sz w:val="18"/>
+              </w:rPr>
+              <w:t>The operand combinations contradict the line-75 entry guard (proven by inspection, backed by branch data)</w:t>
+            </w:r>
+          </w:p>
+        </w:tc>
+        <w:tc>
+          <w:tcPr>
+            <w:tcW w:type="dxa" w:w="1728"/>
+          </w:tcPr>
+          <w:p>
+            <w:r/>
+            <w:r>
+              <w:rPr>
+                <w:sz w:val="18"/>
+              </w:rPr>
+              <w:t>Nothing — no input can reach them</w:t>
+            </w:r>
+          </w:p>
+        </w:tc>
+      </w:tr>
+      <w:tr>
+        <w:tc>
+          <w:tcPr>
+            <w:tcW w:type="dxa" w:w="1728"/>
+          </w:tcPr>
+          <w:p>
+            <w:r/>
+            <w:r>
+              <w:rPr>
+                <w:sz w:val="18"/>
+              </w:rPr>
+              <w:t>Non-finite-average arm</w:t>
+            </w:r>
+          </w:p>
+        </w:tc>
+        <w:tc>
+          <w:tcPr>
+            <w:tcW w:type="dxa" w:w="1728"/>
+          </w:tcPr>
+          <w:p>
+            <w:r/>
+            <w:r>
+              <w:rPr>
+                <w:sz w:val="18"/>
+              </w:rPr>
+              <w:t>B-D9 first condition</w:t>
+            </w:r>
+          </w:p>
+        </w:tc>
+        <w:tc>
+          <w:tcPr>
+            <w:tcW w:type="dxa" w:w="1728"/>
+          </w:tcPr>
+          <w:p>
+            <w:r/>
+            <w:r>
+              <w:rPr>
+                <w:sz w:val="18"/>
+              </w:rPr>
+              <w:t>Unreachable via public API</w:t>
+            </w:r>
+          </w:p>
+        </w:tc>
+        <w:tc>
+          <w:tcPr>
+            <w:tcW w:type="dxa" w:w="1728"/>
+          </w:tcPr>
+          <w:p>
+            <w:r/>
+            <w:r>
+              <w:rPr>
+                <w:sz w:val="18"/>
+              </w:rPr>
+              <w:t>Its only writer is itself guarded by the B-D10 finiteness check — defense in depth, subsumed downstream</w:t>
+            </w:r>
+          </w:p>
+        </w:tc>
+        <w:tc>
+          <w:tcPr>
+            <w:tcW w:type="dxa" w:w="1728"/>
+          </w:tcPr>
+          <w:p>
+            <w:r/>
+            <w:r>
+              <w:rPr>
+                <w:sz w:val="18"/>
+              </w:rPr>
+              <w:t>Nothing through the public API</w:t>
+            </w:r>
+          </w:p>
+        </w:tc>
+      </w:tr>
+      <w:tr>
+        <w:tc>
+          <w:tcPr>
+            <w:tcW w:type="dxa" w:w="1728"/>
+          </w:tcPr>
+          <w:p>
+            <w:r/>
+            <w:r>
+              <w:rPr>
+                <w:sz w:val="18"/>
+              </w:rPr>
+              <w:t>Copy-failure path</w:t>
+            </w:r>
+          </w:p>
+        </w:tc>
+        <w:tc>
+          <w:tcPr>
+            <w:tcW w:type="dxa" w:w="1728"/>
+          </w:tcPr>
+          <w:p>
+            <w:r/>
+            <w:r>
+              <w:rPr>
+                <w:sz w:val="18"/>
+              </w:rPr>
+              <w:t>Battery line 356</w:t>
+            </w:r>
+          </w:p>
+        </w:tc>
+        <w:tc>
+          <w:tcPr>
+            <w:tcW w:type="dxa" w:w="1728"/>
+          </w:tcPr>
+          <w:p>
+            <w:r/>
+            <w:r>
+              <w:rPr>
+                <w:sz w:val="18"/>
+              </w:rPr>
+              <w:t>Not deterministically reachable</w:t>
+            </w:r>
+          </w:p>
+        </w:tc>
+        <w:tc>
+          <w:tcPr>
+            <w:tcW w:type="dxa" w:w="1728"/>
+          </w:tcPr>
+          <w:p>
+            <w:r/>
+            <w:r>
+              <w:rPr>
+                <w:sz w:val="18"/>
+              </w:rPr>
+              <w:t>Requires a topic withdrawal between the update check and the copy inside a single call</w:t>
+            </w:r>
+          </w:p>
+        </w:tc>
+        <w:tc>
+          <w:tcPr>
+            <w:tcW w:type="dxa" w:w="1728"/>
+          </w:tcPr>
+          <w:p>
+            <w:r/>
+            <w:r>
+              <w:rPr>
+                <w:sz w:val="18"/>
+              </w:rPr>
+              <w:t>Fault-injection at the uORB layer; our unadvertised-topic test documents safe behavior there instead</w:t>
+            </w:r>
+          </w:p>
+        </w:tc>
+      </w:tr>
+    </w:tbl>
+    <w:p>
+      <w:r>
+        <w:rPr>
+          <w:b/>
+        </w:rPr>
+        <w:t>Limitations of what this evidence can claim.</w:t>
+      </w:r>
+      <w:r>
+        <w:t xml:space="preserve"> Only three of thousands of PX4 files are covered, so failsafe consumers, estimators, controllers, and drivers are outside the evidence. Estimator convergence was shown only on synthetic steps, never on real noisy flight data. Fixed-wing remaining-time paths used synthetic phase stamps rather than estimator output. All timing is synthetic, so real-time scheduling effects are out of scope. </w:t>
+      </w:r>
+      <w:r>
+        <w:rPr>
+          <w:b/>
+        </w:rPr>
+        <w:t>Improvements proposed:</w:t>
+      </w:r>
+      <w:r>
+        <w:t xml:space="preserve"> replay long-horizon current/voltage traces through charge estimation, add the corrupted-parameter scratch-store test, cover the fixed-wing gate with estimator-produced phase data in simulation, and upstream this first-ever Battery functional test so its zero baseline never returns. An independent consistency audit by Taimoor Khalid (audit report, per-arc gap classification, packaging checklist in </w:t>
       </w:r>
       <w:r>
         <w:rPr>
@@ -544,7 +2480,7 @@
         <w:t>taimoor/</w:t>
       </w:r>
       <w:r>
-        <w:t>) verified hashes, counts, patch applicability, and every gap claim against the evidence; its findings were each re-verified and either closed with new probe tests or absorbed into this report.</w:t>
+        <w:t>) verified hashes, counts, patch applicability, and every gap claim against the evidence; each finding was re-verified and either closed with new probe tests or absorbed into this report.</w:t>
       </w:r>
     </w:p>
     <w:p>

</xml_diff>

<commit_message>
Option B: add Gyroscope scope (34 tests, 112/112 lines); workbook 95 rows; report + packages resynced
</commit_message>
<xml_diff>
--- a/24i3102_24i3052_24i3072_C_Report.docx
+++ b/24i3102_24i3052_24i3072_C_Report.docx
@@ -72,7 +72,7 @@
     </w:p>
     <w:p>
       <w:r>
-        <w:t>We structurally tested three production areas of PX4 v1.17.0, wrote 61 tests of our own against them, measured statement and branch coverage before and after, and performed MC/DC analysis on the failsafe-critical Battery component. No production code was changed at any point. This report records the group, the machine and baseline everything traces to, why these three areas were chosen, how each test was derived from the production logic, what the MC/DC evidence shows, what coverage was achieved, what gaps remain and why, and a final judgment on what the evidence does and does not prove.</w:t>
+        <w:t>We structurally tested four production areas of PX4 v1.17.0, wrote 95 tests of our own against them, measured statement and branch coverage before and after, and performed MC/DC analysis on the failsafe-critical Battery component. No production code was changed at any point. This report records the group, the machine and baseline everything traces to, why these three areas were chosen, how each test was derived from the production logic, what the MC/DC evidence shows, what coverage was achieved, what gaps remain and why, and a final judgment on what the evidence does and does not prove.</w:t>
       </w:r>
     </w:p>
     <w:p>
@@ -432,7 +432,7 @@
     </w:p>
     <w:p>
       <w:r>
-        <w:t>We read the production code first and selected three areas. Each one is real control or business logic with decisions worth testing — not a wrapper, not branch-free math, and not generated or GUI code. The Battery file in particular is a large, substantial component (497 lines) covering state-of-charge fusion, internal-resistance estimation, warning and fault classification, and remaining-time estimation. Across the three areas we exercise roughly 274 lines of production logic, the great majority of it inside Battery's failsafe paths.</w:t>
+        <w:t>We read the production code first and selected four areas. Each one is real control or business logic with decisions worth testing — not a wrapper, not branch-free math, and not generated or GUI code. The Battery file is a large, substantial component (497 lines) covering state-of-charge fusion, internal-resistance estimation, warning and fault classification, and remaining-time estimation; the Gyroscope calibration file (284 lines) decides which calibration every gyro flies with — device selection, slot binding, parameter load/save with validity guards, and thermal-offset correction. Across the four areas we exercise 386 lines of production logic, the great majority of it inside Battery's failsafe paths and Gyroscope's calibration chain.</w:t>
       </w:r>
     </w:p>
     <w:tbl>
@@ -799,6 +799,92 @@
           </w:p>
         </w:tc>
       </w:tr>
+      <w:tr>
+        <w:tc>
+          <w:tcPr>
+            <w:tcW w:type="dxa" w:w="1440"/>
+          </w:tcPr>
+          <w:p>
+            <w:r/>
+            <w:r>
+              <w:rPr>
+                <w:sz w:val="18"/>
+              </w:rPr>
+              <w:t>4</w:t>
+            </w:r>
+          </w:p>
+        </w:tc>
+        <w:tc>
+          <w:tcPr>
+            <w:tcW w:type="dxa" w:w="1440"/>
+          </w:tcPr>
+          <w:p>
+            <w:r/>
+            <w:r>
+              <w:rPr>
+                <w:sz w:val="18"/>
+              </w:rPr>
+              <w:t>`src/lib/sensor_calibration/Gyroscope.cpp`</w:t>
+            </w:r>
+          </w:p>
+        </w:tc>
+        <w:tc>
+          <w:tcPr>
+            <w:tcW w:type="dxa" w:w="1440"/>
+          </w:tcPr>
+          <w:p>
+            <w:r/>
+            <w:r>
+              <w:rPr>
+                <w:sz w:val="18"/>
+              </w:rPr>
+              <w:t>Decides which calibration each gyroscope flies with: device selection, calibration-slot binding, parameter load/save with validity guards, thermal-offset correction from uORB</w:t>
+            </w:r>
+          </w:p>
+        </w:tc>
+        <w:tc>
+          <w:tcPr>
+            <w:tcW w:type="dxa" w:w="1440"/>
+          </w:tcPr>
+          <w:p>
+            <w:r/>
+            <w:r>
+              <w:rPr>
+                <w:sz w:val="18"/>
+              </w:rPr>
+              <w:t>Calibration correctness feeds attitude estimation, so it is flight-safety logic; depends on parameters and the sensor_correction topic (functional level); no upstream test covers this library, so its baseline coverage was zero</w:t>
+            </w:r>
+          </w:p>
+        </w:tc>
+        <w:tc>
+          <w:tcPr>
+            <w:tcW w:type="dxa" w:w="1440"/>
+          </w:tcPr>
+          <w:p>
+            <w:r/>
+            <w:r>
+              <w:rPr>
+                <w:sz w:val="18"/>
+              </w:rPr>
+              <w:t>284 lines</w:t>
+            </w:r>
+          </w:p>
+        </w:tc>
+        <w:tc>
+          <w:tcPr>
+            <w:tcW w:type="dxa" w:w="1440"/>
+          </w:tcPr>
+          <w:p>
+            <w:r/>
+            <w:r>
+              <w:rPr>
+                <w:sz w:val="18"/>
+              </w:rPr>
+              <w:t>GTest functional</w:t>
+            </w:r>
+          </w:p>
+        </w:tc>
+      </w:tr>
     </w:tbl>
     <w:p>
       <w:r>
@@ -868,7 +954,7 @@
         <w:t>||</w:t>
       </w:r>
       <w:r>
-        <w:t xml:space="preserve"> in the three files became a decision that must be shown both true and false. Every boundary comparison (</w:t>
+        <w:t xml:space="preserve"> in the four files became a decision that must be shown both true and false. Every boundary comparison (</w:t>
       </w:r>
       <w:r>
         <w:rPr>
@@ -888,7 +974,7 @@
         <w:t>&lt;</w:t>
       </w:r>
       <w:r>
-        <w:t>, exact constants such as the 1.05 over-voltage factor) became a boundary test at the exact value and one step on either side. Every invalid or error path (NaN, infinity, zero cells, unconnected battery, stale timestamps) became an error or robustness test. The resulting suites and the decisions they discharge are summarized below; the per-test record (61 rows: HST-01–11, BST-01–33, PST-01–17) is workbook Sheet 1.</w:t>
+        <w:t>, exact constants such as the 1.05 over-voltage factor, the 0.01 offset-epsilon, the calibration-index bounds) became a boundary test at the exact value and one step on either side. Every invalid or error path (NaN, infinity, zero cells, unconnected battery, stale timestamps, unbound calibration slots, out-of-range desired slots, unadvertised topics) became an error or robustness test. The resulting suites and the decisions they discharge are summarized below; the per-test record (95 rows: HST-01–11, BST-01–33, PST-01–17, GST-01–34) is workbook Sheet 1.</w:t>
       </w:r>
     </w:p>
     <w:tbl>
@@ -1197,6 +1283,78 @@
           </w:p>
         </w:tc>
       </w:tr>
+      <w:tr>
+        <w:tc>
+          <w:tcPr>
+            <w:tcW w:type="dxa" w:w="1728"/>
+          </w:tcPr>
+          <w:p>
+            <w:r/>
+            <w:r>
+              <w:rPr>
+                <w:sz w:val="18"/>
+              </w:rPr>
+              <w:t>`GyroscopeStructural`</w:t>
+            </w:r>
+          </w:p>
+        </w:tc>
+        <w:tc>
+          <w:tcPr>
+            <w:tcW w:type="dxa" w:w="1728"/>
+          </w:tcPr>
+          <w:p>
+            <w:r/>
+            <w:r>
+              <w:rPr>
+                <w:sz w:val="18"/>
+              </w:rPr>
+              <w:t>Functional</w:t>
+            </w:r>
+          </w:p>
+        </w:tc>
+        <w:tc>
+          <w:tcPr>
+            <w:tcW w:type="dxa" w:w="1728"/>
+          </w:tcPr>
+          <w:p>
+            <w:r/>
+            <w:r>
+              <w:rPr>
+                <w:sz w:val="18"/>
+              </w:rPr>
+              <w:t>34</w:t>
+            </w:r>
+          </w:p>
+        </w:tc>
+        <w:tc>
+          <w:tcPr>
+            <w:tcW w:type="dxa" w:w="1728"/>
+          </w:tcPr>
+          <w:p>
+            <w:r/>
+            <w:r>
+              <w:rPr>
+                <w:sz w:val="18"/>
+              </w:rPr>
+              <w:t>G-D1–G-D13: device selection (internal/external determinism via bus-type bits), correction-slot lookup across all four slots, offset epsilon and finiteness guards, index bounds, parameter load validity guards, save slot search with out-of-range and no-slot cases, rotation round-trip math</w:t>
+            </w:r>
+          </w:p>
+        </w:tc>
+        <w:tc>
+          <w:tcPr>
+            <w:tcW w:type="dxa" w:w="1728"/>
+          </w:tcPr>
+          <w:p>
+            <w:r/>
+            <w:r>
+              <w:rPr>
+                <w:sz w:val="18"/>
+              </w:rPr>
+              <w:t>34/34 pass</w:t>
+            </w:r>
+          </w:p>
+        </w:tc>
+      </w:tr>
     </w:tbl>
     <w:p>
       <w:r>
@@ -1226,7 +1384,7 @@
     </w:p>
     <w:p>
       <w:r>
-        <w:t xml:space="preserve">All five binaries build and run in both the normal and the instrumented coverage configurations. Baseline: upstream </w:t>
+        <w:t xml:space="preserve">All six binaries build and run in both the normal and the instrumented coverage configurations. Baseline: upstream </w:t>
       </w:r>
       <w:r>
         <w:rPr>
@@ -1246,7 +1404,7 @@
         <w:t>unit-PID</w:t>
       </w:r>
       <w:r>
-        <w:t xml:space="preserve"> 4/4. Student suites: 11/11, 17/17, 33/33. The logs in </w:t>
+        <w:t xml:space="preserve"> 4/4. Student suites: 11/11, 17/17, 33/33, and 34/34 for the new Gyroscope suite, which passed every test from its first green run through all three coverage rounds. The logs in </w:t>
       </w:r>
       <w:r>
         <w:rPr>
@@ -1768,7 +1926,7 @@
     </w:tbl>
     <w:p>
       <w:r>
-        <w:t>Reaching each condition required explicit setup, all of it visible in the test bodies: synthetic timestamps, direct parameter control, and fixture-held uORB publications so subscriptions actually receive data. (A real discovery along the way: helper-local publications unadvertise on destruction and silently break subscriptions — a test-design defect we fixed by holding publications in the fixture. This is the correct use of test doubles the course teaches: the doubles serve the production logic, not the other way round.) The conclusion of the analysis is that every atomic condition in this failsafe-critical classification logic can independently decide its outcome on the real code path — except the two cases in §7 that are unreachable by construction rather than by weak testing.</w:t>
+        <w:t>Reaching each condition required explicit setup, all of it visible in the test bodies: synthetic timestamps, direct parameter control, and fixture-held uORB publications so subscriptions actually receive data. (A real discovery along the way: helper-local publications unadvertise on destruction and silently break subscriptions — a test-design defect we fixed by holding publications in the fixture. This is the correct use of test doubles the course teaches: the doubles serve the production logic, not the other way round.) The conclusion of the analysis is that every atomic condition in this failsafe-critical classification logic can independently decide its outcome on the real code path — except the two cases in §7 that are unreachable by construction rather than by weak testing. The Gyroscope file's compound gates are all simple two-condition guards, so no new MC/DC claim is made for it: its 34 tests provide statement, branch, and condition/decision evidence, and the submission's MC/DC claim rests entirely on Battery's five substantive decisions above.</w:t>
       </w:r>
     </w:p>
     <w:p>
@@ -2035,10 +2193,78 @@
           </w:p>
         </w:tc>
       </w:tr>
+      <w:tr>
+        <w:tc>
+          <w:tcPr>
+            <w:tcW w:type="dxa" w:w="2160"/>
+          </w:tcPr>
+          <w:p>
+            <w:r/>
+            <w:r>
+              <w:rPr>
+                <w:sz w:val="18"/>
+              </w:rPr>
+              <w:t>Gyroscope</w:t>
+            </w:r>
+          </w:p>
+        </w:tc>
+        <w:tc>
+          <w:tcPr>
+            <w:tcW w:type="dxa" w:w="2160"/>
+          </w:tcPr>
+          <w:p>
+            <w:r/>
+            <w:r>
+              <w:rPr>
+                <w:sz w:val="18"/>
+              </w:rPr>
+              <w:t>absent — no upstream test covers this library</w:t>
+            </w:r>
+          </w:p>
+        </w:tc>
+        <w:tc>
+          <w:tcPr>
+            <w:tcW w:type="dxa" w:w="2160"/>
+          </w:tcPr>
+          <w:p>
+            <w:r/>
+            <w:r>
+              <w:rPr>
+                <w:sz w:val="18"/>
+              </w:rPr>
+              <w:t>112/112 (100%), all 12 functions</w:t>
+            </w:r>
+          </w:p>
+        </w:tc>
+        <w:tc>
+          <w:tcPr>
+            <w:tcW w:type="dxa" w:w="2160"/>
+          </w:tcPr>
+          <w:p>
+            <w:r/>
+            <w:r>
+              <w:rPr>
+                <w:sz w:val="18"/>
+              </w:rPr>
+              <w:t>112/145 (see §8 for the accounting)</w:t>
+            </w:r>
+          </w:p>
+        </w:tc>
+      </w:tr>
     </w:tbl>
     <w:p>
       <w:r>
-        <w:t>Our contribution is therefore the entire Battery coverage from a zero baseline, plus the hysteresis boundary and MC/DC obligations and the two PID sub-cases (non-finite integral, derivative guard) that the upstream baseline left open.</w:t>
+        <w:t xml:space="preserve">Our contribution is therefore the entire Battery and Gyroscope coverage from a zero baseline on both, plus the hysteresis boundary and MC/DC obligations and the two PID sub-cases (non-finite integral, derivative guard) that the upstream baseline left open. The calibration helper </w:t>
+      </w:r>
+      <w:r>
+        <w:rPr>
+          <w:rFonts w:ascii="Consolas" w:hAnsi="Consolas"/>
+          <w:sz w:val="20"/>
+        </w:rPr>
+        <w:t>Utilities.cpp</w:t>
+      </w:r>
+      <w:r>
+        <w:t xml:space="preserve"> is a dependency, not a scope item: it receives incidental coverage (80/112 lines) from the Gyroscope tests, which is reported here for completeness and claimed for nothing.</w:t>
       </w:r>
     </w:p>
     <w:p>
@@ -2452,6 +2678,150 @@
           </w:p>
         </w:tc>
       </w:tr>
+      <w:tr>
+        <w:tc>
+          <w:tcPr>
+            <w:tcW w:type="dxa" w:w="1728"/>
+          </w:tcPr>
+          <w:p>
+            <w:r/>
+            <w:r>
+              <w:rPr>
+                <w:sz w:val="18"/>
+              </w:rPr>
+              <w:t>28 compiler arcs</w:t>
+            </w:r>
+          </w:p>
+        </w:tc>
+        <w:tc>
+          <w:tcPr>
+            <w:tcW w:type="dxa" w:w="1728"/>
+          </w:tcPr>
+          <w:p>
+            <w:r/>
+            <w:r>
+              <w:rPr>
+                <w:sz w:val="18"/>
+              </w:rPr>
+              <w:t>Gyroscope.cpp call lines (46, 84, 90–129, 196, 248)</w:t>
+            </w:r>
+          </w:p>
+        </w:tc>
+        <w:tc>
+          <w:tcPr>
+            <w:tcW w:type="dxa" w:w="1728"/>
+          </w:tcPr>
+          <w:p>
+            <w:r/>
+            <w:r>
+              <w:rPr>
+                <w:sz w:val="18"/>
+              </w:rPr>
+              <w:t>Never taken across 34 passing tests</w:t>
+            </w:r>
+          </w:p>
+        </w:tc>
+        <w:tc>
+          <w:tcPr>
+            <w:tcW w:type="dxa" w:w="1728"/>
+          </w:tcPr>
+          <w:p>
+            <w:r/>
+            <w:r>
+              <w:rPr>
+                <w:sz w:val="18"/>
+              </w:rPr>
+              <w:t>Exception/unwind arcs on lines whose calls have no source-level branch — same category as Battery's ~70; backed by per-arc branch data</w:t>
+            </w:r>
+          </w:p>
+        </w:tc>
+        <w:tc>
+          <w:tcPr>
+            <w:tcW w:type="dxa" w:w="1728"/>
+          </w:tcPr>
+          <w:p>
+            <w:r/>
+            <w:r>
+              <w:rPr>
+                <w:sz w:val="18"/>
+              </w:rPr>
+              <w:t>Nothing — no test input drives unwind paths</w:t>
+            </w:r>
+          </w:p>
+        </w:tc>
+      </w:tr>
+      <w:tr>
+        <w:tc>
+          <w:tcPr>
+            <w:tcW w:type="dxa" w:w="1728"/>
+          </w:tcPr>
+          <w:p>
+            <w:r/>
+            <w:r>
+              <w:rPr>
+                <w:sz w:val="18"/>
+              </w:rPr>
+              <w:t>5 gyro guard arcs</w:t>
+            </w:r>
+          </w:p>
+        </w:tc>
+        <w:tc>
+          <w:tcPr>
+            <w:tcW w:type="dxa" w:w="1728"/>
+          </w:tcPr>
+          <w:p>
+            <w:r/>
+            <w:r>
+              <w:rPr>
+                <w:sz w:val="18"/>
+              </w:rPr>
+              <w:t>Gyroscope.cpp L60, L88, L161, L231, L243</w:t>
+            </w:r>
+          </w:p>
+        </w:tc>
+        <w:tc>
+          <w:tcPr>
+            <w:tcW w:type="dxa" w:w="1728"/>
+          </w:tcPr>
+          <w:p>
+            <w:r/>
+            <w:r>
+              <w:rPr>
+                <w:sz w:val="18"/>
+              </w:rPr>
+              <w:t>Unreachable by construction</w:t>
+            </w:r>
+          </w:p>
+        </w:tc>
+        <w:tc>
+          <w:tcPr>
+            <w:tcW w:type="dxa" w:w="1728"/>
+          </w:tcPr>
+          <w:p>
+            <w:r/>
+            <w:r>
+              <w:rPr>
+                <w:sz w:val="18"/>
+              </w:rPr>
+              <w:t>Same device id always yields the same externality (L60); switch index is loop-bounded to 0–3 (L88); index ≥ 4 unreachable via the public API (L161, L243); a valid desired index equal to the bound index always takes the direct-bind path first (L231)</w:t>
+            </w:r>
+          </w:p>
+        </w:tc>
+        <w:tc>
+          <w:tcPr>
+            <w:tcW w:type="dxa" w:w="1728"/>
+          </w:tcPr>
+          <w:p>
+            <w:r/>
+            <w:r>
+              <w:rPr>
+                <w:sz w:val="18"/>
+              </w:rPr>
+              <w:t>Nothing — proven by inspection against the setter, Reset, and slot-search code</w:t>
+            </w:r>
+          </w:p>
+        </w:tc>
+      </w:tr>
     </w:tbl>
     <w:p>
       <w:r>
@@ -2461,7 +2831,7 @@
         <w:t>Limitations of what this evidence can claim.</w:t>
       </w:r>
       <w:r>
-        <w:t xml:space="preserve"> Only three of thousands of PX4 files are covered, so failsafe consumers, estimators, controllers, and drivers are outside the evidence. Estimator convergence was shown only on synthetic steps, never on real noisy flight data. Fixed-wing remaining-time paths used synthetic phase stamps rather than estimator output. All timing is synthetic, so real-time scheduling effects are out of scope. </w:t>
+        <w:t xml:space="preserve"> Only four of thousands of PX4 files are covered, so failsafe consumers, estimators, controllers, and drivers are outside the evidence. Estimator convergence was shown only on synthetic steps, never on real noisy flight data. Fixed-wing remaining-time paths used synthetic phase stamps rather than estimator output. All timing is synthetic, so real-time scheduling effects are out of scope. </w:t>
       </w:r>
       <w:r>
         <w:rPr>
@@ -2496,7 +2866,7 @@
     </w:p>
     <w:p>
       <w:r>
-        <w:t>The structural evidence supports a narrow but strong claim: the three analyzed components behave as specified on every executable path reachable locally. Hysteresis reaches 22/22 lines with all reachable branches taken, including exact timer-expiry boundaries the upstream suite never probes. PID reaches 22/22 lines and 10/10 branch arcs, closing the non-finite-integral and derivative-history gaps upstream leaves open. Battery — which had no upstream test and therefore 0% baseline coverage — reaches 230/231 lines with all 19 functions covered, and independence pairs prove every atomic condition of the failsafe-critical warning, fault, and remaining-time gates can flip its decision, except cases proven unreachable by construction rather than by weak tests. Eight student-test failures during development were each traced to wrong expectations, never to production defects, and no reproducible production defect is claimed; the suite is green because the covered logic met its specification on the exercised paths, and no failure was manufactured. Confidence is therefore high but strictly scoped: statement coverage is complete over the analyzed scope and every reachable decision shows both outcomes, so residual risk concentrates in the individually justified gaps — the L72 corrupted-param log, three hysteresis arcs contradicting the entry guard, and the subsumed B-D9 non-finite arm. Everything outside the scope remains unsupported: the failsafe consumers of these signals, the estimators feeding them, real-sensor noise, real-time scheduling, and the rest of the PX4 codebase, none of which this evidence addresses. In particular, RLS convergence was shown only on synthetic steps and fixed-wing remaining-time behavior only on synthetic phase stamps. The honest reading is that the selected business logic is structurally sound and deterministically verified at unit and functional levels, while any claim about PX4 as a whole would require system, simulation, and flight evidence far beyond this assignment.</w:t>
+        <w:t>The structural evidence supports a narrow but strong claim: the four analyzed components behave as specified on every executable path reachable locally. Hysteresis reaches 22/22 lines with all reachable branches taken, including exact timer-expiry boundaries the upstream suite never probes. PID reaches 22/22 lines and 10/10 branch arcs, closing the non-finite-integral and derivative-history gaps upstream leaves open. Battery — which had no upstream test and therefore 0% baseline coverage — reaches 230/231 lines with all 19 functions covered, and independence pairs prove every atomic condition of the failsafe-critical warning, fault, and remaining-time gates can flip its decision, except cases proven unreachable by construction rather than by weak tests. Gyroscope — likewise starting from a 0% baseline with no upstream test — reaches 112/112 lines with all 12 functions covered and every reachable branch taken across 34 tests, discharging its slot-lookup, validity-guard, and save-path obligations round by round. Eight student-test failures during development were each traced to wrong expectations, never to production defects, and no reproducible production defect is claimed; the suites are green because the covered logic met its specification on the exercised paths, and no failure was manufactured. Confidence is therefore high but strictly scoped: statement coverage is complete over the analyzed scope and every reachable decision shows both outcomes, so residual risk concentrates in the individually justified gaps — the L72 corrupted-param log, three hysteresis arcs contradicting the entry guard, the subsumed B-D9 non-finite arm, and the Gyroscope compiler and by-construction arcs. Everything outside the scope remains unsupported: the failsafe consumers of these signals, the estimators feeding them, real-sensor noise, real-time scheduling, and the rest of the PX4 codebase, none of which this evidence addresses. In particular, RLS convergence was shown only on synthetic steps and fixed-wing remaining-time behavior only on synthetic phase stamps. The honest reading is that the selected business logic is structurally sound and deterministically verified at unit and functional levels, while any claim about PX4 as a whole would require system, simulation, and flight evidence far beyond this assignment.</w:t>
       </w:r>
     </w:p>
     <w:p>
@@ -2506,7 +2876,7 @@
     </w:p>
     <w:p>
       <w:r>
-        <w:t>_Word count: 324 (checked programmatically before export)._</w:t>
+        <w:t>_Word count: 369 (checked programmatically before export)._</w:t>
       </w:r>
     </w:p>
     <w:p>
@@ -2544,22 +2914,22 @@
         <w:br/>
         <w:t>cd build/px4_sitl_test</w:t>
         <w:br/>
-        <w:t>ninja unit-Hysteresis unit-HysteresisStructural unit-PID unit-PIDStructural functional-BatteryStructural</w:t>
+        <w:t>ninja unit-Hysteresis unit-HysteresisStructural unit-PID unit-PIDStructural functional-BatteryStructural functional-GyroscopeStructural</w:t>
         <w:br/>
-        <w:t>./unit-Hysteresis &amp;&amp; ./unit-HysteresisStructural &amp;&amp; ./unit-PID &amp;&amp; ./unit-PIDStructural &amp;&amp; ./functional-BatteryStructural</w:t>
+        <w:t>./unit-Hysteresis &amp;&amp; ./unit-HysteresisStructural &amp;&amp; ./unit-PID &amp;&amp; ./unit-PIDStructural &amp;&amp; ./functional-BatteryStructural &amp;&amp; ./functional-GyroscopeStructural</w:t>
         <w:br/>
         <w:br/>
         <w:t># 3. Coverage build + measurement (separate build dir, instrumented)</w:t>
         <w:br/>
         <w:t>cd ../.. &amp;&amp; cmake . -G Ninja -DCONFIG=px4_sitl_test -DCMAKE_BUILD_TYPE=Coverage -B build/px4_sitl_coverage</w:t>
         <w:br/>
-        <w:t>cd build/px4_sitl_coverage &amp;&amp; ninja unit-Hysteresis unit-HysteresisStructural unit-PID unit-PIDStructural functional-BatteryStructural</w:t>
+        <w:t>cd build/px4_sitl_coverage &amp;&amp; ninja unit-Hysteresis unit-HysteresisStructural unit-PID unit-PIDStructural functional-BatteryStructural functional-GyroscopeStructural</w:t>
         <w:br/>
-        <w:t>./unit-Hysteresis; ./unit-HysteresisStructural; ./unit-PID; ./unit-PIDStructural; ./functional-BatteryStructural</w:t>
+        <w:t>./unit-Hysteresis; ./unit-HysteresisStructural; ./unit-PID; ./unit-PIDStructural; ./functional-BatteryStructural; ./functional-GyroscopeStructural</w:t>
         <w:br/>
         <w:t>lcov --capture --branch-coverage --directory . --gcov-tool gcov --ignore-errors mismatch -o /tmp/cov_all.info</w:t>
         <w:br/>
-        <w:t>lcov --branch-coverage --extract /tmp/cov_all.info "*/src/lib/hysteresis/*" "*/src/lib/pid/*" "*/src/lib/battery/*" --ignore-errors mismatch -o scope_coverage_branch.info</w:t>
+        <w:t>lcov --branch-coverage --extract /tmp/cov_all.info "*/src/lib/hysteresis/*" "*/src/lib/pid/*" "*/src/lib/battery/*" "*/src/lib/sensor_calibration/*" --ignore-errors mismatch -o scope_coverage_branch.info</w:t>
         <w:br/>
         <w:t>genhtml --branch-coverage scope_coverage_branch.info -o html</w:t>
       </w:r>
@@ -2577,7 +2947,7 @@
     </w:p>
     <w:p>
       <w:r>
-        <w:t xml:space="preserve">AI tooling assisted repository navigation, build troubleshooting, test scaffolding, and coverage analysis throughout, but every AI-suggested test, expectation value, and coverage claim was independently verified by compiling, running, and measuring — eight wrong AI-assisted expectations were caught and corrected during development (two Battery reset-gate timings, one PID NaN output, two Ashar PID sign expectations refuted by PID line 47, and three Ashar saturation expectations refuted by the absence of a freeze gate in lines 57–64). Scope, MC/DC pairs, and gap justifications were derived from direct source reading rather than model assertions. Ashar's record: OpenCode and Muse Spark for navigation, float32 verification scripting, scaffolding, and handoff drafting, with introduced assumptions (brief line and decision framing, fallback sign expectations) corrected through direct source reading, hand recomputation, and an independent float32 model. Taimoor's record: OpenCode for the cross-file consistency audit, coverage-gap classification from raw branch data, report prose drafting, viva-bank derivation, and the packaging checklist, writing no PX4 or test code; his line-to-arc mapping risk was contained by citing raw branch-data strings, and every one of his findings was re-verified before merging. No raw chat transcripts are submitted, and no production code was AI-modified — the diff contains only test registrations and new test files. The full per-iteration log is </w:t>
+        <w:t xml:space="preserve">AI tooling assisted repository navigation, build troubleshooting, test scaffolding, and coverage analysis throughout, but every AI-suggested test, expectation value, and coverage claim was independently verified by compiling, running, and measuring — eight wrong AI-assisted expectations were caught and corrected during development (two Battery reset-gate timings, one PID NaN output, two Ashar PID sign expectations refuted by PID line 47, and three Ashar saturation expectations refuted by the absence of a freeze gate in lines 57–64). Scope, MC/DC pairs, and gap justifications were derived from direct source reading rather than model assertions. Ashar's record: OpenCode and Muse Spark for navigation, float32 verification scripting, scaffolding, and handoff drafting, with introduced assumptions (brief line and decision framing, fallback sign expectations) corrected through direct source reading, hand recomputation, and an independent float32 model. Taimoor's record: OpenCode for the cross-file consistency audit, coverage-gap classification from raw branch data, report prose drafting, viva-bank derivation, and the packaging checklist, writing no PX4 or test code; his line-to-arc mapping risk was contained by citing raw branch-data strings, and every one of his findings was re-verified before merging. The Gyroscope suite (34 tests, three coverage rounds, per-arc gap classification) was AI-scaffolded under lead direction and verified the same way — every expectation compiled, run green, and measured, with the branch-data file as the authority for each gap claim. No raw chat transcripts are submitted, and no production code was AI-modified — the diff contains only test registrations and new test files. The full per-iteration log is </w:t>
       </w:r>
       <w:r>
         <w:rPr>

</xml_diff>

<commit_message>
Fix stale 3-area/61-test headings post Option B; rebuild DOCX+PDF
</commit_message>
<xml_diff>
--- a/24i3102_24i3052_24i3072_C_Report.docx
+++ b/24i3102_24i3052_24i3072_C_Report.docx
@@ -72,7 +72,7 @@
     </w:p>
     <w:p>
       <w:r>
-        <w:t>We structurally tested four production areas of PX4 v1.17.0, wrote 95 tests of our own against them, measured statement and branch coverage before and after, and performed MC/DC analysis on the failsafe-critical Battery component. No production code was changed at any point. This report records the group, the machine and baseline everything traces to, why these three areas were chosen, how each test was derived from the production logic, what the MC/DC evidence shows, what coverage was achieved, what gaps remain and why, and a final judgment on what the evidence does and does not prove.</w:t>
+        <w:t>We structurally tested four production areas of PX4 v1.17.0, wrote 95 tests of our own against them, measured statement and branch coverage before and after, and performed MC/DC analysis on the failsafe-critical Battery component. No production code was changed at any point. This report records the group, the machine and baseline everything traces to, why these four areas were chosen, how each test was derived from the production logic, what the MC/DC evidence shows, what coverage was achieved, what gaps remain and why, and a final judgment on what the evidence does and does not prove.</w:t>
       </w:r>
     </w:p>
     <w:p>
@@ -427,7 +427,7 @@
         <w:rPr>
           <w:color w:val="1F4E79"/>
         </w:rPr>
-        <w:t>3. Scope selection: the three areas and why they qualify</w:t>
+        <w:t>3. Scope selection: the four areas and why they qualify</w:t>
       </w:r>
     </w:p>
     <w:p>
@@ -919,7 +919,7 @@
         <w:rPr>
           <w:color w:val="1F4E79"/>
         </w:rPr>
-        <w:t>4. How the 61 tests were derived from the production code</w:t>
+        <w:t>4. How the 95 tests were derived from the production code</w:t>
       </w:r>
     </w:p>
     <w:p>

</xml_diff>